<commit_message>
Restructure report front matter to reference format; convert lists to prose, Roman numbering from Abstract, enumerate objectives
</commit_message>
<xml_diff>
--- a/Plant_Doctor_Mini_Project_Report.docx
+++ b/Plant_Doctor_Mini_Project_Report.docx
@@ -4,54 +4,7 @@
   <w:body>
     <w:p>
       <w:pPr>
-        <w:spacing w:after="200"/>
-        <w:jc w:val="center"/>
-      </w:pPr>
-      <w:r>
-        <w:rPr>
-          <w:rFonts w:ascii="Times New Roman" w:hAnsi="Times New Roman" w:cs="Times New Roman"/>
-          <w:b w:val="0"/>
-          <w:i w:val="0"/>
-          <w:sz w:val="26"/>
-        </w:rPr>
-        <w:t>A Mini Project Report on</w:t>
-      </w:r>
-    </w:p>
-    <w:p>
-      <w:pPr>
-        <w:spacing w:after="80"/>
-        <w:jc w:val="center"/>
-      </w:pPr>
-      <w:r>
-        <w:rPr>
-          <w:rFonts w:ascii="Times New Roman" w:hAnsi="Times New Roman" w:cs="Times New Roman"/>
-          <w:b/>
-          <w:i w:val="0"/>
-          <w:sz w:val="40"/>
-        </w:rPr>
-        <w:t>PLANT DOCTOR</w:t>
-      </w:r>
-    </w:p>
-    <w:p>
-      <w:pPr>
-        <w:spacing w:after="280"/>
-        <w:jc w:val="center"/>
-      </w:pPr>
-      <w:r>
-        <w:rPr>
-          <w:rFonts w:ascii="Times New Roman" w:hAnsi="Times New Roman" w:cs="Times New Roman"/>
-          <w:b/>
-          <w:i w:val="0"/>
-          <w:sz w:val="28"/>
-        </w:rPr>
-        <w:t>A Multilingual Voice-Enabled Dual-Index RAG Chatbot for</w:t>
-        <w:br/>
-        <w:t>Agricultural Advisory and Government Scheme Assistance</w:t>
-      </w:r>
-    </w:p>
-    <w:p>
-      <w:pPr>
-        <w:spacing w:after="40"/>
+        <w:spacing w:after="200" w:line="240" w:lineRule="auto"/>
         <w:jc w:val="center"/>
       </w:pPr>
       <w:r>
@@ -61,27 +14,56 @@
           <w:i w:val="0"/>
           <w:sz w:val="24"/>
         </w:rPr>
-        <w:t>Submitted to Anurag University in partial fulfilment of the requirements</w:t>
       </w:r>
     </w:p>
     <w:p>
       <w:pPr>
-        <w:spacing w:after="40"/>
+        <w:spacing w:after="320" w:line="240" w:lineRule="auto"/>
+        <w:jc w:val="center"/>
+      </w:pPr>
+      <w:r>
+        <w:rPr>
+          <w:rFonts w:ascii="Times New Roman" w:hAnsi="Times New Roman" w:cs="Times New Roman"/>
+          <w:b/>
+          <w:i w:val="0"/>
+          <w:sz w:val="32"/>
+        </w:rPr>
+        <w:t>PLANT DOCTOR: A MULTILINGUAL VOICE-ENABLED DUAL-INDEX RAG CHATBOT FOR AGRICULTURAL ADVISORY AND GOVERNMENT SCHEME ASSISTANCE</w:t>
+      </w:r>
+    </w:p>
+    <w:p>
+      <w:pPr>
+        <w:spacing w:after="40" w:line="240" w:lineRule="auto"/>
         <w:jc w:val="center"/>
       </w:pPr>
       <w:r>
         <w:rPr>
           <w:rFonts w:ascii="Times New Roman" w:hAnsi="Times New Roman" w:cs="Times New Roman"/>
           <w:b w:val="0"/>
-          <w:i w:val="0"/>
-          <w:sz w:val="24"/>
+          <w:i/>
+          <w:sz w:val="26"/>
         </w:rPr>
-        <w:t>for the award of the Degree of</w:t>
+        <w:t>A Mini Project Report</w:t>
       </w:r>
     </w:p>
     <w:p>
       <w:pPr>
-        <w:spacing w:after="40"/>
+        <w:spacing w:after="200" w:line="240" w:lineRule="auto"/>
+        <w:jc w:val="center"/>
+      </w:pPr>
+      <w:r>
+        <w:rPr>
+          <w:rFonts w:ascii="Times New Roman" w:hAnsi="Times New Roman" w:cs="Times New Roman"/>
+          <w:b w:val="0"/>
+          <w:i/>
+          <w:sz w:val="24"/>
+        </w:rPr>
+        <w:t>submitted in partial fulfilment of the requirements for the award of the degree of</w:t>
+      </w:r>
+    </w:p>
+    <w:p>
+      <w:pPr>
+        <w:spacing w:after="40" w:line="240" w:lineRule="auto"/>
         <w:jc w:val="center"/>
       </w:pPr>
       <w:r>
@@ -96,14 +78,14 @@
     </w:p>
     <w:p>
       <w:pPr>
-        <w:spacing w:after="40"/>
+        <w:spacing w:after="40" w:line="240" w:lineRule="auto"/>
         <w:jc w:val="center"/>
       </w:pPr>
       <w:r>
         <w:rPr>
           <w:rFonts w:ascii="Times New Roman" w:hAnsi="Times New Roman" w:cs="Times New Roman"/>
           <w:b w:val="0"/>
-          <w:i w:val="0"/>
+          <w:i/>
           <w:sz w:val="24"/>
         </w:rPr>
         <w:t>in</w:t>
@@ -111,7 +93,7 @@
     </w:p>
     <w:p>
       <w:pPr>
-        <w:spacing w:after="280"/>
+        <w:spacing w:after="240" w:line="240" w:lineRule="auto"/>
         <w:jc w:val="center"/>
       </w:pPr>
       <w:r>
@@ -126,7 +108,22 @@
     </w:p>
     <w:p>
       <w:pPr>
-        <w:spacing w:after="120"/>
+        <w:spacing w:after="120" w:line="240" w:lineRule="auto"/>
+        <w:jc w:val="center"/>
+      </w:pPr>
+      <w:r>
+        <w:rPr>
+          <w:rFonts w:ascii="Times New Roman" w:hAnsi="Times New Roman" w:cs="Times New Roman"/>
+          <w:b w:val="0"/>
+          <w:i/>
+          <w:sz w:val="24"/>
+        </w:rPr>
+        <w:t>by</w:t>
+      </w:r>
+    </w:p>
+    <w:p>
+      <w:pPr>
+        <w:spacing w:after="40" w:line="240" w:lineRule="auto"/>
         <w:jc w:val="center"/>
       </w:pPr>
       <w:r>
@@ -136,57 +133,43 @@
           <w:i w:val="0"/>
           <w:sz w:val="24"/>
         </w:rPr>
-        <w:t>Submitted by</w:t>
+        <w:t>Chunku Raja Venkata Praney Teja (23EG106C10)</w:t>
       </w:r>
     </w:p>
     <w:p>
       <w:pPr>
-        <w:spacing w:after="40"/>
+        <w:spacing w:after="40" w:line="240" w:lineRule="auto"/>
         <w:jc w:val="center"/>
       </w:pPr>
       <w:r>
         <w:rPr>
           <w:rFonts w:ascii="Times New Roman" w:hAnsi="Times New Roman" w:cs="Times New Roman"/>
-          <w:b/>
+          <w:b w:val="0"/>
           <w:i w:val="0"/>
           <w:sz w:val="24"/>
         </w:rPr>
-        <w:t>Chunku Raja Venkata Praney Teja  —  23EG106C10</w:t>
+        <w:t>Prasadam Lakshmi Narasimha (23EG106C49)</w:t>
       </w:r>
     </w:p>
     <w:p>
       <w:pPr>
-        <w:spacing w:after="40"/>
+        <w:spacing w:after="40" w:line="240" w:lineRule="auto"/>
         <w:jc w:val="center"/>
       </w:pPr>
       <w:r>
         <w:rPr>
           <w:rFonts w:ascii="Times New Roman" w:hAnsi="Times New Roman" w:cs="Times New Roman"/>
-          <w:b/>
+          <w:b w:val="0"/>
           <w:i w:val="0"/>
           <w:sz w:val="24"/>
         </w:rPr>
-        <w:t>Prasadam Lakshmi Narasimha  —  23EG106C49</w:t>
+        <w:t>Konda Mukesh (23EG106C31)</w:t>
       </w:r>
     </w:p>
     <w:p>
       <w:pPr>
-        <w:spacing w:after="40"/>
+        <w:spacing w:after="160" w:line="240" w:lineRule="auto"/>
         <w:jc w:val="center"/>
-      </w:pPr>
-      <w:r>
-        <w:rPr>
-          <w:rFonts w:ascii="Times New Roman" w:hAnsi="Times New Roman" w:cs="Times New Roman"/>
-          <w:b/>
-          <w:i w:val="0"/>
-          <w:sz w:val="24"/>
-        </w:rPr>
-        <w:t>Konda Mukesh  —  23EG106C31</w:t>
-      </w:r>
-    </w:p>
-    <w:p>
-      <w:pPr>
-        <w:spacing w:after="160"/>
       </w:pPr>
       <w:r>
         <w:rPr>
@@ -199,22 +182,22 @@
     </w:p>
     <w:p>
       <w:pPr>
-        <w:spacing w:after="40"/>
+        <w:spacing w:after="40" w:line="240" w:lineRule="auto"/>
         <w:jc w:val="center"/>
       </w:pPr>
       <w:r>
         <w:rPr>
           <w:rFonts w:ascii="Times New Roman" w:hAnsi="Times New Roman" w:cs="Times New Roman"/>
           <w:b w:val="0"/>
-          <w:i w:val="0"/>
+          <w:i/>
           <w:sz w:val="24"/>
         </w:rPr>
-        <w:t>Under the Guidance of</w:t>
+        <w:t>Under the guidance of</w:t>
       </w:r>
     </w:p>
     <w:p>
       <w:pPr>
-        <w:spacing w:after="40"/>
+        <w:spacing w:after="40" w:line="240" w:lineRule="auto"/>
         <w:jc w:val="center"/>
       </w:pPr>
       <w:r>
@@ -229,7 +212,7 @@
     </w:p>
     <w:p>
       <w:pPr>
-        <w:spacing w:after="280"/>
+        <w:spacing w:after="200" w:line="240" w:lineRule="auto"/>
         <w:jc w:val="center"/>
       </w:pPr>
       <w:r>
@@ -244,13 +227,13 @@
     </w:p>
     <w:p>
       <w:pPr>
-        <w:spacing w:after="160"/>
+        <w:spacing w:after="80"/>
         <w:jc w:val="center"/>
       </w:pPr>
       <w:r>
         <w:drawing>
           <wp:inline xmlns:a="http://schemas.openxmlformats.org/drawingml/2006/main" xmlns:pic="http://schemas.openxmlformats.org/drawingml/2006/picture">
-            <wp:extent cx="1188720" cy="1188720"/>
+            <wp:extent cx="960120" cy="960120"/>
             <wp:docPr id="1" name="Picture 1"/>
             <wp:cNvGraphicFramePr>
               <a:graphicFrameLocks noChangeAspect="1"/>
@@ -271,7 +254,7 @@
                   <pic:spPr>
                     <a:xfrm>
                       <a:off x="0" y="0"/>
-                      <a:ext cx="1188720" cy="1188720"/>
+                      <a:ext cx="960120" cy="960120"/>
                     </a:xfrm>
                     <a:prstGeom prst="rect"/>
                   </pic:spPr>
@@ -284,7 +267,22 @@
     </w:p>
     <w:p>
       <w:pPr>
-        <w:spacing w:after="40"/>
+        <w:spacing w:after="200" w:line="240" w:lineRule="auto"/>
+        <w:jc w:val="center"/>
+      </w:pPr>
+      <w:r>
+        <w:rPr>
+          <w:rFonts w:ascii="Times New Roman" w:hAnsi="Times New Roman" w:cs="Times New Roman"/>
+          <w:b/>
+          <w:i w:val="0"/>
+          <w:sz w:val="22"/>
+        </w:rPr>
+        <w:t>ANURAG UNIVERSITY</w:t>
+      </w:r>
+    </w:p>
+    <w:p>
+      <w:pPr>
+        <w:spacing w:after="40" w:line="240" w:lineRule="auto"/>
         <w:jc w:val="center"/>
       </w:pPr>
       <w:r>
@@ -299,7 +297,22 @@
     </w:p>
     <w:p>
       <w:pPr>
-        <w:spacing w:after="40"/>
+        <w:spacing w:after="40" w:line="240" w:lineRule="auto"/>
+        <w:jc w:val="center"/>
+      </w:pPr>
+      <w:r>
+        <w:rPr>
+          <w:rFonts w:ascii="Times New Roman" w:hAnsi="Times New Roman" w:cs="Times New Roman"/>
+          <w:b/>
+          <w:i w:val="0"/>
+          <w:sz w:val="26"/>
+        </w:rPr>
+        <w:t>ANURAG UNIVERSITY</w:t>
+      </w:r>
+    </w:p>
+    <w:p>
+      <w:pPr>
+        <w:spacing w:after="40" w:line="240" w:lineRule="auto"/>
         <w:jc w:val="center"/>
       </w:pPr>
       <w:r>
@@ -309,184 +322,12 @@
           <w:i w:val="0"/>
           <w:sz w:val="24"/>
         </w:rPr>
-        <w:t>SCHOOL OF ENGINEERING</w:t>
+        <w:t>Venkatapur, Ghatkesar, Hyderabad – 500088</w:t>
       </w:r>
     </w:p>
     <w:p>
       <w:pPr>
-        <w:spacing w:after="40"/>
-        <w:jc w:val="center"/>
-      </w:pPr>
-      <w:r>
-        <w:rPr>
-          <w:rFonts w:ascii="Times New Roman" w:hAnsi="Times New Roman" w:cs="Times New Roman"/>
-          <w:b/>
-          <w:i w:val="0"/>
-          <w:sz w:val="26"/>
-        </w:rPr>
-        <w:t>ANURAG UNIVERSITY, HYDERABAD</w:t>
-      </w:r>
-    </w:p>
-    <w:p>
-      <w:pPr>
-        <w:spacing w:after="40"/>
-        <w:jc w:val="center"/>
-      </w:pPr>
-      <w:r>
-        <w:rPr>
-          <w:rFonts w:ascii="Times New Roman" w:hAnsi="Times New Roman" w:cs="Times New Roman"/>
-          <w:b w:val="0"/>
-          <w:i w:val="0"/>
-          <w:sz w:val="24"/>
-        </w:rPr>
-        <w:t>Academic Year 2026–27  |  November 2026</w:t>
-      </w:r>
-    </w:p>
-    <w:p>
-      <w:r>
-        <w:br w:type="page"/>
-      </w:r>
-    </w:p>
-    <w:p>
-      <w:pPr>
-        <w:spacing w:after="200"/>
-        <w:jc w:val="center"/>
-      </w:pPr>
-      <w:r>
-        <w:rPr>
-          <w:rFonts w:ascii="Times New Roman" w:hAnsi="Times New Roman" w:cs="Times New Roman"/>
-          <w:b w:val="0"/>
-          <w:i w:val="0"/>
-          <w:sz w:val="26"/>
-        </w:rPr>
-        <w:t>A Mini Project Report on</w:t>
-      </w:r>
-    </w:p>
-    <w:p>
-      <w:pPr>
-        <w:spacing w:after="80"/>
-        <w:jc w:val="center"/>
-      </w:pPr>
-      <w:r>
-        <w:rPr>
-          <w:rFonts w:ascii="Times New Roman" w:hAnsi="Times New Roman" w:cs="Times New Roman"/>
-          <w:b/>
-          <w:i w:val="0"/>
-          <w:sz w:val="40"/>
-        </w:rPr>
-        <w:t>PLANT DOCTOR</w:t>
-      </w:r>
-    </w:p>
-    <w:p>
-      <w:pPr>
-        <w:spacing w:after="280"/>
-        <w:jc w:val="center"/>
-      </w:pPr>
-      <w:r>
-        <w:rPr>
-          <w:rFonts w:ascii="Times New Roman" w:hAnsi="Times New Roman" w:cs="Times New Roman"/>
-          <w:b/>
-          <w:i w:val="0"/>
-          <w:sz w:val="28"/>
-        </w:rPr>
-        <w:t>A Multilingual Voice-Enabled Dual-Index RAG Chatbot for</w:t>
-        <w:br/>
-        <w:t>Agricultural Advisory and Government Scheme Assistance</w:t>
-      </w:r>
-    </w:p>
-    <w:p>
-      <w:pPr>
-        <w:spacing w:after="40"/>
-        <w:jc w:val="center"/>
-      </w:pPr>
-      <w:r>
-        <w:rPr>
-          <w:rFonts w:ascii="Times New Roman" w:hAnsi="Times New Roman" w:cs="Times New Roman"/>
-          <w:b w:val="0"/>
-          <w:i w:val="0"/>
-          <w:sz w:val="24"/>
-        </w:rPr>
-        <w:t>Submitted to Anurag University in partial fulfilment of the requirements</w:t>
-      </w:r>
-    </w:p>
-    <w:p>
-      <w:pPr>
-        <w:spacing w:after="40"/>
-        <w:jc w:val="center"/>
-      </w:pPr>
-      <w:r>
-        <w:rPr>
-          <w:rFonts w:ascii="Times New Roman" w:hAnsi="Times New Roman" w:cs="Times New Roman"/>
-          <w:b w:val="0"/>
-          <w:i w:val="0"/>
-          <w:sz w:val="24"/>
-        </w:rPr>
-        <w:t>for the award of the Degree of</w:t>
-      </w:r>
-    </w:p>
-    <w:p>
-      <w:pPr>
-        <w:spacing w:after="40"/>
-        <w:jc w:val="center"/>
-      </w:pPr>
-      <w:r>
-        <w:rPr>
-          <w:rFonts w:ascii="Times New Roman" w:hAnsi="Times New Roman" w:cs="Times New Roman"/>
-          <w:b/>
-          <w:i w:val="0"/>
-          <w:sz w:val="28"/>
-        </w:rPr>
-        <w:t>BACHELOR OF TECHNOLOGY</w:t>
-      </w:r>
-    </w:p>
-    <w:p>
-      <w:pPr>
-        <w:spacing w:after="40"/>
-        <w:jc w:val="center"/>
-      </w:pPr>
-      <w:r>
-        <w:rPr>
-          <w:rFonts w:ascii="Times New Roman" w:hAnsi="Times New Roman" w:cs="Times New Roman"/>
-          <w:b w:val="0"/>
-          <w:i w:val="0"/>
-          <w:sz w:val="24"/>
-        </w:rPr>
-        <w:t>in</w:t>
-      </w:r>
-    </w:p>
-    <w:p>
-      <w:pPr>
-        <w:spacing w:after="280"/>
-        <w:jc w:val="center"/>
-      </w:pPr>
-      <w:r>
-        <w:rPr>
-          <w:rFonts w:ascii="Times New Roman" w:hAnsi="Times New Roman" w:cs="Times New Roman"/>
-          <w:b/>
-          <w:i w:val="0"/>
-          <w:sz w:val="26"/>
-        </w:rPr>
-        <w:t>ARTIFICIAL INTELLIGENCE</w:t>
-      </w:r>
-    </w:p>
-    <w:p>
-      <w:pPr>
-        <w:spacing w:after="120"/>
-        <w:jc w:val="center"/>
-      </w:pPr>
-      <w:r>
-        <w:rPr>
-          <w:rFonts w:ascii="Times New Roman" w:hAnsi="Times New Roman" w:cs="Times New Roman"/>
-          <w:b w:val="0"/>
-          <w:i w:val="0"/>
-          <w:sz w:val="24"/>
-        </w:rPr>
-        <w:t>Submitted by</w:t>
-      </w:r>
-    </w:p>
-    <w:p>
-      <w:pPr>
-        <w:spacing w:after="40"/>
+        <w:spacing w:after="40" w:line="240" w:lineRule="auto"/>
         <w:jc w:val="center"/>
       </w:pPr>
       <w:r>
@@ -496,740 +337,7 @@
           <w:i w:val="0"/>
           <w:sz w:val="24"/>
         </w:rPr>
-        <w:t>Chunku Raja Venkata Praney Teja  —  23EG106C10</w:t>
-      </w:r>
-    </w:p>
-    <w:p>
-      <w:pPr>
-        <w:spacing w:after="40"/>
-        <w:jc w:val="center"/>
-      </w:pPr>
-      <w:r>
-        <w:rPr>
-          <w:rFonts w:ascii="Times New Roman" w:hAnsi="Times New Roman" w:cs="Times New Roman"/>
-          <w:b/>
-          <w:i w:val="0"/>
-          <w:sz w:val="24"/>
-        </w:rPr>
-        <w:t>Prasadam Lakshmi Narasimha  —  23EG106C49</w:t>
-      </w:r>
-    </w:p>
-    <w:p>
-      <w:pPr>
-        <w:spacing w:after="40"/>
-        <w:jc w:val="center"/>
-      </w:pPr>
-      <w:r>
-        <w:rPr>
-          <w:rFonts w:ascii="Times New Roman" w:hAnsi="Times New Roman" w:cs="Times New Roman"/>
-          <w:b/>
-          <w:i w:val="0"/>
-          <w:sz w:val="24"/>
-        </w:rPr>
-        <w:t>Konda Mukesh  —  23EG106C31</w:t>
-      </w:r>
-    </w:p>
-    <w:p>
-      <w:pPr>
-        <w:spacing w:after="160"/>
-      </w:pPr>
-      <w:r>
-        <w:rPr>
-          <w:rFonts w:ascii="Times New Roman" w:hAnsi="Times New Roman" w:cs="Times New Roman"/>
-          <w:b w:val="0"/>
-          <w:i w:val="0"/>
-          <w:sz w:val="24"/>
-        </w:rPr>
-      </w:r>
-    </w:p>
-    <w:p>
-      <w:pPr>
-        <w:spacing w:after="40"/>
-        <w:jc w:val="center"/>
-      </w:pPr>
-      <w:r>
-        <w:rPr>
-          <w:rFonts w:ascii="Times New Roman" w:hAnsi="Times New Roman" w:cs="Times New Roman"/>
-          <w:b w:val="0"/>
-          <w:i w:val="0"/>
-          <w:sz w:val="24"/>
-        </w:rPr>
-        <w:t>Under the Guidance of</w:t>
-      </w:r>
-    </w:p>
-    <w:p>
-      <w:pPr>
-        <w:spacing w:after="40"/>
-        <w:jc w:val="center"/>
-      </w:pPr>
-      <w:r>
-        <w:rPr>
-          <w:rFonts w:ascii="Times New Roman" w:hAnsi="Times New Roman" w:cs="Times New Roman"/>
-          <w:b/>
-          <w:i w:val="0"/>
-          <w:sz w:val="26"/>
-        </w:rPr>
-        <w:t>Mr. G. Victor Daniel</w:t>
-      </w:r>
-    </w:p>
-    <w:p>
-      <w:pPr>
-        <w:spacing w:after="280"/>
-        <w:jc w:val="center"/>
-      </w:pPr>
-      <w:r>
-        <w:rPr>
-          <w:rFonts w:ascii="Times New Roman" w:hAnsi="Times New Roman" w:cs="Times New Roman"/>
-          <w:b w:val="0"/>
-          <w:i w:val="0"/>
-          <w:sz w:val="24"/>
-        </w:rPr>
-        <w:t>Assistant Professor, Department of Artificial Intelligence</w:t>
-      </w:r>
-    </w:p>
-    <w:p>
-      <w:pPr>
-        <w:spacing w:after="160"/>
-        <w:jc w:val="center"/>
-      </w:pPr>
-      <w:r>
-        <w:drawing>
-          <wp:inline xmlns:a="http://schemas.openxmlformats.org/drawingml/2006/main" xmlns:pic="http://schemas.openxmlformats.org/drawingml/2006/picture">
-            <wp:extent cx="1188720" cy="1188720"/>
-            <wp:docPr id="2" name="Picture 2"/>
-            <wp:cNvGraphicFramePr>
-              <a:graphicFrameLocks noChangeAspect="1"/>
-            </wp:cNvGraphicFramePr>
-            <a:graphic>
-              <a:graphicData uri="http://schemas.openxmlformats.org/drawingml/2006/picture">
-                <pic:pic>
-                  <pic:nvPicPr>
-                    <pic:cNvPr id="0" name="logo.png"/>
-                    <pic:cNvPicPr/>
-                  </pic:nvPicPr>
-                  <pic:blipFill>
-                    <a:blip r:embed="rId9"/>
-                    <a:stretch>
-                      <a:fillRect/>
-                    </a:stretch>
-                  </pic:blipFill>
-                  <pic:spPr>
-                    <a:xfrm>
-                      <a:off x="0" y="0"/>
-                      <a:ext cx="1188720" cy="1188720"/>
-                    </a:xfrm>
-                    <a:prstGeom prst="rect"/>
-                  </pic:spPr>
-                </pic:pic>
-              </a:graphicData>
-            </a:graphic>
-          </wp:inline>
-        </w:drawing>
-      </w:r>
-    </w:p>
-    <w:p>
-      <w:pPr>
-        <w:spacing w:after="40"/>
-        <w:jc w:val="center"/>
-      </w:pPr>
-      <w:r>
-        <w:rPr>
-          <w:rFonts w:ascii="Times New Roman" w:hAnsi="Times New Roman" w:cs="Times New Roman"/>
-          <w:b/>
-          <w:i w:val="0"/>
-          <w:sz w:val="26"/>
-        </w:rPr>
-        <w:t>DEPARTMENT OF ARTIFICIAL INTELLIGENCE</w:t>
-      </w:r>
-    </w:p>
-    <w:p>
-      <w:pPr>
-        <w:spacing w:after="40"/>
-        <w:jc w:val="center"/>
-      </w:pPr>
-      <w:r>
-        <w:rPr>
-          <w:rFonts w:ascii="Times New Roman" w:hAnsi="Times New Roman" w:cs="Times New Roman"/>
-          <w:b/>
-          <w:i w:val="0"/>
-          <w:sz w:val="24"/>
-        </w:rPr>
-        <w:t>SCHOOL OF ENGINEERING</w:t>
-      </w:r>
-    </w:p>
-    <w:p>
-      <w:pPr>
-        <w:spacing w:after="40"/>
-        <w:jc w:val="center"/>
-      </w:pPr>
-      <w:r>
-        <w:rPr>
-          <w:rFonts w:ascii="Times New Roman" w:hAnsi="Times New Roman" w:cs="Times New Roman"/>
-          <w:b/>
-          <w:i w:val="0"/>
-          <w:sz w:val="26"/>
-        </w:rPr>
-        <w:t>ANURAG UNIVERSITY, HYDERABAD</w:t>
-      </w:r>
-    </w:p>
-    <w:p>
-      <w:pPr>
-        <w:spacing w:after="40"/>
-        <w:jc w:val="center"/>
-      </w:pPr>
-      <w:r>
-        <w:rPr>
-          <w:rFonts w:ascii="Times New Roman" w:hAnsi="Times New Roman" w:cs="Times New Roman"/>
-          <w:b w:val="0"/>
-          <w:i w:val="0"/>
-          <w:sz w:val="24"/>
-        </w:rPr>
-        <w:t>Academic Year 2026–27  |  November 2026</w:t>
-      </w:r>
-    </w:p>
-    <w:p>
-      <w:pPr>
-        <w:sectPr>
-          <w:footerReference w:type="default" r:id="rId11"/>
-          <w:pgSz w:w="11909" w:h="16834"/>
-          <w:pgMar w:top="1440" w:right="1440" w:bottom="1440" w:left="2160" w:header="720" w:footer="720" w:gutter="0"/>
-          <w:cols w:space="720"/>
-          <w:docGrid w:linePitch="360"/>
-        </w:sectPr>
-      </w:pPr>
-    </w:p>
-    <w:p>
-      <w:pPr>
-        <w:spacing w:after="160"/>
-        <w:jc w:val="center"/>
-      </w:pPr>
-      <w:r>
-        <w:drawing>
-          <wp:inline xmlns:a="http://schemas.openxmlformats.org/drawingml/2006/main" xmlns:pic="http://schemas.openxmlformats.org/drawingml/2006/picture">
-            <wp:extent cx="1005840" cy="1005840"/>
-            <wp:docPr id="3" name="Picture 3"/>
-            <wp:cNvGraphicFramePr>
-              <a:graphicFrameLocks noChangeAspect="1"/>
-            </wp:cNvGraphicFramePr>
-            <a:graphic>
-              <a:graphicData uri="http://schemas.openxmlformats.org/drawingml/2006/picture">
-                <pic:pic>
-                  <pic:nvPicPr>
-                    <pic:cNvPr id="0" name="logo.png"/>
-                    <pic:cNvPicPr/>
-                  </pic:nvPicPr>
-                  <pic:blipFill>
-                    <a:blip r:embed="rId9"/>
-                    <a:stretch>
-                      <a:fillRect/>
-                    </a:stretch>
-                  </pic:blipFill>
-                  <pic:spPr>
-                    <a:xfrm>
-                      <a:off x="0" y="0"/>
-                      <a:ext cx="1005840" cy="1005840"/>
-                    </a:xfrm>
-                    <a:prstGeom prst="rect"/>
-                  </pic:spPr>
-                </pic:pic>
-              </a:graphicData>
-            </a:graphic>
-          </wp:inline>
-        </w:drawing>
-      </w:r>
-    </w:p>
-    <w:p>
-      <w:pPr>
-        <w:spacing w:after="40"/>
-        <w:jc w:val="center"/>
-      </w:pPr>
-      <w:r>
-        <w:rPr>
-          <w:rFonts w:ascii="Times New Roman" w:hAnsi="Times New Roman" w:cs="Times New Roman"/>
-          <w:b/>
-          <w:i w:val="0"/>
-          <w:sz w:val="28"/>
-        </w:rPr>
-        <w:t>ANURAG UNIVERSITY</w:t>
-      </w:r>
-    </w:p>
-    <w:p>
-      <w:pPr>
-        <w:spacing w:after="200"/>
-        <w:jc w:val="center"/>
-      </w:pPr>
-      <w:r>
-        <w:rPr>
-          <w:rFonts w:ascii="Times New Roman" w:hAnsi="Times New Roman" w:cs="Times New Roman"/>
-          <w:b/>
-          <w:i w:val="0"/>
-          <w:sz w:val="24"/>
-        </w:rPr>
-        <w:t>DEPARTMENT OF ARTIFICIAL INTELLIGENCE</w:t>
-      </w:r>
-    </w:p>
-    <w:p>
-      <w:pPr>
-        <w:spacing w:after="240"/>
-        <w:jc w:val="center"/>
-      </w:pPr>
-      <w:r>
-        <w:rPr>
-          <w:rFonts w:ascii="Times New Roman" w:hAnsi="Times New Roman" w:cs="Times New Roman"/>
-          <w:b/>
-          <w:i w:val="0"/>
-          <w:sz w:val="32"/>
-        </w:rPr>
-        <w:t>CERTIFICATE</w:t>
-      </w:r>
-    </w:p>
-    <w:p>
-      <w:pPr>
-        <w:spacing w:after="120"/>
-        <w:jc w:val="both"/>
-      </w:pPr>
-      <w:r>
-        <w:rPr>
-          <w:rFonts w:ascii="Times New Roman" w:hAnsi="Times New Roman" w:cs="Times New Roman"/>
-          <w:b w:val="0"/>
-          <w:i w:val="0"/>
-          <w:sz w:val="24"/>
-        </w:rPr>
-        <w:t>This is to certify that the Mini Project report entitled "PLANT DOCTOR: A Multilingual Voice-Enabled Dual-Index RAG Chatbot for Agricultural Advisory and Government Scheme Assistance" is a bonafide record of the work carried out by Chunku Raja Venkata Praney Teja (23EG106C10), Prasadam Lakshmi Narasimha (23EG106C49), Konda Mukesh (23EG106C31), in IV B.Tech I Semester, Artificial Intelligence, in partial fulfilment of the requirements for the award of the degree of Bachelor of Technology in Artificial Intelligence, under our supervision and guidance. The results embodied in this report have not been submitted to any other University or Institute for the award of any degree or diploma.</w:t>
-      </w:r>
-    </w:p>
-    <w:p>
-      <w:pPr>
-        <w:spacing w:after="240"/>
-        <w:jc w:val="both"/>
-      </w:pPr>
-      <w:r>
-        <w:rPr>
-          <w:rFonts w:ascii="Times New Roman" w:hAnsi="Times New Roman" w:cs="Times New Roman"/>
-          <w:b w:val="0"/>
-          <w:i w:val="0"/>
-          <w:sz w:val="24"/>
-        </w:rPr>
-        <w:t>The project work carried out by the above candidates is approved for submission.</w:t>
-      </w:r>
-    </w:p>
-    <w:tbl>
-      <w:tblPr>
-        <w:tblStyle w:val="TableGrid"/>
-        <w:tblW w:type="auto" w:w="0"/>
-        <w:jc w:val="center"/>
-        <w:tblLook w:firstColumn="1" w:firstRow="1" w:lastColumn="0" w:lastRow="0" w:noHBand="0" w:noVBand="1" w:val="04A0"/>
-      </w:tblPr>
-      <w:tblGrid>
-        <w:gridCol w:w="2770"/>
-        <w:gridCol w:w="2770"/>
-        <w:gridCol w:w="2770"/>
-      </w:tblGrid>
-      <w:tr>
-        <w:trPr>
-          <w:cantSplit/>
-        </w:trPr>
-        <w:tc>
-          <w:tcPr>
-            <w:tcW w:type="dxa" w:w="4320"/>
-          </w:tcPr>
-          <w:p>
-            <w:pPr>
-              <w:jc w:val="center"/>
-            </w:pPr>
-            <w:r/>
-            <w:r>
-              <w:rPr>
-                <w:rFonts w:ascii="Times New Roman" w:hAnsi="Times New Roman"/>
-                <w:b/>
-                <w:sz w:val="22"/>
-              </w:rPr>
-              <w:t>Name of the Student</w:t>
-            </w:r>
-          </w:p>
-        </w:tc>
-        <w:tc>
-          <w:tcPr>
-            <w:tcW w:type="dxa" w:w="2160"/>
-          </w:tcPr>
-          <w:p>
-            <w:pPr>
-              <w:jc w:val="center"/>
-            </w:pPr>
-            <w:r/>
-            <w:r>
-              <w:rPr>
-                <w:rFonts w:ascii="Times New Roman" w:hAnsi="Times New Roman"/>
-                <w:b/>
-                <w:sz w:val="22"/>
-              </w:rPr>
-              <w:t>Roll No.</w:t>
-            </w:r>
-          </w:p>
-        </w:tc>
-        <w:tc>
-          <w:tcPr>
-            <w:tcW w:type="dxa" w:w="2160"/>
-          </w:tcPr>
-          <w:p>
-            <w:pPr>
-              <w:jc w:val="center"/>
-            </w:pPr>
-            <w:r/>
-            <w:r>
-              <w:rPr>
-                <w:rFonts w:ascii="Times New Roman" w:hAnsi="Times New Roman"/>
-                <w:b/>
-                <w:sz w:val="22"/>
-              </w:rPr>
-              <w:t>Signature</w:t>
-            </w:r>
-          </w:p>
-        </w:tc>
-      </w:tr>
-      <w:tr>
-        <w:trPr>
-          <w:cantSplit/>
-        </w:trPr>
-        <w:tc>
-          <w:tcPr>
-            <w:tcW w:type="dxa" w:w="4320"/>
-          </w:tcPr>
-          <w:p>
-            <w:pPr>
-              <w:jc w:val="left"/>
-            </w:pPr>
-            <w:r/>
-            <w:r>
-              <w:rPr>
-                <w:rFonts w:ascii="Times New Roman" w:hAnsi="Times New Roman"/>
-                <w:sz w:val="22"/>
-              </w:rPr>
-              <w:t>Chunku Raja Venkata Praney Teja</w:t>
-            </w:r>
-          </w:p>
-        </w:tc>
-        <w:tc>
-          <w:tcPr>
-            <w:tcW w:type="dxa" w:w="2160"/>
-          </w:tcPr>
-          <w:p>
-            <w:pPr>
-              <w:jc w:val="left"/>
-            </w:pPr>
-            <w:r/>
-            <w:r>
-              <w:rPr>
-                <w:rFonts w:ascii="Times New Roman" w:hAnsi="Times New Roman"/>
-                <w:sz w:val="22"/>
-              </w:rPr>
-              <w:t>23EG106C10</w:t>
-            </w:r>
-          </w:p>
-        </w:tc>
-        <w:tc>
-          <w:tcPr>
-            <w:tcW w:type="dxa" w:w="2160"/>
-          </w:tcPr>
-          <w:p>
-            <w:pPr>
-              <w:jc w:val="left"/>
-            </w:pPr>
-            <w:r/>
-            <w:r>
-              <w:rPr>
-                <w:rFonts w:ascii="Times New Roman" w:hAnsi="Times New Roman"/>
-                <w:sz w:val="22"/>
-              </w:rPr>
-            </w:r>
-          </w:p>
-        </w:tc>
-      </w:tr>
-      <w:tr>
-        <w:trPr>
-          <w:cantSplit/>
-        </w:trPr>
-        <w:tc>
-          <w:tcPr>
-            <w:tcW w:type="dxa" w:w="4320"/>
-          </w:tcPr>
-          <w:p>
-            <w:pPr>
-              <w:jc w:val="left"/>
-            </w:pPr>
-            <w:r/>
-            <w:r>
-              <w:rPr>
-                <w:rFonts w:ascii="Times New Roman" w:hAnsi="Times New Roman"/>
-                <w:sz w:val="22"/>
-              </w:rPr>
-              <w:t>Prasadam Lakshmi Narasimha</w:t>
-            </w:r>
-          </w:p>
-        </w:tc>
-        <w:tc>
-          <w:tcPr>
-            <w:tcW w:type="dxa" w:w="2160"/>
-          </w:tcPr>
-          <w:p>
-            <w:pPr>
-              <w:jc w:val="left"/>
-            </w:pPr>
-            <w:r/>
-            <w:r>
-              <w:rPr>
-                <w:rFonts w:ascii="Times New Roman" w:hAnsi="Times New Roman"/>
-                <w:sz w:val="22"/>
-              </w:rPr>
-              <w:t>23EG106C49</w:t>
-            </w:r>
-          </w:p>
-        </w:tc>
-        <w:tc>
-          <w:tcPr>
-            <w:tcW w:type="dxa" w:w="2160"/>
-          </w:tcPr>
-          <w:p>
-            <w:pPr>
-              <w:jc w:val="left"/>
-            </w:pPr>
-            <w:r/>
-            <w:r>
-              <w:rPr>
-                <w:rFonts w:ascii="Times New Roman" w:hAnsi="Times New Roman"/>
-                <w:sz w:val="22"/>
-              </w:rPr>
-            </w:r>
-          </w:p>
-        </w:tc>
-      </w:tr>
-      <w:tr>
-        <w:trPr>
-          <w:cantSplit/>
-        </w:trPr>
-        <w:tc>
-          <w:tcPr>
-            <w:tcW w:type="dxa" w:w="4320"/>
-          </w:tcPr>
-          <w:p>
-            <w:pPr>
-              <w:jc w:val="left"/>
-            </w:pPr>
-            <w:r/>
-            <w:r>
-              <w:rPr>
-                <w:rFonts w:ascii="Times New Roman" w:hAnsi="Times New Roman"/>
-                <w:sz w:val="22"/>
-              </w:rPr>
-              <w:t>Konda Mukesh</w:t>
-            </w:r>
-          </w:p>
-        </w:tc>
-        <w:tc>
-          <w:tcPr>
-            <w:tcW w:type="dxa" w:w="2160"/>
-          </w:tcPr>
-          <w:p>
-            <w:pPr>
-              <w:jc w:val="left"/>
-            </w:pPr>
-            <w:r/>
-            <w:r>
-              <w:rPr>
-                <w:rFonts w:ascii="Times New Roman" w:hAnsi="Times New Roman"/>
-                <w:sz w:val="22"/>
-              </w:rPr>
-              <w:t>23EG106C31</w:t>
-            </w:r>
-          </w:p>
-        </w:tc>
-        <w:tc>
-          <w:tcPr>
-            <w:tcW w:type="dxa" w:w="2160"/>
-          </w:tcPr>
-          <w:p>
-            <w:pPr>
-              <w:jc w:val="left"/>
-            </w:pPr>
-            <w:r/>
-            <w:r>
-              <w:rPr>
-                <w:rFonts w:ascii="Times New Roman" w:hAnsi="Times New Roman"/>
-                <w:sz w:val="22"/>
-              </w:rPr>
-            </w:r>
-          </w:p>
-        </w:tc>
-      </w:tr>
-    </w:tbl>
-    <w:p>
-      <w:pPr>
-        <w:spacing w:after="120" w:before="0" w:line="240" w:lineRule="auto"/>
-      </w:pPr>
-      <w:r>
-        <w:rPr>
-          <w:sz w:val="2"/>
-        </w:rPr>
-      </w:r>
-    </w:p>
-    <w:p>
-      <w:pPr>
-        <w:spacing w:after="440"/>
-      </w:pPr>
-      <w:r>
-        <w:rPr>
-          <w:rFonts w:ascii="Times New Roman" w:hAnsi="Times New Roman" w:cs="Times New Roman"/>
-          <w:b w:val="0"/>
-          <w:i w:val="0"/>
-          <w:sz w:val="24"/>
-        </w:rPr>
-      </w:r>
-    </w:p>
-    <w:tbl>
-      <w:tblPr>
-        <w:tblStyle w:val="TableGrid"/>
-        <w:tblW w:type="auto" w:w="0"/>
-        <w:jc w:val="center"/>
-        <w:tblLook w:firstColumn="1" w:firstRow="1" w:lastColumn="0" w:lastRow="0" w:noHBand="0" w:noVBand="1" w:val="04A0"/>
-      </w:tblPr>
-      <w:tblGrid>
-        <w:gridCol w:w="2770"/>
-        <w:gridCol w:w="2770"/>
-        <w:gridCol w:w="2770"/>
-      </w:tblGrid>
-      <w:tr>
-        <w:trPr>
-          <w:cantSplit/>
-        </w:trPr>
-        <w:tc>
-          <w:tcPr>
-            <w:tcW w:type="dxa" w:w="3024"/>
-          </w:tcPr>
-          <w:p>
-            <w:pPr>
-              <w:jc w:val="center"/>
-            </w:pPr>
-            <w:r/>
-            <w:r>
-              <w:rPr>
-                <w:rFonts w:ascii="Times New Roman" w:hAnsi="Times New Roman"/>
-                <w:b/>
-                <w:sz w:val="22"/>
-              </w:rPr>
-              <w:t>Project Guide</w:t>
-            </w:r>
-          </w:p>
-        </w:tc>
-        <w:tc>
-          <w:tcPr>
-            <w:tcW w:type="dxa" w:w="3024"/>
-          </w:tcPr>
-          <w:p>
-            <w:pPr>
-              <w:jc w:val="center"/>
-            </w:pPr>
-            <w:r/>
-            <w:r>
-              <w:rPr>
-                <w:rFonts w:ascii="Times New Roman" w:hAnsi="Times New Roman"/>
-                <w:b/>
-                <w:sz w:val="22"/>
-              </w:rPr>
-              <w:t>Head of the Department</w:t>
-            </w:r>
-          </w:p>
-        </w:tc>
-        <w:tc>
-          <w:tcPr>
-            <w:tcW w:type="dxa" w:w="2592"/>
-          </w:tcPr>
-          <w:p>
-            <w:pPr>
-              <w:jc w:val="center"/>
-            </w:pPr>
-            <w:r/>
-            <w:r>
-              <w:rPr>
-                <w:rFonts w:ascii="Times New Roman" w:hAnsi="Times New Roman"/>
-                <w:b/>
-                <w:sz w:val="22"/>
-              </w:rPr>
-              <w:t>External Examiner</w:t>
-            </w:r>
-          </w:p>
-        </w:tc>
-      </w:tr>
-      <w:tr>
-        <w:trPr>
-          <w:cantSplit/>
-        </w:trPr>
-        <w:tc>
-          <w:tcPr>
-            <w:tcW w:type="dxa" w:w="3024"/>
-          </w:tcPr>
-          <w:p>
-            <w:pPr>
-              <w:jc w:val="left"/>
-            </w:pPr>
-            <w:r/>
-            <w:r>
-              <w:rPr>
-                <w:rFonts w:ascii="Times New Roman" w:hAnsi="Times New Roman"/>
-                <w:sz w:val="22"/>
-              </w:rPr>
-              <w:t>Mr. G. Victor Daniel</w:t>
-              <w:br/>
-              <w:t>Assistant Professor</w:t>
-            </w:r>
-          </w:p>
-        </w:tc>
-        <w:tc>
-          <w:tcPr>
-            <w:tcW w:type="dxa" w:w="3024"/>
-          </w:tcPr>
-          <w:p>
-            <w:pPr>
-              <w:jc w:val="left"/>
-            </w:pPr>
-            <w:r/>
-            <w:r>
-              <w:rPr>
-                <w:rFonts w:ascii="Times New Roman" w:hAnsi="Times New Roman"/>
-                <w:sz w:val="22"/>
-              </w:rPr>
-              <w:t>Dr. M. Trupti</w:t>
-              <w:br/>
-              <w:t>Professor &amp; Head, Dept. of AI</w:t>
-            </w:r>
-          </w:p>
-        </w:tc>
-        <w:tc>
-          <w:tcPr>
-            <w:tcW w:type="dxa" w:w="2592"/>
-          </w:tcPr>
-          <w:p>
-            <w:pPr>
-              <w:jc w:val="left"/>
-            </w:pPr>
-            <w:r/>
-            <w:r>
-              <w:rPr>
-                <w:rFonts w:ascii="Times New Roman" w:hAnsi="Times New Roman"/>
-                <w:sz w:val="22"/>
-              </w:rPr>
-            </w:r>
-          </w:p>
-        </w:tc>
-      </w:tr>
-    </w:tbl>
-    <w:p>
-      <w:pPr>
-        <w:spacing w:after="120" w:before="0" w:line="240" w:lineRule="auto"/>
-      </w:pPr>
-      <w:r>
-        <w:rPr>
-          <w:sz w:val="2"/>
-        </w:rPr>
+        <w:t>November, 2026</w:t>
       </w:r>
     </w:p>
     <w:p>
@@ -1264,7 +372,7 @@
           <w:i w:val="0"/>
           <w:sz w:val="24"/>
         </w:rPr>
-        <w:t>We hereby declare that the Mini Project report entitled "PLANT DOCTOR: A Multilingual Voice-Enabled Dual-Index RAG Chatbot for Agricultural Advisory and Government Scheme Assistance", submitted to the Department of Artificial Intelligence, Anurag University, in partial fulfilment of the requirements for the award of the degree of Bachelor of Technology in Artificial Intelligence, is a record of original work carried out by us under the guidance of Mr. G. Victor Daniel, Assistant Professor, Department of Artificial Intelligence. The results embodied in this report have not been submitted to any other university or institute for the award of any degree or diploma. Wherever the work of others — including documents, pretrained models and publicly available code — has been used, it has been duly acknowledged and cited. The results reported are genuine and reproducible from the submitted code.</w:t>
+        <w:t>We hereby declare that the Mini Project report entitled "Plant Doctor: A Multilingual Voice-Enabled Dual-Index RAG Chatbot for Agricultural Advisory and Government Scheme Assistance", submitted to the Department of Artificial Intelligence, Anurag University, in partial fulfilment of the requirements for the award of the degree of Bachelor of Technology in Artificial Intelligence, is a record of original work carried out by we under the guidance of Mr. G. Victor Daniel, Assistant Professor, Department of Artificial Intelligence. The results embodied in this report have not been submitted to any other university or institute for the award of any degree or diploma. Wherever the work of others, including pretrained models, open source libraries and published papers, has been used, it has been duly acknowledged and cited.</w:t>
       </w:r>
     </w:p>
     <w:p>
@@ -1279,7 +387,20 @@
           <w:i w:val="0"/>
           <w:sz w:val="24"/>
         </w:rPr>
-        <w:t>Use of AI tools: We declare that we used an AI assistant (Claude) during this project for software-development help and for language editing of this report. All experiments were run by us, and every result reported here was checked against the logged output of the system. We take full responsibility for the content of this report.</w:t>
+        <w:t>Use of AI tools: We declare that we used large language model tools for language editing, code debugging assistance and drafting support while preparing this report. The system design, implementation, testing and interpretation of results are our own, and we take full responsibility for the content of this report.</w:t>
+      </w:r>
+    </w:p>
+    <w:p>
+      <w:pPr>
+        <w:spacing w:after="120"/>
+      </w:pPr>
+      <w:r>
+        <w:rPr>
+          <w:rFonts w:ascii="Times New Roman" w:hAnsi="Times New Roman" w:cs="Times New Roman"/>
+          <w:b w:val="0"/>
+          <w:i w:val="0"/>
+          <w:sz w:val="24"/>
+        </w:rPr>
       </w:r>
     </w:p>
     <w:p>
@@ -1298,7 +419,7 @@
     </w:p>
     <w:p>
       <w:pPr>
-        <w:spacing w:after="240"/>
+        <w:spacing w:after="280"/>
       </w:pPr>
       <w:r>
         <w:rPr>
@@ -1576,7 +697,7 @@
     </w:p>
     <w:p>
       <w:pPr>
-        <w:spacing w:after="240"/>
+        <w:spacing w:after="280"/>
         <w:jc w:val="center"/>
       </w:pPr>
       <w:r>
@@ -1586,7 +707,7 @@
           <w:i w:val="0"/>
           <w:sz w:val="32"/>
         </w:rPr>
-        <w:t>ACKNOWLEDGEMENT</w:t>
+        <w:t>CERTIFICATE</w:t>
       </w:r>
     </w:p>
     <w:p>
@@ -1601,72 +722,12 @@
           <w:i w:val="0"/>
           <w:sz w:val="24"/>
         </w:rPr>
-        <w:t>We are grateful to Prof. Archana Mantri, Vice-Chancellor, Anurag University, for the facilities the University made available to us and for the environment in which this project could be carried out.</w:t>
+        <w:t>This is to certify that the Mini Project report entitled "Plant Doctor: A Multilingual Voice-Enabled Dual-Index RAG Chatbot for Agricultural Advisory and Government Scheme Assistance" is a bonafide record of the work carried out by Chunku Raja Venkata Praney Teja (23EG106C10), Prasadam Lakshmi Narasimha (23EG106C49), Konda Mukesh (23EG106C31) in partial fulfilment of the requirements for the award of the degree of Bachelor of Technology in Artificial Intelligence during the academic year 2026 to 2027. The work embodied in this report has not been submitted to any other university or institute for the award of any degree or diploma.</w:t>
       </w:r>
     </w:p>
     <w:p>
       <w:pPr>
-        <w:spacing w:after="120"/>
-        <w:jc w:val="both"/>
-      </w:pPr>
-      <w:r>
-        <w:rPr>
-          <w:rFonts w:ascii="Times New Roman" w:hAnsi="Times New Roman" w:cs="Times New Roman"/>
-          <w:b w:val="0"/>
-          <w:i w:val="0"/>
-          <w:sz w:val="24"/>
-        </w:rPr>
-        <w:t>We thank Dr. V. Vijay Kumar, Dean, School of Engineering, for his encouragement throughout our course of study.</w:t>
-      </w:r>
-    </w:p>
-    <w:p>
-      <w:pPr>
-        <w:spacing w:after="120"/>
-        <w:jc w:val="both"/>
-      </w:pPr>
-      <w:r>
-        <w:rPr>
-          <w:rFonts w:ascii="Times New Roman" w:hAnsi="Times New Roman" w:cs="Times New Roman"/>
-          <w:b w:val="0"/>
-          <w:i w:val="0"/>
-          <w:sz w:val="24"/>
-        </w:rPr>
-        <w:t>We sincerely thank Dr. M. Trupti, Professor and Head of the Department of Artificial Intelligence, for providing the resources and support we needed to complete this work.</w:t>
-      </w:r>
-    </w:p>
-    <w:p>
-      <w:pPr>
-        <w:spacing w:after="120"/>
-        <w:jc w:val="both"/>
-      </w:pPr>
-      <w:r>
-        <w:rPr>
-          <w:rFonts w:ascii="Times New Roman" w:hAnsi="Times New Roman" w:cs="Times New Roman"/>
-          <w:b w:val="0"/>
-          <w:i w:val="0"/>
-          <w:sz w:val="24"/>
-        </w:rPr>
-        <w:t>We are especially indebted to our guide, Mr. G. Victor Daniel, Assistant Professor, Department of Artificial Intelligence. The questions raised during the project reviews shaped how we tested the system, and the feedback on each draft improved this report.</w:t>
-      </w:r>
-    </w:p>
-    <w:p>
-      <w:pPr>
-        <w:spacing w:after="120"/>
-        <w:jc w:val="both"/>
-      </w:pPr>
-      <w:r>
-        <w:rPr>
-          <w:rFonts w:ascii="Times New Roman" w:hAnsi="Times New Roman" w:cs="Times New Roman"/>
-          <w:b w:val="0"/>
-          <w:i w:val="0"/>
-          <w:sz w:val="24"/>
-        </w:rPr>
-        <w:t>We also thank the developers of the open-source libraries this project is built on — in particular FAISS, sentence-transformers, fastembed, Faster-Whisper, Edge-TTS, FastAPI, LangChain and Ollama — and the publishers of the agricultural and government-scheme documents that form our knowledge base.</w:t>
-      </w:r>
-    </w:p>
-    <w:p>
-      <w:pPr>
-        <w:spacing w:after="200"/>
+        <w:spacing w:after="600"/>
       </w:pPr>
       <w:r>
         <w:rPr>
@@ -1679,8 +740,9 @@
     </w:p>
     <w:p>
       <w:pPr>
-        <w:spacing w:after="40"/>
-        <w:jc w:val="right"/>
+        <w:spacing w:after="40" w:line="240" w:lineRule="auto"/>
+        <w:ind w:left="4464"/>
+        <w:jc w:val="left"/>
       </w:pPr>
       <w:r>
         <w:rPr>
@@ -1689,13 +751,14 @@
           <w:i w:val="0"/>
           <w:sz w:val="24"/>
         </w:rPr>
-        <w:t>Chunku Raja Venkata Praney Teja (23EG106C10)</w:t>
+        <w:t>Mr. G. Victor Daniel</w:t>
       </w:r>
     </w:p>
     <w:p>
       <w:pPr>
-        <w:spacing w:after="40"/>
-        <w:jc w:val="right"/>
+        <w:spacing w:after="40" w:line="240" w:lineRule="auto"/>
+        <w:ind w:left="4464"/>
+        <w:jc w:val="left"/>
       </w:pPr>
       <w:r>
         <w:rPr>
@@ -1704,13 +767,14 @@
           <w:i w:val="0"/>
           <w:sz w:val="24"/>
         </w:rPr>
-        <w:t>Prasadam Lakshmi Narasimha (23EG106C49)</w:t>
+        <w:t>Project Guide,</w:t>
       </w:r>
     </w:p>
     <w:p>
       <w:pPr>
-        <w:spacing w:after="40"/>
-        <w:jc w:val="right"/>
+        <w:spacing w:after="40" w:line="240" w:lineRule="auto"/>
+        <w:ind w:left="4464"/>
+        <w:jc w:val="left"/>
       </w:pPr>
       <w:r>
         <w:rPr>
@@ -1719,13 +783,249 @@
           <w:i w:val="0"/>
           <w:sz w:val="24"/>
         </w:rPr>
-        <w:t>Konda Mukesh (23EG106C31)</w:t>
+        <w:t>Assistant Professor,</w:t>
+      </w:r>
+    </w:p>
+    <w:p>
+      <w:pPr>
+        <w:spacing w:after="200" w:line="240" w:lineRule="auto"/>
+        <w:ind w:left="4464"/>
+        <w:jc w:val="left"/>
+      </w:pPr>
+      <w:r>
+        <w:rPr>
+          <w:rFonts w:ascii="Times New Roman" w:hAnsi="Times New Roman" w:cs="Times New Roman"/>
+          <w:b w:val="0"/>
+          <w:i w:val="0"/>
+          <w:sz w:val="24"/>
+        </w:rPr>
+        <w:t>Department of Artificial Intelligence</w:t>
+      </w:r>
+    </w:p>
+    <w:p>
+      <w:pPr>
+        <w:spacing w:after="440"/>
+      </w:pPr>
+      <w:r>
+        <w:rPr>
+          <w:rFonts w:ascii="Times New Roman" w:hAnsi="Times New Roman" w:cs="Times New Roman"/>
+          <w:b w:val="0"/>
+          <w:i w:val="0"/>
+          <w:sz w:val="24"/>
+        </w:rPr>
+      </w:r>
+    </w:p>
+    <w:p>
+      <w:pPr>
+        <w:spacing w:after="40" w:line="240" w:lineRule="auto"/>
+        <w:ind w:left="4464"/>
+        <w:jc w:val="left"/>
+      </w:pPr>
+      <w:r>
+        <w:rPr>
+          <w:rFonts w:ascii="Times New Roman" w:hAnsi="Times New Roman" w:cs="Times New Roman"/>
+          <w:b w:val="0"/>
+          <w:i w:val="0"/>
+          <w:sz w:val="24"/>
+        </w:rPr>
+        <w:t>Dr. M. Trupti,</w:t>
+      </w:r>
+    </w:p>
+    <w:p>
+      <w:pPr>
+        <w:spacing w:after="40" w:line="240" w:lineRule="auto"/>
+        <w:ind w:left="4464"/>
+        <w:jc w:val="left"/>
+      </w:pPr>
+      <w:r>
+        <w:rPr>
+          <w:rFonts w:ascii="Times New Roman" w:hAnsi="Times New Roman" w:cs="Times New Roman"/>
+          <w:b w:val="0"/>
+          <w:i w:val="0"/>
+          <w:sz w:val="24"/>
+        </w:rPr>
+        <w:t>Head of the Department</w:t>
+      </w:r>
+    </w:p>
+    <w:p>
+      <w:pPr>
+        <w:spacing w:after="200" w:line="240" w:lineRule="auto"/>
+        <w:ind w:left="4464"/>
+        <w:jc w:val="left"/>
+      </w:pPr>
+      <w:r>
+        <w:rPr>
+          <w:rFonts w:ascii="Times New Roman" w:hAnsi="Times New Roman" w:cs="Times New Roman"/>
+          <w:b w:val="0"/>
+          <w:i w:val="0"/>
+          <w:sz w:val="24"/>
+        </w:rPr>
+        <w:t>Department of Artificial Intelligence</w:t>
       </w:r>
     </w:p>
     <w:p>
       <w:r>
         <w:br w:type="page"/>
       </w:r>
+    </w:p>
+    <w:p>
+      <w:pPr>
+        <w:spacing w:after="240"/>
+        <w:jc w:val="center"/>
+      </w:pPr>
+      <w:r>
+        <w:rPr>
+          <w:rFonts w:ascii="Times New Roman" w:hAnsi="Times New Roman" w:cs="Times New Roman"/>
+          <w:b/>
+          <w:i w:val="0"/>
+          <w:sz w:val="32"/>
+        </w:rPr>
+        <w:t>ACKNOWLEDGEMENTS</w:t>
+      </w:r>
+    </w:p>
+    <w:p>
+      <w:pPr>
+        <w:spacing w:after="120"/>
+        <w:jc w:val="both"/>
+      </w:pPr>
+      <w:r>
+        <w:rPr>
+          <w:rFonts w:ascii="Times New Roman" w:hAnsi="Times New Roman" w:cs="Times New Roman"/>
+          <w:b w:val="0"/>
+          <w:i w:val="0"/>
+          <w:sz w:val="24"/>
+        </w:rPr>
+        <w:t>We express our sincere gratitude to our guide, Mr. G. Victor Daniel, Assistant Professor, Department of Artificial Intelligence, for his valuable guidance, constant encouragement and support throughout this project. His feedback at every review helped we shape the scope of Plant Doctor, keep the system design simple and practical, and report our work honestly.</w:t>
+      </w:r>
+    </w:p>
+    <w:p>
+      <w:pPr>
+        <w:spacing w:after="120"/>
+        <w:jc w:val="both"/>
+      </w:pPr>
+      <w:r>
+        <w:rPr>
+          <w:rFonts w:ascii="Times New Roman" w:hAnsi="Times New Roman" w:cs="Times New Roman"/>
+          <w:b w:val="0"/>
+          <w:i w:val="0"/>
+          <w:sz w:val="24"/>
+        </w:rPr>
+        <w:t>We thank Dr. M. Trupti, Head of the Department of Artificial Intelligence, for providing the facilities and the academic environment needed to carry out this project, and for the support extended during the project reviews.</w:t>
+      </w:r>
+    </w:p>
+    <w:p>
+      <w:pPr>
+        <w:spacing w:after="120"/>
+        <w:jc w:val="both"/>
+      </w:pPr>
+      <w:r>
+        <w:rPr>
+          <w:rFonts w:ascii="Times New Roman" w:hAnsi="Times New Roman" w:cs="Times New Roman"/>
+          <w:b w:val="0"/>
+          <w:i w:val="0"/>
+          <w:sz w:val="24"/>
+        </w:rPr>
+        <w:t>We thank the Project Review Committee members of the Department of Artificial Intelligence for their suggestions during the reviews, which helped we improve the system design and the evaluation plan.</w:t>
+      </w:r>
+    </w:p>
+    <w:p>
+      <w:pPr>
+        <w:spacing w:after="120"/>
+        <w:jc w:val="both"/>
+      </w:pPr>
+      <w:r>
+        <w:rPr>
+          <w:rFonts w:ascii="Times New Roman" w:hAnsi="Times New Roman" w:cs="Times New Roman"/>
+          <w:b w:val="0"/>
+          <w:i w:val="0"/>
+          <w:sz w:val="24"/>
+        </w:rPr>
+        <w:t>We are grateful to Dr. V. Vijay Kumar, Dean, School of Engineering, Prof. Archana Mantri, Vice-Chancellor, and the Management of Anurag University for providing the computing facilities, library resources and academic environment necessary for successfully completing this work.</w:t>
+      </w:r>
+    </w:p>
+    <w:p>
+      <w:pPr>
+        <w:spacing w:after="120"/>
+        <w:jc w:val="both"/>
+      </w:pPr>
+      <w:r>
+        <w:rPr>
+          <w:rFonts w:ascii="Times New Roman" w:hAnsi="Times New Roman" w:cs="Times New Roman"/>
+          <w:b w:val="0"/>
+          <w:i w:val="0"/>
+          <w:sz w:val="24"/>
+        </w:rPr>
+        <w:t>We also thank all the faculty and staff of the Department of Artificial Intelligence, our families and our friends for their continued support and encouragement.</w:t>
+      </w:r>
+    </w:p>
+    <w:p>
+      <w:pPr>
+        <w:spacing w:after="200"/>
+      </w:pPr>
+      <w:r>
+        <w:rPr>
+          <w:rFonts w:ascii="Times New Roman" w:hAnsi="Times New Roman" w:cs="Times New Roman"/>
+          <w:b w:val="0"/>
+          <w:i w:val="0"/>
+          <w:sz w:val="24"/>
+        </w:rPr>
+      </w:r>
+    </w:p>
+    <w:p>
+      <w:pPr>
+        <w:spacing w:after="40"/>
+        <w:jc w:val="right"/>
+      </w:pPr>
+      <w:r>
+        <w:rPr>
+          <w:rFonts w:ascii="Times New Roman" w:hAnsi="Times New Roman" w:cs="Times New Roman"/>
+          <w:b w:val="0"/>
+          <w:i/>
+          <w:sz w:val="24"/>
+        </w:rPr>
+        <w:t>Chunku Raja Venkata Praney Teja (23EG106C10)</w:t>
+      </w:r>
+    </w:p>
+    <w:p>
+      <w:pPr>
+        <w:spacing w:after="40"/>
+        <w:jc w:val="right"/>
+      </w:pPr>
+      <w:r>
+        <w:rPr>
+          <w:rFonts w:ascii="Times New Roman" w:hAnsi="Times New Roman" w:cs="Times New Roman"/>
+          <w:b w:val="0"/>
+          <w:i/>
+          <w:sz w:val="24"/>
+        </w:rPr>
+        <w:t>Prasadam Lakshmi Narasimha (23EG106C49)</w:t>
+      </w:r>
+    </w:p>
+    <w:p>
+      <w:pPr>
+        <w:spacing w:after="40"/>
+        <w:jc w:val="right"/>
+      </w:pPr>
+      <w:r>
+        <w:rPr>
+          <w:rFonts w:ascii="Times New Roman" w:hAnsi="Times New Roman" w:cs="Times New Roman"/>
+          <w:b w:val="0"/>
+          <w:i/>
+          <w:sz w:val="24"/>
+        </w:rPr>
+        <w:t>Konda Mukesh (23EG106C31)</w:t>
+      </w:r>
+    </w:p>
+    <w:p>
+      <w:pPr>
+        <w:sectPr>
+          <w:footerReference w:type="default" r:id="rId11"/>
+          <w:pgSz w:w="11909" w:h="16834"/>
+          <w:pgMar w:top="1440" w:right="1440" w:bottom="1440" w:left="2160" w:header="720" w:footer="720" w:gutter="0"/>
+          <w:cols w:space="720"/>
+          <w:docGrid w:linePitch="360"/>
+        </w:sectPr>
+      </w:pPr>
     </w:p>
     <w:p>
       <w:pPr>
@@ -2052,7 +1352,7 @@
                 <w:rFonts w:ascii="Times New Roman" w:hAnsi="Times New Roman"/>
                 <w:sz w:val="22"/>
               </w:rPr>
-              <w:t>15</w:t>
+              <w:t>16</w:t>
             </w:r>
           </w:p>
         </w:tc>
@@ -2111,7 +1411,7 @@
                 <w:rFonts w:ascii="Times New Roman" w:hAnsi="Times New Roman"/>
                 <w:sz w:val="22"/>
               </w:rPr>
-              <w:t>16</w:t>
+              <w:t>17</w:t>
             </w:r>
           </w:p>
         </w:tc>
@@ -2170,7 +1470,7 @@
                 <w:rFonts w:ascii="Times New Roman" w:hAnsi="Times New Roman"/>
                 <w:sz w:val="22"/>
               </w:rPr>
-              <w:t>30</w:t>
+              <w:t>31</w:t>
             </w:r>
           </w:p>
         </w:tc>
@@ -2229,7 +1529,7 @@
                 <w:rFonts w:ascii="Times New Roman" w:hAnsi="Times New Roman"/>
                 <w:sz w:val="22"/>
               </w:rPr>
-              <w:t>31</w:t>
+              <w:t>32</w:t>
             </w:r>
           </w:p>
         </w:tc>
@@ -2288,7 +1588,7 @@
                 <w:rFonts w:ascii="Times New Roman" w:hAnsi="Times New Roman"/>
                 <w:sz w:val="22"/>
               </w:rPr>
-              <w:t>32</w:t>
+              <w:t>33</w:t>
             </w:r>
           </w:p>
         </w:tc>
@@ -2347,7 +1647,7 @@
                 <w:rFonts w:ascii="Times New Roman" w:hAnsi="Times New Roman"/>
                 <w:sz w:val="22"/>
               </w:rPr>
-              <w:t>35</w:t>
+              <w:t>36</w:t>
             </w:r>
           </w:p>
         </w:tc>
@@ -2406,7 +1706,7 @@
                 <w:rFonts w:ascii="Times New Roman" w:hAnsi="Times New Roman"/>
                 <w:sz w:val="22"/>
               </w:rPr>
-              <w:t>35</w:t>
+              <w:t>36</w:t>
             </w:r>
           </w:p>
         </w:tc>
@@ -2465,7 +1765,7 @@
                 <w:rFonts w:ascii="Times New Roman" w:hAnsi="Times New Roman"/>
                 <w:sz w:val="22"/>
               </w:rPr>
-              <w:t>36</w:t>
+              <w:t>37</w:t>
             </w:r>
           </w:p>
         </w:tc>
@@ -2629,7 +1929,7 @@
                 <w:rFonts w:ascii="Times New Roman" w:hAnsi="Times New Roman"/>
                 <w:sz w:val="22"/>
               </w:rPr>
-              <w:t>9</w:t>
+              <w:t>10</w:t>
             </w:r>
           </w:p>
         </w:tc>
@@ -2688,7 +1988,7 @@
                 <w:rFonts w:ascii="Times New Roman" w:hAnsi="Times New Roman"/>
                 <w:sz w:val="22"/>
               </w:rPr>
-              <w:t>13</w:t>
+              <w:t>14</w:t>
             </w:r>
           </w:p>
         </w:tc>
@@ -2747,7 +2047,7 @@
                 <w:rFonts w:ascii="Times New Roman" w:hAnsi="Times New Roman"/>
                 <w:sz w:val="22"/>
               </w:rPr>
-              <w:t>16</w:t>
+              <w:t>17</w:t>
             </w:r>
           </w:p>
         </w:tc>
@@ -2806,7 +2106,7 @@
                 <w:rFonts w:ascii="Times New Roman" w:hAnsi="Times New Roman"/>
                 <w:sz w:val="22"/>
               </w:rPr>
-              <w:t>23</w:t>
+              <w:t>24</w:t>
             </w:r>
           </w:p>
         </w:tc>
@@ -2865,7 +2165,7 @@
                 <w:rFonts w:ascii="Times New Roman" w:hAnsi="Times New Roman"/>
                 <w:sz w:val="22"/>
               </w:rPr>
-              <w:t>24</w:t>
+              <w:t>25</w:t>
             </w:r>
           </w:p>
         </w:tc>
@@ -2924,7 +2224,7 @@
                 <w:rFonts w:ascii="Times New Roman" w:hAnsi="Times New Roman"/>
                 <w:sz w:val="22"/>
               </w:rPr>
-              <w:t>28</w:t>
+              <w:t>29</w:t>
             </w:r>
           </w:p>
         </w:tc>
@@ -2983,7 +2283,7 @@
                 <w:rFonts w:ascii="Times New Roman" w:hAnsi="Times New Roman"/>
                 <w:sz w:val="22"/>
               </w:rPr>
-              <w:t>30</w:t>
+              <w:t>31</w:t>
             </w:r>
           </w:p>
         </w:tc>
@@ -3042,7 +2342,7 @@
                 <w:rFonts w:ascii="Times New Roman" w:hAnsi="Times New Roman"/>
                 <w:sz w:val="22"/>
               </w:rPr>
-              <w:t>31</w:t>
+              <w:t>32</w:t>
             </w:r>
           </w:p>
         </w:tc>
@@ -4052,7 +3352,7 @@
         <w:drawing>
           <wp:inline xmlns:a="http://schemas.openxmlformats.org/drawingml/2006/main" xmlns:pic="http://schemas.openxmlformats.org/drawingml/2006/picture">
             <wp:extent cx="4937760" cy="3546842"/>
-            <wp:docPr id="4" name="Picture 4"/>
+            <wp:docPr id="2" name="Picture 2"/>
             <wp:cNvGraphicFramePr>
               <a:graphicFrameLocks noChangeAspect="1"/>
             </wp:cNvGraphicFramePr>
@@ -4207,59 +3507,7 @@
           <w:i w:val="0"/>
           <w:sz w:val="24"/>
         </w:rPr>
-        <w:t>Existing agricultural question-answering systems built on single-index RAG retrieve semantically similar passages from across their whole corpus, so a crop-disease query can surface government-scheme passages and vice-versa; they often miss exact policy terms, scheme names and crop-specific keywords that lexical search handles well; they are usually text-only and English-only; and they tend to answer even when the evidence is weak. In particular, this project addresses the following problems:</w:t>
-      </w:r>
-    </w:p>
-    <w:p>
-      <w:pPr>
-        <w:pStyle w:val="ListNumber"/>
-        <w:spacing w:after="60"/>
-      </w:pPr>
-      <w:r>
-        <w:rPr>
-          <w:rFonts w:ascii="Times New Roman" w:hAnsi="Times New Roman"/>
-          <w:sz w:val="24"/>
-        </w:rPr>
-        <w:t>Domain contamination: a single index mixes two unrelated knowledge sources, so answers can be built from the wrong domain.</w:t>
-      </w:r>
-    </w:p>
-    <w:p>
-      <w:pPr>
-        <w:pStyle w:val="ListNumber"/>
-        <w:spacing w:after="60"/>
-      </w:pPr>
-      <w:r>
-        <w:rPr>
-          <w:rFonts w:ascii="Times New Roman" w:hAnsi="Times New Roman"/>
-          <w:sz w:val="24"/>
-        </w:rPr>
-        <w:t>Weak lexical recall: pure dense retrieval misses exact disease names, fertiliser ratios, scheme names and document identifiers that farmers actually use.</w:t>
-      </w:r>
-    </w:p>
-    <w:p>
-      <w:pPr>
-        <w:pStyle w:val="ListNumber"/>
-        <w:spacing w:after="60"/>
-      </w:pPr>
-      <w:r>
-        <w:rPr>
-          <w:rFonts w:ascii="Times New Roman" w:hAnsi="Times New Roman"/>
-          <w:sz w:val="24"/>
-        </w:rPr>
-        <w:t>Accessibility barrier: most systems are text-only and English-only, excluding farmers who prefer regional languages or voice.</w:t>
-      </w:r>
-    </w:p>
-    <w:p>
-      <w:pPr>
-        <w:pStyle w:val="ListNumber"/>
-        <w:spacing w:after="60"/>
-      </w:pPr>
-      <w:r>
-        <w:rPr>
-          <w:rFonts w:ascii="Times New Roman" w:hAnsi="Times New Roman"/>
-          <w:sz w:val="24"/>
-        </w:rPr>
-        <w:t>Ungrounded answers: without retrieval and citation, answers may be fluent but unsupported, which is unsafe for agricultural and financial decisions.</w:t>
+        <w:t>Existing agricultural question-answering systems built on single-index retrieval-augmented generation retrieve semantically similar passages from across their whole corpus, so a crop-disease query can surface government-scheme passages and the reverse can also happen; they often miss the exact policy terms, scheme names and crop-specific keywords that lexical search handles well; they are usually text-only and English-only; and they tend to answer even when the available evidence is weak. This project therefore addresses four connected problems that, taken together, keep such systems from being dependable in the field. (i) Domain contamination arises because a single index mixes two unrelated knowledge sources, so an answer can be built from the wrong domain. (ii) Weak lexical recall occurs because pure dense retrieval misses the exact disease names, fertiliser ratios, scheme names and document identifiers that farmers actually type. (iii) An accessibility barrier remains because most systems are text-only and English-only, which excludes farmers who prefer a regional language or who prefer to speak rather than type. (iv) Ungrounded answers are produced because, without retrieval and citation, a reply may be fluent yet unsupported, which is unsafe for the agricultural and financial decisions a farmer may act on.</w:t>
       </w:r>
     </w:p>
     <w:p>
@@ -4274,7 +3522,7 @@
           <w:i w:val="0"/>
           <w:sz w:val="24"/>
         </w:rPr>
-        <w:t>Hence there is a need for a farmer-facing assistant that (1) isolates the agricultural and government-scheme domains into separate indices, (2) retrieves with hybrid dense-plus-sparse search and reranking, (3) understands and replies in the farmer's language by text or voice, and (4) grounds every answer in retrieved documents and shows the sources.</w:t>
+        <w:t>Hence there is a need for a farmer-facing assistant that isolates the agricultural and government-scheme domains into separate indices, retrieves with hybrid dense-plus-sparse search and reranking, understands and replies in the farmer's own language by text or voice, and grounds every answer in retrieved documents while showing those sources, so that the person reading the answer can verify it against the material it was drawn from before acting on it. The remainder of this report develops exactly such a system and measures how well each of its parts contributes to that goal.</w:t>
       </w:r>
     </w:p>
     <w:p>
@@ -4300,100 +3548,7 @@
           <w:i w:val="0"/>
           <w:sz w:val="24"/>
         </w:rPr>
-        <w:t>The objectives of this project, stated as in the associated research paper, are:</w:t>
-      </w:r>
-    </w:p>
-    <w:p>
-      <w:pPr>
-        <w:pStyle w:val="ListNumber"/>
-        <w:spacing w:after="60"/>
-      </w:pPr>
-      <w:r>
-        <w:rPr>
-          <w:rFonts w:ascii="Times New Roman" w:hAnsi="Times New Roman"/>
-          <w:sz w:val="24"/>
-        </w:rPr>
-        <w:t>O1 — Design a domain-isolated dual-index RAG architecture for agricultural advisory and government-benefit navigation.</w:t>
-      </w:r>
-    </w:p>
-    <w:p>
-      <w:pPr>
-        <w:pStyle w:val="ListNumber"/>
-        <w:spacing w:after="60"/>
-      </w:pPr>
-      <w:r>
-        <w:rPr>
-          <w:rFonts w:ascii="Times New Roman" w:hAnsi="Times New Roman"/>
-          <w:sz w:val="24"/>
-        </w:rPr>
-        <w:t>O2 — Combine dense semantic retrieval with sparse BM25 retrieval to improve candidate recall and precision.</w:t>
-      </w:r>
-    </w:p>
-    <w:p>
-      <w:pPr>
-        <w:pStyle w:val="ListNumber"/>
-        <w:spacing w:after="60"/>
-      </w:pPr>
-      <w:r>
-        <w:rPr>
-          <w:rFonts w:ascii="Times New Roman" w:hAnsi="Times New Roman"/>
-          <w:sz w:val="24"/>
-        </w:rPr>
-        <w:t>O3 — Apply Cross-Encoder reranking to improve the ordering of retrieved evidence.</w:t>
-      </w:r>
-    </w:p>
-    <w:p>
-      <w:pPr>
-        <w:pStyle w:val="ListNumber"/>
-        <w:spacing w:after="60"/>
-      </w:pPr>
-      <w:r>
-        <w:rPr>
-          <w:rFonts w:ascii="Times New Roman" w:hAnsi="Times New Roman"/>
-          <w:sz w:val="24"/>
-        </w:rPr>
-        <w:t>O4 — Support English, Hindi, Telugu and Tamil through adaptive multilingual query processing.</w:t>
-      </w:r>
-    </w:p>
-    <w:p>
-      <w:pPr>
-        <w:pStyle w:val="ListNumber"/>
-        <w:spacing w:after="60"/>
-      </w:pPr>
-      <w:r>
-        <w:rPr>
-          <w:rFonts w:ascii="Times New Roman" w:hAnsi="Times New Roman"/>
-          <w:sz w:val="24"/>
-        </w:rPr>
-        <w:t>O5 — Provide voice input (speech-to-text) and voice output (text-to-speech).</w:t>
-      </w:r>
-    </w:p>
-    <w:p>
-      <w:pPr>
-        <w:pStyle w:val="ListNumber"/>
-        <w:spacing w:after="60"/>
-      </w:pPr>
-      <w:r>
-        <w:rPr>
-          <w:rFonts w:ascii="Times New Roman" w:hAnsi="Times New Roman"/>
-          <w:sz w:val="24"/>
-        </w:rPr>
-        <w:t>O6 — Establish an evaluation framework covering faithfulness, context precision, context recall, answer relevance and system latency.</w:t>
-      </w:r>
-    </w:p>
-    <w:p>
-      <w:pPr>
-        <w:spacing w:after="120"/>
-        <w:jc w:val="both"/>
-      </w:pPr>
-      <w:r>
-        <w:rPr>
-          <w:rFonts w:ascii="Times New Roman" w:hAnsi="Times New Roman" w:cs="Times New Roman"/>
-          <w:b w:val="0"/>
-          <w:i w:val="0"/>
-          <w:sz w:val="24"/>
-        </w:rPr>
-        <w:t>Each objective is mapped to a concrete methodology in Chapter 4 (Table 4.2) and its outcome is reported against measured results in Chapter 6.</w:t>
+        <w:t>The objectives of this project are framed as concrete, verifiable goals, each of which is mapped to a specific method in Chapter 4 and to a measured outcome in Chapter 6, so that the work can be judged against what it set out to do. The project set out to achieve the following goals. (i) To construct a domain-isolated dual-index retrieval-augmented generation architecture that keeps agricultural advisory knowledge and government-scheme knowledge in separate indices, so that a query is answered only from its own domain and the two bodies of knowledge cannot contaminate each other. (ii) To develop a hybrid retrieval mechanism that combines dense semantic search with sparse BM25 keyword search, and to fuse and diversify their results so that both the meaning of a question and its exact terms contribute to the passages that are retrieved. (iii) To apply cross-encoder reranking that reads each query and candidate passage jointly and improves the ordering of the retrieved evidence before it is passed to the language model. (iv) To support English, Hindi, Telugu and Tamil through adaptive multilingual query processing, so that a farmer can ask a question and receive an answer in a familiar language. (v) To provide voice input through speech recognition and voice output through speech synthesis, so that the service is usable by a person who prefers speaking to typing. (vi) To establish an evaluation framework that measures faithfulness, context precision, context recall, answer relevance and system latency, so that the contribution of each component can be reported honestly against reproducible numbers rather than a single headline figure.</w:t>
       </w:r>
     </w:p>
     <w:p>
@@ -6382,7 +5537,7 @@
         <w:drawing>
           <wp:inline xmlns:a="http://schemas.openxmlformats.org/drawingml/2006/main" xmlns:pic="http://schemas.openxmlformats.org/drawingml/2006/picture">
             <wp:extent cx="5669280" cy="3184115"/>
-            <wp:docPr id="5" name="Picture 5"/>
+            <wp:docPr id="3" name="Picture 3"/>
             <wp:cNvGraphicFramePr>
               <a:graphicFrameLocks noChangeAspect="1"/>
             </wp:cNvGraphicFramePr>
@@ -6452,7 +5607,7 @@
         <w:drawing>
           <wp:inline xmlns:a="http://schemas.openxmlformats.org/drawingml/2006/main" xmlns:pic="http://schemas.openxmlformats.org/drawingml/2006/picture">
             <wp:extent cx="4754880" cy="2906588"/>
-            <wp:docPr id="6" name="Picture 6"/>
+            <wp:docPr id="4" name="Picture 4"/>
             <wp:cNvGraphicFramePr>
               <a:graphicFrameLocks noChangeAspect="1"/>
             </wp:cNvGraphicFramePr>
@@ -8033,7 +7188,7 @@
                 <w:rFonts w:ascii="Times New Roman" w:hAnsi="Times New Roman"/>
                 <w:sz w:val="22"/>
               </w:rPr>
-              <w:t>O1</w:t>
+              <w:t>(i)</w:t>
             </w:r>
           </w:p>
         </w:tc>
@@ -8092,7 +7247,7 @@
                 <w:rFonts w:ascii="Times New Roman" w:hAnsi="Times New Roman"/>
                 <w:sz w:val="22"/>
               </w:rPr>
-              <w:t>O2</w:t>
+              <w:t>(ii)</w:t>
             </w:r>
           </w:p>
         </w:tc>
@@ -8151,7 +7306,7 @@
                 <w:rFonts w:ascii="Times New Roman" w:hAnsi="Times New Roman"/>
                 <w:sz w:val="22"/>
               </w:rPr>
-              <w:t>O3</w:t>
+              <w:t>(iii)</w:t>
             </w:r>
           </w:p>
         </w:tc>
@@ -8210,7 +7365,7 @@
                 <w:rFonts w:ascii="Times New Roman" w:hAnsi="Times New Roman"/>
                 <w:sz w:val="22"/>
               </w:rPr>
-              <w:t>O4</w:t>
+              <w:t>(iv)</w:t>
             </w:r>
           </w:p>
         </w:tc>
@@ -8269,7 +7424,7 @@
                 <w:rFonts w:ascii="Times New Roman" w:hAnsi="Times New Roman"/>
                 <w:sz w:val="22"/>
               </w:rPr>
-              <w:t>O5</w:t>
+              <w:t>(v)</w:t>
             </w:r>
           </w:p>
         </w:tc>
@@ -8328,7 +7483,7 @@
                 <w:rFonts w:ascii="Times New Roman" w:hAnsi="Times New Roman"/>
                 <w:sz w:val="22"/>
               </w:rPr>
-              <w:t>O6</w:t>
+              <w:t>(vi)</w:t>
             </w:r>
           </w:p>
         </w:tc>
@@ -9040,85 +8195,7 @@
           <w:i w:val="0"/>
           <w:sz w:val="24"/>
         </w:rPr>
-        <w:t>The code is organised into clear modules, each with a single responsibility, so that any one can be replaced without disturbing the others:</w:t>
-      </w:r>
-    </w:p>
-    <w:p>
-      <w:pPr>
-        <w:pStyle w:val="ListBullet"/>
-        <w:spacing w:after="60"/>
-      </w:pPr>
-      <w:r>
-        <w:rPr>
-          <w:rFonts w:ascii="Times New Roman" w:hAnsi="Times New Roman"/>
-          <w:sz w:val="24"/>
-        </w:rPr>
-        <w:t>pipeline — document loading (PDF/DOCX/TXT/MD), recursive chunking, the cached embedder, the FAISS vector-store manager, the hybrid retriever (with the pure-Python BM25) and the Cross-Encoder reranker.</w:t>
-      </w:r>
-    </w:p>
-    <w:p>
-      <w:pPr>
-        <w:pStyle w:val="ListBullet"/>
-        <w:spacing w:after="60"/>
-      </w:pPr>
-      <w:r>
-        <w:rPr>
-          <w:rFonts w:ascii="Times New Roman" w:hAnsi="Times New Roman"/>
-          <w:sz w:val="24"/>
-        </w:rPr>
-        <w:t>rag — the RAG chain that orchestrates retrieval, reranking, prompt assembly, caching and the LLM call; the prompt builder; and the sliding-window conversation memory.</w:t>
-      </w:r>
-    </w:p>
-    <w:p>
-      <w:pPr>
-        <w:pStyle w:val="ListBullet"/>
-        <w:spacing w:after="60"/>
-      </w:pPr>
-      <w:r>
-        <w:rPr>
-          <w:rFonts w:ascii="Times New Roman" w:hAnsi="Times New Roman"/>
-          <w:sz w:val="24"/>
-        </w:rPr>
-        <w:t>voice — Faster-Whisper speech recognition, the translator with its fallback chain, and the Edge-TTS/gTTS speech synthesiser.</w:t>
-      </w:r>
-    </w:p>
-    <w:p>
-      <w:pPr>
-        <w:pStyle w:val="ListBullet"/>
-        <w:spacing w:after="60"/>
-      </w:pPr>
-      <w:r>
-        <w:rPr>
-          <w:rFonts w:ascii="Times New Roman" w:hAnsi="Times New Roman"/>
-          <w:sz w:val="24"/>
-        </w:rPr>
-        <w:t>backend — the FastAPI application exposing the REST endpoints, and the LLM factory with interchangeable Ollama and Groq clients.</w:t>
-      </w:r>
-    </w:p>
-    <w:p>
-      <w:pPr>
-        <w:pStyle w:val="ListBullet"/>
-        <w:spacing w:after="60"/>
-      </w:pPr>
-      <w:r>
-        <w:rPr>
-          <w:rFonts w:ascii="Times New Roman" w:hAnsi="Times New Roman"/>
-          <w:sz w:val="24"/>
-        </w:rPr>
-        <w:t>web — the single-page frontend (HTML/CSS/JavaScript) served by the backend.</w:t>
-      </w:r>
-    </w:p>
-    <w:p>
-      <w:pPr>
-        <w:pStyle w:val="ListBullet"/>
-        <w:spacing w:after="60"/>
-      </w:pPr>
-      <w:r>
-        <w:rPr>
-          <w:rFonts w:ascii="Times New Roman" w:hAnsi="Times New Roman"/>
-          <w:sz w:val="24"/>
-        </w:rPr>
-        <w:t>utils, config, evaluation and scripts — shared helpers, YAML/environment configuration, the metrics and benchmark code, and ingestion/indexing scripts.</w:t>
+        <w:t>The code is organised into clear modules, each with a single responsibility, so that any one can be replaced without disturbing the others. The pipeline module handles document loading for PDF, DOCX, TXT and Markdown files, recursive chunking, the cached embedder, the FAISS vector-store manager and the hybrid retriever together with its pure-Python BM25 and the Cross-Encoder reranker. The rag module contains the retrieval-augmented chain that orchestrates retrieval, reranking, prompt assembly, caching and the language model call, along with the prompt builder and the sliding-window conversation memory. The voice module provides Faster-Whisper speech recognition, the translator with its fallback chain and the Edge-TTS or gTTS speech synthesiser. The backend module is the FastAPI application that exposes the REST endpoints and the language-model factory with interchangeable Ollama and Groq clients, while the web module is the single-page frontend written in HTML, CSS and JavaScript that the backend serves. Finally, the utils, config, evaluation and scripts modules hold the shared helpers, the YAML and environment configuration, the metrics and benchmark code, and the ingestion and indexing scripts, so that configuration and evaluation are kept separate from the core pipeline logic.</w:t>
       </w:r>
     </w:p>
     <w:p>
@@ -10861,7 +9938,7 @@
         <w:drawing>
           <wp:inline xmlns:a="http://schemas.openxmlformats.org/drawingml/2006/main" xmlns:pic="http://schemas.openxmlformats.org/drawingml/2006/picture">
             <wp:extent cx="5120640" cy="2738886"/>
-            <wp:docPr id="7" name="Picture 7"/>
+            <wp:docPr id="5" name="Picture 5"/>
             <wp:cNvGraphicFramePr>
               <a:graphicFrameLocks noChangeAspect="1"/>
             </wp:cNvGraphicFramePr>
@@ -11217,7 +10294,7 @@
         <w:drawing>
           <wp:inline xmlns:a="http://schemas.openxmlformats.org/drawingml/2006/main" xmlns:pic="http://schemas.openxmlformats.org/drawingml/2006/picture">
             <wp:extent cx="4206240" cy="2521195"/>
-            <wp:docPr id="8" name="Picture 8"/>
+            <wp:docPr id="6" name="Picture 6"/>
             <wp:cNvGraphicFramePr>
               <a:graphicFrameLocks noChangeAspect="1"/>
             </wp:cNvGraphicFramePr>
@@ -11287,7 +10364,7 @@
         <w:drawing>
           <wp:inline xmlns:a="http://schemas.openxmlformats.org/drawingml/2006/main" xmlns:pic="http://schemas.openxmlformats.org/drawingml/2006/picture">
             <wp:extent cx="4572000" cy="2658913"/>
-            <wp:docPr id="9" name="Picture 9"/>
+            <wp:docPr id="7" name="Picture 7"/>
             <wp:cNvGraphicFramePr>
               <a:graphicFrameLocks noChangeAspect="1"/>
             </wp:cNvGraphicFramePr>
@@ -11491,7 +10568,7 @@
         <w:drawing>
           <wp:inline xmlns:a="http://schemas.openxmlformats.org/drawingml/2006/main" xmlns:pic="http://schemas.openxmlformats.org/drawingml/2006/picture">
             <wp:extent cx="5577840" cy="3485786"/>
-            <wp:docPr id="10" name="Picture 10"/>
+            <wp:docPr id="8" name="Picture 8"/>
             <wp:cNvGraphicFramePr>
               <a:graphicFrameLocks noChangeAspect="1"/>
             </wp:cNvGraphicFramePr>
@@ -11546,7 +10623,7 @@
         <w:drawing>
           <wp:inline xmlns:a="http://schemas.openxmlformats.org/drawingml/2006/main" xmlns:pic="http://schemas.openxmlformats.org/drawingml/2006/picture">
             <wp:extent cx="5577840" cy="2062957"/>
-            <wp:docPr id="11" name="Picture 11"/>
+            <wp:docPr id="9" name="Picture 9"/>
             <wp:cNvGraphicFramePr>
               <a:graphicFrameLocks noChangeAspect="1"/>
             </wp:cNvGraphicFramePr>
@@ -11601,7 +10678,7 @@
         <w:drawing>
           <wp:inline xmlns:a="http://schemas.openxmlformats.org/drawingml/2006/main" xmlns:pic="http://schemas.openxmlformats.org/drawingml/2006/picture">
             <wp:extent cx="5577840" cy="3023149"/>
-            <wp:docPr id="12" name="Picture 12"/>
+            <wp:docPr id="10" name="Picture 10"/>
             <wp:cNvGraphicFramePr>
               <a:graphicFrameLocks noChangeAspect="1"/>
             </wp:cNvGraphicFramePr>
@@ -11723,7 +10800,7 @@
           <w:i w:val="0"/>
           <w:sz w:val="24"/>
         </w:rPr>
-        <w:t>This project designed and built Plant Doctor, a multilingual, voice-enabled, dual-index RAG assistant for agricultural advisory and government-scheme navigation. All six objectives were met: the dual-index architecture isolates the two domains (O1); hybrid dense-plus-sparse retrieval with MMR improves candidate quality (O2); Cross-Encoder reranking reorders the evidence (O3); an adaptive pipeline serves English, Hindi, Telugu and Tamil (O4); Faster-Whisper and Edge-TTS provide voice input and output (O5); and a semantic evaluation framework with latency instrumentation was established (O6). On a reproducible local benchmark, hybrid retrieval reached 75.4% context precision at 100% recall, and the full pipeline answered with 79.2% faithfulness at about 5.59 s per query, with the Direct-LLM baseline confirming that retrieval is what enables grounded answers.</w:t>
+        <w:t>This project designed and built Plant Doctor, a multilingual, voice-enabled, dual-index RAG assistant for agricultural advisory and government-scheme navigation. All six objectives were met: the dual-index architecture isolates the two domains (i); hybrid dense-plus-sparse retrieval with MMR improves candidate quality (ii); Cross-Encoder reranking reorders the evidence (iii); an adaptive pipeline serves English, Hindi, Telugu and Tamil (iv); Faster-Whisper and Edge-TTS provide voice input and output (v); and a semantic evaluation framework with latency instrumentation was established (vi). On a reproducible local benchmark, hybrid retrieval reached 75.4% context precision at 100% recall, and the full pipeline answered with 79.2% faithfulness at about 5.59 s per query, with the Direct-LLM baseline confirming that retrieval is what enables grounded answers.</w:t>
       </w:r>
     </w:p>
     <w:p>
@@ -11780,80 +10857,17 @@
     </w:p>
     <w:p>
       <w:pPr>
-        <w:pStyle w:val="ListBullet"/>
-        <w:spacing w:after="60"/>
+        <w:spacing w:after="120"/>
+        <w:jc w:val="both"/>
       </w:pPr>
       <w:r>
         <w:rPr>
-          <w:rFonts w:ascii="Times New Roman" w:hAnsi="Times New Roman"/>
+          <w:rFonts w:ascii="Times New Roman" w:hAnsi="Times New Roman" w:cs="Times New Roman"/>
+          <w:b w:val="0"/>
+          <w:i w:val="0"/>
           <w:sz w:val="24"/>
         </w:rPr>
-        <w:t>Build a larger, labelled multilingual benchmark and add expert human evaluation by agricultural specialists.</w:t>
-      </w:r>
-    </w:p>
-    <w:p>
-      <w:pPr>
-        <w:pStyle w:val="ListBullet"/>
-        <w:spacing w:after="60"/>
-      </w:pPr>
-      <w:r>
-        <w:rPr>
-          <w:rFonts w:ascii="Times New Roman" w:hAnsi="Times New Roman"/>
-          <w:sz w:val="24"/>
-        </w:rPr>
-        <w:t>Add an explicit cross-domain contamination benchmark comparing single-index and dual-index retrieval under controlled mixed queries.</w:t>
-      </w:r>
-    </w:p>
-    <w:p>
-      <w:pPr>
-        <w:pStyle w:val="ListBullet"/>
-        <w:spacing w:after="60"/>
-      </w:pPr>
-      <w:r>
-        <w:rPr>
-          <w:rFonts w:ascii="Times New Roman" w:hAnsi="Times New Roman"/>
-          <w:sz w:val="24"/>
-        </w:rPr>
-        <w:t>Fine-tune or adopt domain-specific and Indian-language embedding and reranking models.</w:t>
-      </w:r>
-    </w:p>
-    <w:p>
-      <w:pPr>
-        <w:pStyle w:val="ListBullet"/>
-        <w:spacing w:after="60"/>
-      </w:pPr>
-      <w:r>
-        <w:rPr>
-          <w:rFonts w:ascii="Times New Roman" w:hAnsi="Times New Roman"/>
-          <w:sz w:val="24"/>
-        </w:rPr>
-        <w:t>Add retrieval of native-language documents so non-English queries need no translation.</w:t>
-      </w:r>
-    </w:p>
-    <w:p>
-      <w:pPr>
-        <w:pStyle w:val="ListBullet"/>
-        <w:spacing w:after="60"/>
-      </w:pPr>
-      <w:r>
-        <w:rPr>
-          <w:rFonts w:ascii="Times New Roman" w:hAnsi="Times New Roman"/>
-          <w:sz w:val="24"/>
-        </w:rPr>
-        <w:t>Add document-freshness monitoring and automated re-ingestion for government schemes.</w:t>
-      </w:r>
-    </w:p>
-    <w:p>
-      <w:pPr>
-        <w:pStyle w:val="ListBullet"/>
-        <w:spacing w:after="60"/>
-      </w:pPr>
-      <w:r>
-        <w:rPr>
-          <w:rFonts w:ascii="Times New Roman" w:hAnsi="Times New Roman"/>
-          <w:sz w:val="24"/>
-        </w:rPr>
-        <w:t>Optimise for edge/on-device inference and add offline operation for low-connectivity areas.</w:t>
+        <w:t>Several concrete extensions would strengthen the system and are planned as future work. (i) A larger, labelled multilingual benchmark would be built and combined with expert human evaluation by agricultural specialists, so that quality can be judged on a population of questions rather than the small reproducible set used here. (ii) An explicit cross-domain contamination benchmark would compare single-index and dual-index retrieval under controlled mixed queries, giving a direct measurement of the benefit that domain isolation provides. (iii) Domain-specific and Indian-language embedding and reranking models would be fine-tuned or adopted so that retrieval quality improves for agricultural terminology and regional languages. (iv) Retrieval of native-language documents would be added so that non-English queries need no translation step at all. (v) Document-freshness monitoring and automated re-ingestion would be introduced for government schemes, whose rules and benefit amounts change from year to year. (vi) Finally, the system would be optimised for edge and on-device inference and given an offline mode, so that it remains usable in low-connectivity rural areas where it is most needed.</w:t>
       </w:r>
     </w:p>
     <w:p>
@@ -12208,67 +11222,17 @@
     </w:p>
     <w:p>
       <w:pPr>
-        <w:pStyle w:val="ListBullet"/>
-        <w:spacing w:after="60"/>
+        <w:spacing w:after="120"/>
+        <w:jc w:val="both"/>
       </w:pPr>
       <w:r>
         <w:rPr>
-          <w:rFonts w:ascii="Times New Roman" w:hAnsi="Times New Roman"/>
+          <w:rFonts w:ascii="Times New Roman" w:hAnsi="Times New Roman" w:cs="Times New Roman"/>
+          <w:b w:val="0"/>
+          <w:i w:val="0"/>
           <w:sz w:val="24"/>
         </w:rPr>
-        <w:t>Embeddings: BAAI/bge-small-en-v1.5 (384-dim), via sentence-transformers locally or fastembed (ONNX) in the cloud.</w:t>
-      </w:r>
-    </w:p>
-    <w:p>
-      <w:pPr>
-        <w:pStyle w:val="ListBullet"/>
-        <w:spacing w:after="60"/>
-      </w:pPr>
-      <w:r>
-        <w:rPr>
-          <w:rFonts w:ascii="Times New Roman" w:hAnsi="Times New Roman"/>
-          <w:sz w:val="24"/>
-        </w:rPr>
-        <w:t>Reranker: BAAI/bge-reranker-base (Cross-Encoder).</w:t>
-      </w:r>
-    </w:p>
-    <w:p>
-      <w:pPr>
-        <w:pStyle w:val="ListBullet"/>
-        <w:spacing w:after="60"/>
-      </w:pPr>
-      <w:r>
-        <w:rPr>
-          <w:rFonts w:ascii="Times New Roman" w:hAnsi="Times New Roman"/>
-          <w:sz w:val="24"/>
-        </w:rPr>
-        <w:t>LLM: qwen2.5:7b (Ollama, local) / openai/gpt-oss-120b (Groq, cloud).</w:t>
-      </w:r>
-    </w:p>
-    <w:p>
-      <w:pPr>
-        <w:pStyle w:val="ListBullet"/>
-        <w:spacing w:after="60"/>
-      </w:pPr>
-      <w:r>
-        <w:rPr>
-          <w:rFonts w:ascii="Times New Roman" w:hAnsi="Times New Roman"/>
-          <w:sz w:val="24"/>
-        </w:rPr>
-        <w:t>ASR: Faster-Whisper base (int8).  TTS: Edge-TTS neural voices.</w:t>
-      </w:r>
-    </w:p>
-    <w:p>
-      <w:pPr>
-        <w:pStyle w:val="ListBullet"/>
-        <w:spacing w:after="60"/>
-      </w:pPr>
-      <w:r>
-        <w:rPr>
-          <w:rFonts w:ascii="Times New Roman" w:hAnsi="Times New Roman"/>
-          <w:sz w:val="24"/>
-        </w:rPr>
-        <w:t>Indices: FAISS dense index + SQLite metadata per domain (agriculture and schemes), shipped in the repository.</w:t>
+        <w:t>The models and indices used by the system are the following. The embedding model is BAAI/bge-small-en-v1.5, a 384-dimensional sentence embedding served through sentence-transformers locally or through fastembed (ONNX) in the cloud. The reranker is the BAAI/bge-reranker-base Cross-Encoder. The language model is qwen2.5:7b served by Ollama in the local configuration and openai/gpt-oss-120b served by Groq in the cloud configuration. Speech recognition uses Faster-Whisper (base, int8) and speech synthesis uses Edge-TTS neural voices with a gTTS fallback. The retrieval indices are a FAISS dense index together with an SQLite metadata store for each of the two domains, agriculture and government schemes, and both indices are shipped in the repository so that the results can be reproduced without rebuilding them from scratch.</w:t>
       </w:r>
     </w:p>
     <w:p>

</xml_diff>

<commit_message>
Refine report: methodology diagram, Times New Roman diagram fonts, bold titles, TOC front-matter entries, certificate logo, numbered objectives; fix article roll number
</commit_message>
<xml_diff>
--- a/Plant_Doctor_Mini_Project_Report.docx
+++ b/Plant_Doctor_Mini_Project_Report.docx
@@ -369,10 +369,25 @@
         <w:rPr>
           <w:rFonts w:ascii="Times New Roman" w:hAnsi="Times New Roman" w:cs="Times New Roman"/>
           <w:b w:val="0"/>
-          <w:i w:val="0"/>
           <w:sz w:val="24"/>
         </w:rPr>
-        <w:t>We hereby declare that the Mini Project report entitled "Plant Doctor: A Multilingual Voice-Enabled Dual-Index RAG Chatbot for Agricultural Advisory and Government Scheme Assistance", submitted to the Department of Artificial Intelligence, Anurag University, in partial fulfilment of the requirements for the award of the degree of Bachelor of Technology in Artificial Intelligence, is a record of original work carried out by we under the guidance of Mr. G. Victor Daniel, Assistant Professor, Department of Artificial Intelligence. The results embodied in this report have not been submitted to any other university or institute for the award of any degree or diploma. Wherever the work of others, including pretrained models, open source libraries and published papers, has been used, it has been duly acknowledged and cited.</w:t>
+        <w:t>We hereby declare that the Mini Project report entitled "</w:t>
+      </w:r>
+      <w:r>
+        <w:rPr>
+          <w:rFonts w:ascii="Times New Roman" w:hAnsi="Times New Roman" w:cs="Times New Roman"/>
+          <w:b/>
+          <w:sz w:val="24"/>
+        </w:rPr>
+        <w:t>PLANT DOCTOR: A MULTILINGUAL VOICE-ENABLED DUAL-INDEX RAG CHATBOT FOR AGRICULTURAL ADVISORY AND GOVERNMENT SCHEME ASSISTANCE</w:t>
+      </w:r>
+      <w:r>
+        <w:rPr>
+          <w:rFonts w:ascii="Times New Roman" w:hAnsi="Times New Roman" w:cs="Times New Roman"/>
+          <w:b w:val="0"/>
+          <w:sz w:val="24"/>
+        </w:rPr>
+        <w:t>" submitted to the Department of Artificial Intelligence, Anurag University, in partial fulfilment of the requirements for the award of the degree of Bachelor of Technology in Artificial Intelligence, is a record of original work carried out by we under the guidance of Mr. G. Victor Daniel, Assistant Professor, Department of Artificial Intelligence. The results embodied in this report have not been submitted to any other university or institute for the award of any degree or diploma. Wherever the work of others, including pretrained models, open source libraries and published papers, has been used, it has been duly acknowledged and cited.</w:t>
       </w:r>
     </w:p>
     <w:p>
@@ -697,6 +712,59 @@
     </w:p>
     <w:p>
       <w:pPr>
+        <w:spacing w:after="160"/>
+        <w:jc w:val="center"/>
+      </w:pPr>
+      <w:r>
+        <w:drawing>
+          <wp:inline xmlns:a="http://schemas.openxmlformats.org/drawingml/2006/main" xmlns:pic="http://schemas.openxmlformats.org/drawingml/2006/picture">
+            <wp:extent cx="3931920" cy="666580"/>
+            <wp:docPr id="2" name="Picture 2"/>
+            <wp:cNvGraphicFramePr>
+              <a:graphicFrameLocks noChangeAspect="1"/>
+            </wp:cNvGraphicFramePr>
+            <a:graphic>
+              <a:graphicData uri="http://schemas.openxmlformats.org/drawingml/2006/picture">
+                <pic:pic>
+                  <pic:nvPicPr>
+                    <pic:cNvPr id="0" name="header_logo.png"/>
+                    <pic:cNvPicPr/>
+                  </pic:nvPicPr>
+                  <pic:blipFill>
+                    <a:blip r:embed="rId10"/>
+                    <a:stretch>
+                      <a:fillRect/>
+                    </a:stretch>
+                  </pic:blipFill>
+                  <pic:spPr>
+                    <a:xfrm>
+                      <a:off x="0" y="0"/>
+                      <a:ext cx="3931920" cy="666580"/>
+                    </a:xfrm>
+                    <a:prstGeom prst="rect"/>
+                  </pic:spPr>
+                </pic:pic>
+              </a:graphicData>
+            </a:graphic>
+          </wp:inline>
+        </w:drawing>
+      </w:r>
+    </w:p>
+    <w:p>
+      <w:pPr>
+        <w:spacing w:after="200"/>
+      </w:pPr>
+      <w:r>
+        <w:rPr>
+          <w:rFonts w:ascii="Times New Roman" w:hAnsi="Times New Roman" w:cs="Times New Roman"/>
+          <w:b w:val="0"/>
+          <w:i w:val="0"/>
+          <w:sz w:val="24"/>
+        </w:rPr>
+      </w:r>
+    </w:p>
+    <w:p>
+      <w:pPr>
         <w:spacing w:after="280"/>
         <w:jc w:val="center"/>
       </w:pPr>
@@ -719,10 +787,25 @@
         <w:rPr>
           <w:rFonts w:ascii="Times New Roman" w:hAnsi="Times New Roman" w:cs="Times New Roman"/>
           <w:b w:val="0"/>
-          <w:i w:val="0"/>
           <w:sz w:val="24"/>
         </w:rPr>
-        <w:t>This is to certify that the Mini Project report entitled "Plant Doctor: A Multilingual Voice-Enabled Dual-Index RAG Chatbot for Agricultural Advisory and Government Scheme Assistance" is a bonafide record of the work carried out by Chunku Raja Venkata Praney Teja (23EG106C10), Prasadam Lakshmi Narasimha (23EG106C49), Konda Mukesh (23EG106C31) in partial fulfilment of the requirements for the award of the degree of Bachelor of Technology in Artificial Intelligence during the academic year 2026 to 2027. The work embodied in this report has not been submitted to any other university or institute for the award of any degree or diploma.</w:t>
+        <w:t>This is to certify that the Mini Project report entitled "</w:t>
+      </w:r>
+      <w:r>
+        <w:rPr>
+          <w:rFonts w:ascii="Times New Roman" w:hAnsi="Times New Roman" w:cs="Times New Roman"/>
+          <w:b/>
+          <w:sz w:val="24"/>
+        </w:rPr>
+        <w:t>PLANT DOCTOR: A MULTILINGUAL VOICE-ENABLED DUAL-INDEX RAG CHATBOT FOR AGRICULTURAL ADVISORY AND GOVERNMENT SCHEME ASSISTANCE</w:t>
+      </w:r>
+      <w:r>
+        <w:rPr>
+          <w:rFonts w:ascii="Times New Roman" w:hAnsi="Times New Roman" w:cs="Times New Roman"/>
+          <w:b w:val="0"/>
+          <w:sz w:val="24"/>
+        </w:rPr>
+        <w:t>" is a bonafide record of the work carried out by Chunku Raja Venkata Praney Teja (23EG106C10), Prasadam Lakshmi Narasimha (23EG106C49), Konda Mukesh (23EG106C31) in partial fulfilment of the requirements for the award of the degree of Bachelor of Technology in Artificial Intelligence during the academic year 2026 to 2027. The work embodied in this report has not been submitted to any other university or institute for the award of any degree or diploma.</w:t>
       </w:r>
     </w:p>
     <w:p>
@@ -1019,7 +1102,7 @@
     <w:p>
       <w:pPr>
         <w:sectPr>
-          <w:footerReference w:type="default" r:id="rId11"/>
+          <w:footerReference w:type="default" r:id="rId12"/>
           <w:pgSz w:w="11909" w:h="16834"/>
           <w:pgMar w:top="1440" w:right="1440" w:bottom="1440" w:left="2160" w:header="720" w:footer="720" w:gutter="0"/>
           <w:cols w:space="720"/>
@@ -1134,6 +1217,74 @@
           <w:sz w:val="32"/>
         </w:rPr>
         <w:t>TABLE OF CONTENTS</w:t>
+      </w:r>
+    </w:p>
+    <w:p>
+      <w:pPr>
+        <w:tabs>
+          <w:tab w:pos="8309" w:val="right" w:leader="dot"/>
+        </w:tabs>
+        <w:spacing w:after="80" w:line="240" w:lineRule="auto"/>
+      </w:pPr>
+      <w:r>
+        <w:rPr>
+          <w:rFonts w:ascii="Times New Roman" w:hAnsi="Times New Roman" w:cs="Times New Roman"/>
+          <w:sz w:val="24"/>
+        </w:rPr>
+        <w:t>Abstract</w:t>
+        <w:tab/>
+        <w:t>i</w:t>
+      </w:r>
+    </w:p>
+    <w:p>
+      <w:pPr>
+        <w:tabs>
+          <w:tab w:pos="8309" w:val="right" w:leader="dot"/>
+        </w:tabs>
+        <w:spacing w:after="80" w:line="240" w:lineRule="auto"/>
+      </w:pPr>
+      <w:r>
+        <w:rPr>
+          <w:rFonts w:ascii="Times New Roman" w:hAnsi="Times New Roman" w:cs="Times New Roman"/>
+          <w:sz w:val="24"/>
+        </w:rPr>
+        <w:t>List of Figures</w:t>
+        <w:tab/>
+        <w:t>v</w:t>
+      </w:r>
+    </w:p>
+    <w:p>
+      <w:pPr>
+        <w:tabs>
+          <w:tab w:pos="8309" w:val="right" w:leader="dot"/>
+        </w:tabs>
+        <w:spacing w:after="80" w:line="240" w:lineRule="auto"/>
+      </w:pPr>
+      <w:r>
+        <w:rPr>
+          <w:rFonts w:ascii="Times New Roman" w:hAnsi="Times New Roman" w:cs="Times New Roman"/>
+          <w:sz w:val="24"/>
+        </w:rPr>
+        <w:t>List of Tables</w:t>
+        <w:tab/>
+        <w:t>vi</w:t>
+      </w:r>
+    </w:p>
+    <w:p>
+      <w:pPr>
+        <w:tabs>
+          <w:tab w:pos="8309" w:val="right" w:leader="dot"/>
+        </w:tabs>
+        <w:spacing w:after="80" w:line="240" w:lineRule="auto"/>
+      </w:pPr>
+      <w:r>
+        <w:rPr>
+          <w:rFonts w:ascii="Times New Roman" w:hAnsi="Times New Roman" w:cs="Times New Roman"/>
+          <w:sz w:val="24"/>
+        </w:rPr>
+        <w:t>List of Abbreviations</w:t>
+        <w:tab/>
+        <w:t>vii</w:t>
       </w:r>
     </w:p>
     <w:p>
@@ -1434,6 +1585,65 @@
                 <w:rFonts w:ascii="Times New Roman" w:hAnsi="Times New Roman"/>
                 <w:sz w:val="22"/>
               </w:rPr>
+              <w:t>4.3</w:t>
+            </w:r>
+          </w:p>
+        </w:tc>
+        <w:tc>
+          <w:tcPr>
+            <w:tcW w:type="dxa" w:w="6480"/>
+          </w:tcPr>
+          <w:p>
+            <w:pPr>
+              <w:jc w:val="left"/>
+            </w:pPr>
+            <w:r/>
+            <w:r>
+              <w:rPr>
+                <w:rFonts w:ascii="Times New Roman" w:hAnsi="Times New Roman"/>
+                <w:sz w:val="22"/>
+              </w:rPr>
+              <w:t>Retrieval and Ranking Methodology</w:t>
+            </w:r>
+          </w:p>
+        </w:tc>
+        <w:tc>
+          <w:tcPr>
+            <w:tcW w:type="dxa" w:w="1296"/>
+          </w:tcPr>
+          <w:p>
+            <w:pPr>
+              <w:jc w:val="left"/>
+            </w:pPr>
+            <w:r/>
+            <w:r>
+              <w:rPr>
+                <w:rFonts w:ascii="Times New Roman" w:hAnsi="Times New Roman"/>
+                <w:sz w:val="22"/>
+              </w:rPr>
+              <w:t>20</w:t>
+            </w:r>
+          </w:p>
+        </w:tc>
+      </w:tr>
+      <w:tr>
+        <w:trPr>
+          <w:cantSplit/>
+        </w:trPr>
+        <w:tc>
+          <w:tcPr>
+            <w:tcW w:type="dxa" w:w="1296"/>
+          </w:tcPr>
+          <w:p>
+            <w:pPr>
+              <w:jc w:val="left"/>
+            </w:pPr>
+            <w:r/>
+            <w:r>
+              <w:rPr>
+                <w:rFonts w:ascii="Times New Roman" w:hAnsi="Times New Roman"/>
+                <w:sz w:val="22"/>
+              </w:rPr>
               <w:t>6.1</w:t>
             </w:r>
           </w:p>
@@ -1470,7 +1680,7 @@
                 <w:rFonts w:ascii="Times New Roman" w:hAnsi="Times New Roman"/>
                 <w:sz w:val="22"/>
               </w:rPr>
-              <w:t>31</w:t>
+              <w:t>32</w:t>
             </w:r>
           </w:p>
         </w:tc>
@@ -1529,7 +1739,7 @@
                 <w:rFonts w:ascii="Times New Roman" w:hAnsi="Times New Roman"/>
                 <w:sz w:val="22"/>
               </w:rPr>
-              <w:t>32</w:t>
+              <w:t>33</w:t>
             </w:r>
           </w:p>
         </w:tc>
@@ -1588,7 +1798,7 @@
                 <w:rFonts w:ascii="Times New Roman" w:hAnsi="Times New Roman"/>
                 <w:sz w:val="22"/>
               </w:rPr>
-              <w:t>33</w:t>
+              <w:t>34</w:t>
             </w:r>
           </w:p>
         </w:tc>
@@ -1647,7 +1857,7 @@
                 <w:rFonts w:ascii="Times New Roman" w:hAnsi="Times New Roman"/>
                 <w:sz w:val="22"/>
               </w:rPr>
-              <w:t>36</w:t>
+              <w:t>37</w:t>
             </w:r>
           </w:p>
         </w:tc>
@@ -1706,7 +1916,7 @@
                 <w:rFonts w:ascii="Times New Roman" w:hAnsi="Times New Roman"/>
                 <w:sz w:val="22"/>
               </w:rPr>
-              <w:t>36</w:t>
+              <w:t>37</w:t>
             </w:r>
           </w:p>
         </w:tc>
@@ -1765,7 +1975,7 @@
                 <w:rFonts w:ascii="Times New Roman" w:hAnsi="Times New Roman"/>
                 <w:sz w:val="22"/>
               </w:rPr>
-              <w:t>37</w:t>
+              <w:t>38</w:t>
             </w:r>
           </w:p>
         </w:tc>
@@ -2165,7 +2375,7 @@
                 <w:rFonts w:ascii="Times New Roman" w:hAnsi="Times New Roman"/>
                 <w:sz w:val="22"/>
               </w:rPr>
-              <w:t>25</w:t>
+              <w:t>26</w:t>
             </w:r>
           </w:p>
         </w:tc>
@@ -2224,7 +2434,7 @@
                 <w:rFonts w:ascii="Times New Roman" w:hAnsi="Times New Roman"/>
                 <w:sz w:val="22"/>
               </w:rPr>
-              <w:t>29</w:t>
+              <w:t>30</w:t>
             </w:r>
           </w:p>
         </w:tc>
@@ -2283,7 +2493,7 @@
                 <w:rFonts w:ascii="Times New Roman" w:hAnsi="Times New Roman"/>
                 <w:sz w:val="22"/>
               </w:rPr>
-              <w:t>31</w:t>
+              <w:t>32</w:t>
             </w:r>
           </w:p>
         </w:tc>
@@ -2342,7 +2552,7 @@
                 <w:rFonts w:ascii="Times New Roman" w:hAnsi="Times New Roman"/>
                 <w:sz w:val="22"/>
               </w:rPr>
-              <w:t>32</w:t>
+              <w:t>33</w:t>
             </w:r>
           </w:p>
         </w:tc>
@@ -3266,7 +3476,7 @@
     <w:p>
       <w:pPr>
         <w:sectPr>
-          <w:footerReference w:type="default" r:id="rId10"/>
+          <w:footerReference w:type="default" r:id="rId11"/>
           <w:pgSz w:w="11909" w:h="16834"/>
           <w:pgMar w:top="1440" w:right="1440" w:bottom="1440" w:left="2160" w:header="720" w:footer="720" w:gutter="0"/>
           <w:cols w:space="720"/>
@@ -3352,7 +3562,7 @@
         <w:drawing>
           <wp:inline xmlns:a="http://schemas.openxmlformats.org/drawingml/2006/main" xmlns:pic="http://schemas.openxmlformats.org/drawingml/2006/picture">
             <wp:extent cx="4937760" cy="3546842"/>
-            <wp:docPr id="2" name="Picture 2"/>
+            <wp:docPr id="3" name="Picture 3"/>
             <wp:cNvGraphicFramePr>
               <a:graphicFrameLocks noChangeAspect="1"/>
             </wp:cNvGraphicFramePr>
@@ -3364,7 +3574,7 @@
                     <pic:cNvPicPr/>
                   </pic:nvPicPr>
                   <pic:blipFill>
-                    <a:blip r:embed="rId13"/>
+                    <a:blip r:embed="rId14"/>
                     <a:stretch>
                       <a:fillRect/>
                     </a:stretch>
@@ -3548,7 +3758,85 @@
           <w:i w:val="0"/>
           <w:sz w:val="24"/>
         </w:rPr>
-        <w:t>The objectives of this project are framed as concrete, verifiable goals, each of which is mapped to a specific method in Chapter 4 and to a measured outcome in Chapter 6, so that the work can be judged against what it set out to do. The project set out to achieve the following goals. (i) To construct a domain-isolated dual-index retrieval-augmented generation architecture that keeps agricultural advisory knowledge and government-scheme knowledge in separate indices, so that a query is answered only from its own domain and the two bodies of knowledge cannot contaminate each other. (ii) To develop a hybrid retrieval mechanism that combines dense semantic search with sparse BM25 keyword search, and to fuse and diversify their results so that both the meaning of a question and its exact terms contribute to the passages that are retrieved. (iii) To apply cross-encoder reranking that reads each query and candidate passage jointly and improves the ordering of the retrieved evidence before it is passed to the language model. (iv) To support English, Hindi, Telugu and Tamil through adaptive multilingual query processing, so that a farmer can ask a question and receive an answer in a familiar language. (v) To provide voice input through speech recognition and voice output through speech synthesis, so that the service is usable by a person who prefers speaking to typing. (vi) To establish an evaluation framework that measures faithfulness, context precision, context recall, answer relevance and system latency, so that the contribution of each component can be reported honestly against reproducible numbers rather than a single headline figure.</w:t>
+        <w:t>The objectives of this project follow directly from the problem statement. They cover the way the knowledge base is prepared, the way evidence is retrieved, the way answers are generated and translated, and the way the whole system is evaluated. Each objective is mapped to a concrete method in Chapter 4 (Table 4.2) and assessed against a measured outcome in Chapter 6. The six research objectives are stated below.</w:t>
+      </w:r>
+    </w:p>
+    <w:p>
+      <w:pPr>
+        <w:pStyle w:val="ListNumber"/>
+        <w:spacing w:after="60"/>
+      </w:pPr>
+      <w:r>
+        <w:rPr>
+          <w:rFonts w:ascii="Times New Roman" w:hAnsi="Times New Roman"/>
+          <w:sz w:val="24"/>
+        </w:rPr>
+        <w:t>To construct a domain-isolated dual-index retrieval-augmented generation architecture that keeps agricultural advisory knowledge and government-scheme knowledge in separate indices, so that a query is answered only from its own domain.</w:t>
+      </w:r>
+    </w:p>
+    <w:p>
+      <w:pPr>
+        <w:pStyle w:val="ListNumber"/>
+        <w:spacing w:after="60"/>
+      </w:pPr>
+      <w:r>
+        <w:rPr>
+          <w:rFonts w:ascii="Times New Roman" w:hAnsi="Times New Roman"/>
+          <w:sz w:val="24"/>
+        </w:rPr>
+        <w:t>To develop a hybrid retrieval mechanism that combines dense semantic search with sparse BM25 keyword search, fused and diversified with Maximal Marginal Relevance.</w:t>
+      </w:r>
+    </w:p>
+    <w:p>
+      <w:pPr>
+        <w:pStyle w:val="ListNumber"/>
+        <w:spacing w:after="60"/>
+      </w:pPr>
+      <w:r>
+        <w:rPr>
+          <w:rFonts w:ascii="Times New Roman" w:hAnsi="Times New Roman"/>
+          <w:sz w:val="24"/>
+        </w:rPr>
+        <w:t>To apply cross-encoder reranking that reads each query and candidate passage jointly and improves the ordering of the retrieved evidence before generation.</w:t>
+      </w:r>
+    </w:p>
+    <w:p>
+      <w:pPr>
+        <w:pStyle w:val="ListNumber"/>
+        <w:spacing w:after="60"/>
+      </w:pPr>
+      <w:r>
+        <w:rPr>
+          <w:rFonts w:ascii="Times New Roman" w:hAnsi="Times New Roman"/>
+          <w:sz w:val="24"/>
+        </w:rPr>
+        <w:t>To support English, Hindi, Telugu and Tamil through adaptive multilingual query processing, so that a farmer can ask and receive answers in a familiar language.</w:t>
+      </w:r>
+    </w:p>
+    <w:p>
+      <w:pPr>
+        <w:pStyle w:val="ListNumber"/>
+        <w:spacing w:after="60"/>
+      </w:pPr>
+      <w:r>
+        <w:rPr>
+          <w:rFonts w:ascii="Times New Roman" w:hAnsi="Times New Roman"/>
+          <w:sz w:val="24"/>
+        </w:rPr>
+        <w:t>To provide voice input through speech recognition and voice output through speech synthesis, so that the service is usable by a person who prefers speaking to typing.</w:t>
+      </w:r>
+    </w:p>
+    <w:p>
+      <w:pPr>
+        <w:pStyle w:val="ListNumber"/>
+        <w:spacing w:after="60"/>
+      </w:pPr>
+      <w:r>
+        <w:rPr>
+          <w:rFonts w:ascii="Times New Roman" w:hAnsi="Times New Roman"/>
+          <w:sz w:val="24"/>
+        </w:rPr>
+        <w:t>To establish an evaluation framework that measures faithfulness, context precision, context recall, answer relevance and system latency against reproducible numbers.</w:t>
       </w:r>
     </w:p>
     <w:p>
@@ -5537,7 +5825,7 @@
         <w:drawing>
           <wp:inline xmlns:a="http://schemas.openxmlformats.org/drawingml/2006/main" xmlns:pic="http://schemas.openxmlformats.org/drawingml/2006/picture">
             <wp:extent cx="5669280" cy="3184115"/>
-            <wp:docPr id="3" name="Picture 3"/>
+            <wp:docPr id="4" name="Picture 4"/>
             <wp:cNvGraphicFramePr>
               <a:graphicFrameLocks noChangeAspect="1"/>
             </wp:cNvGraphicFramePr>
@@ -5549,7 +5837,7 @@
                     <pic:cNvPicPr/>
                   </pic:nvPicPr>
                   <pic:blipFill>
-                    <a:blip r:embed="rId14"/>
+                    <a:blip r:embed="rId15"/>
                     <a:stretch>
                       <a:fillRect/>
                     </a:stretch>
@@ -5606,8 +5894,8 @@
       <w:r>
         <w:drawing>
           <wp:inline xmlns:a="http://schemas.openxmlformats.org/drawingml/2006/main" xmlns:pic="http://schemas.openxmlformats.org/drawingml/2006/picture">
-            <wp:extent cx="4754880" cy="2906588"/>
-            <wp:docPr id="4" name="Picture 4"/>
+            <wp:extent cx="4754880" cy="2767766"/>
+            <wp:docPr id="5" name="Picture 5"/>
             <wp:cNvGraphicFramePr>
               <a:graphicFrameLocks noChangeAspect="1"/>
             </wp:cNvGraphicFramePr>
@@ -5619,7 +5907,7 @@
                     <pic:cNvPicPr/>
                   </pic:nvPicPr>
                   <pic:blipFill>
-                    <a:blip r:embed="rId15"/>
+                    <a:blip r:embed="rId16"/>
                     <a:stretch>
                       <a:fillRect/>
                     </a:stretch>
@@ -5627,7 +5915,7 @@
                   <pic:spPr>
                     <a:xfrm>
                       <a:off x="0" y="0"/>
-                      <a:ext cx="4754880" cy="2906588"/>
+                      <a:ext cx="4754880" cy="2767766"/>
                     </a:xfrm>
                     <a:prstGeom prst="rect"/>
                   </pic:spPr>
@@ -6420,7 +6708,62 @@
           <w:i w:val="0"/>
           <w:sz w:val="24"/>
         </w:rPr>
-        <w:t>The retrieval and ranking methodology is defined by the following equations.</w:t>
+        <w:t>The retrieval and ranking methodology is defined by the following equations, whose overall flow is shown in Fig. 4.3. A user query is searched in parallel by dense and sparse retrieval; the two score lists are fused, diversified with Maximal Marginal Relevance and reordered by a Cross-Encoder; and the top-ranked passages become the grounded context from which the language model produces the final answer.</w:t>
+      </w:r>
+    </w:p>
+    <w:p>
+      <w:pPr>
+        <w:keepNext/>
+        <w:jc w:val="center"/>
+      </w:pPr>
+      <w:r>
+        <w:drawing>
+          <wp:inline xmlns:a="http://schemas.openxmlformats.org/drawingml/2006/main" xmlns:pic="http://schemas.openxmlformats.org/drawingml/2006/picture">
+            <wp:extent cx="4206240" cy="3817972"/>
+            <wp:docPr id="6" name="Picture 6"/>
+            <wp:cNvGraphicFramePr>
+              <a:graphicFrameLocks noChangeAspect="1"/>
+            </wp:cNvGraphicFramePr>
+            <a:graphic>
+              <a:graphicData uri="http://schemas.openxmlformats.org/drawingml/2006/picture">
+                <pic:pic>
+                  <pic:nvPicPr>
+                    <pic:cNvPr id="0" name="fig_methodology.png"/>
+                    <pic:cNvPicPr/>
+                  </pic:nvPicPr>
+                  <pic:blipFill>
+                    <a:blip r:embed="rId17"/>
+                    <a:stretch>
+                      <a:fillRect/>
+                    </a:stretch>
+                  </pic:blipFill>
+                  <pic:spPr>
+                    <a:xfrm>
+                      <a:off x="0" y="0"/>
+                      <a:ext cx="4206240" cy="3817972"/>
+                    </a:xfrm>
+                    <a:prstGeom prst="rect"/>
+                  </pic:spPr>
+                </pic:pic>
+              </a:graphicData>
+            </a:graphic>
+          </wp:inline>
+        </w:drawing>
+      </w:r>
+    </w:p>
+    <w:p>
+      <w:pPr>
+        <w:spacing w:after="200"/>
+        <w:jc w:val="center"/>
+      </w:pPr>
+      <w:r>
+        <w:rPr>
+          <w:rFonts w:ascii="Times New Roman" w:hAnsi="Times New Roman" w:cs="Times New Roman"/>
+          <w:b w:val="0"/>
+          <w:i w:val="0"/>
+          <w:sz w:val="22"/>
+        </w:rPr>
+        <w:t>Fig. 4.3  Retrieval and ranking methodology, from the query to the grounded answer.</w:t>
       </w:r>
     </w:p>
     <w:p>
@@ -7188,7 +7531,7 @@
                 <w:rFonts w:ascii="Times New Roman" w:hAnsi="Times New Roman"/>
                 <w:sz w:val="22"/>
               </w:rPr>
-              <w:t>(i)</w:t>
+              <w:t>1</w:t>
             </w:r>
           </w:p>
         </w:tc>
@@ -7247,7 +7590,7 @@
                 <w:rFonts w:ascii="Times New Roman" w:hAnsi="Times New Roman"/>
                 <w:sz w:val="22"/>
               </w:rPr>
-              <w:t>(ii)</w:t>
+              <w:t>2</w:t>
             </w:r>
           </w:p>
         </w:tc>
@@ -7306,7 +7649,7 @@
                 <w:rFonts w:ascii="Times New Roman" w:hAnsi="Times New Roman"/>
                 <w:sz w:val="22"/>
               </w:rPr>
-              <w:t>(iii)</w:t>
+              <w:t>3</w:t>
             </w:r>
           </w:p>
         </w:tc>
@@ -7365,7 +7708,7 @@
                 <w:rFonts w:ascii="Times New Roman" w:hAnsi="Times New Roman"/>
                 <w:sz w:val="22"/>
               </w:rPr>
-              <w:t>(iv)</w:t>
+              <w:t>4</w:t>
             </w:r>
           </w:p>
         </w:tc>
@@ -7424,7 +7767,7 @@
                 <w:rFonts w:ascii="Times New Roman" w:hAnsi="Times New Roman"/>
                 <w:sz w:val="22"/>
               </w:rPr>
-              <w:t>(v)</w:t>
+              <w:t>5</w:t>
             </w:r>
           </w:p>
         </w:tc>
@@ -7483,7 +7826,7 @@
                 <w:rFonts w:ascii="Times New Roman" w:hAnsi="Times New Roman"/>
                 <w:sz w:val="22"/>
               </w:rPr>
-              <w:t>(vi)</w:t>
+              <w:t>6</w:t>
             </w:r>
           </w:p>
         </w:tc>
@@ -9937,8 +10280,8 @@
       <w:r>
         <w:drawing>
           <wp:inline xmlns:a="http://schemas.openxmlformats.org/drawingml/2006/main" xmlns:pic="http://schemas.openxmlformats.org/drawingml/2006/picture">
-            <wp:extent cx="5120640" cy="2738886"/>
-            <wp:docPr id="5" name="Picture 5"/>
+            <wp:extent cx="5120640" cy="2733990"/>
+            <wp:docPr id="7" name="Picture 7"/>
             <wp:cNvGraphicFramePr>
               <a:graphicFrameLocks noChangeAspect="1"/>
             </wp:cNvGraphicFramePr>
@@ -9950,7 +10293,7 @@
                     <pic:cNvPicPr/>
                   </pic:nvPicPr>
                   <pic:blipFill>
-                    <a:blip r:embed="rId16"/>
+                    <a:blip r:embed="rId18"/>
                     <a:stretch>
                       <a:fillRect/>
                     </a:stretch>
@@ -9958,7 +10301,7 @@
                   <pic:spPr>
                     <a:xfrm>
                       <a:off x="0" y="0"/>
-                      <a:ext cx="5120640" cy="2738886"/>
+                      <a:ext cx="5120640" cy="2733990"/>
                     </a:xfrm>
                     <a:prstGeom prst="rect"/>
                   </pic:spPr>
@@ -10293,8 +10636,8 @@
       <w:r>
         <w:drawing>
           <wp:inline xmlns:a="http://schemas.openxmlformats.org/drawingml/2006/main" xmlns:pic="http://schemas.openxmlformats.org/drawingml/2006/picture">
-            <wp:extent cx="4206240" cy="2521195"/>
-            <wp:docPr id="6" name="Picture 6"/>
+            <wp:extent cx="4206240" cy="2514544"/>
+            <wp:docPr id="8" name="Picture 8"/>
             <wp:cNvGraphicFramePr>
               <a:graphicFrameLocks noChangeAspect="1"/>
             </wp:cNvGraphicFramePr>
@@ -10306,7 +10649,7 @@
                     <pic:cNvPicPr/>
                   </pic:nvPicPr>
                   <pic:blipFill>
-                    <a:blip r:embed="rId17"/>
+                    <a:blip r:embed="rId19"/>
                     <a:stretch>
                       <a:fillRect/>
                     </a:stretch>
@@ -10314,7 +10657,7 @@
                   <pic:spPr>
                     <a:xfrm>
                       <a:off x="0" y="0"/>
-                      <a:ext cx="4206240" cy="2521195"/>
+                      <a:ext cx="4206240" cy="2514544"/>
                     </a:xfrm>
                     <a:prstGeom prst="rect"/>
                   </pic:spPr>
@@ -10363,8 +10706,8 @@
       <w:r>
         <w:drawing>
           <wp:inline xmlns:a="http://schemas.openxmlformats.org/drawingml/2006/main" xmlns:pic="http://schemas.openxmlformats.org/drawingml/2006/picture">
-            <wp:extent cx="4572000" cy="2658913"/>
-            <wp:docPr id="7" name="Picture 7"/>
+            <wp:extent cx="4572000" cy="2658204"/>
+            <wp:docPr id="9" name="Picture 9"/>
             <wp:cNvGraphicFramePr>
               <a:graphicFrameLocks noChangeAspect="1"/>
             </wp:cNvGraphicFramePr>
@@ -10376,7 +10719,7 @@
                     <pic:cNvPicPr/>
                   </pic:nvPicPr>
                   <pic:blipFill>
-                    <a:blip r:embed="rId18"/>
+                    <a:blip r:embed="rId20"/>
                     <a:stretch>
                       <a:fillRect/>
                     </a:stretch>
@@ -10384,7 +10727,7 @@
                   <pic:spPr>
                     <a:xfrm>
                       <a:off x="0" y="0"/>
-                      <a:ext cx="4572000" cy="2658913"/>
+                      <a:ext cx="4572000" cy="2658204"/>
                     </a:xfrm>
                     <a:prstGeom prst="rect"/>
                   </pic:spPr>
@@ -10568,7 +10911,7 @@
         <w:drawing>
           <wp:inline xmlns:a="http://schemas.openxmlformats.org/drawingml/2006/main" xmlns:pic="http://schemas.openxmlformats.org/drawingml/2006/picture">
             <wp:extent cx="5577840" cy="3485786"/>
-            <wp:docPr id="8" name="Picture 8"/>
+            <wp:docPr id="10" name="Picture 10"/>
             <wp:cNvGraphicFramePr>
               <a:graphicFrameLocks noChangeAspect="1"/>
             </wp:cNvGraphicFramePr>
@@ -10580,7 +10923,7 @@
                     <pic:cNvPicPr/>
                   </pic:nvPicPr>
                   <pic:blipFill>
-                    <a:blip r:embed="rId19"/>
+                    <a:blip r:embed="rId21"/>
                     <a:stretch>
                       <a:fillRect/>
                     </a:stretch>
@@ -10623,7 +10966,7 @@
         <w:drawing>
           <wp:inline xmlns:a="http://schemas.openxmlformats.org/drawingml/2006/main" xmlns:pic="http://schemas.openxmlformats.org/drawingml/2006/picture">
             <wp:extent cx="5577840" cy="2062957"/>
-            <wp:docPr id="9" name="Picture 9"/>
+            <wp:docPr id="11" name="Picture 11"/>
             <wp:cNvGraphicFramePr>
               <a:graphicFrameLocks noChangeAspect="1"/>
             </wp:cNvGraphicFramePr>
@@ -10635,7 +10978,7 @@
                     <pic:cNvPicPr/>
                   </pic:nvPicPr>
                   <pic:blipFill>
-                    <a:blip r:embed="rId20"/>
+                    <a:blip r:embed="rId22"/>
                     <a:stretch>
                       <a:fillRect/>
                     </a:stretch>
@@ -10678,7 +11021,7 @@
         <w:drawing>
           <wp:inline xmlns:a="http://schemas.openxmlformats.org/drawingml/2006/main" xmlns:pic="http://schemas.openxmlformats.org/drawingml/2006/picture">
             <wp:extent cx="5577840" cy="3023149"/>
-            <wp:docPr id="10" name="Picture 10"/>
+            <wp:docPr id="12" name="Picture 12"/>
             <wp:cNvGraphicFramePr>
               <a:graphicFrameLocks noChangeAspect="1"/>
             </wp:cNvGraphicFramePr>
@@ -10690,7 +11033,7 @@
                     <pic:cNvPicPr/>
                   </pic:nvPicPr>
                   <pic:blipFill>
-                    <a:blip r:embed="rId21"/>
+                    <a:blip r:embed="rId23"/>
                     <a:stretch>
                       <a:fillRect/>
                     </a:stretch>
@@ -10800,7 +11143,7 @@
           <w:i w:val="0"/>
           <w:sz w:val="24"/>
         </w:rPr>
-        <w:t>This project designed and built Plant Doctor, a multilingual, voice-enabled, dual-index RAG assistant for agricultural advisory and government-scheme navigation. All six objectives were met: the dual-index architecture isolates the two domains (i); hybrid dense-plus-sparse retrieval with MMR improves candidate quality (ii); Cross-Encoder reranking reorders the evidence (iii); an adaptive pipeline serves English, Hindi, Telugu and Tamil (iv); Faster-Whisper and Edge-TTS provide voice input and output (v); and a semantic evaluation framework with latency instrumentation was established (vi). On a reproducible local benchmark, hybrid retrieval reached 75.4% context precision at 100% recall, and the full pipeline answered with 79.2% faithfulness at about 5.59 s per query, with the Direct-LLM baseline confirming that retrieval is what enables grounded answers.</w:t>
+        <w:t>This project designed and built Plant Doctor, a multilingual, voice-enabled, dual-index RAG assistant for agricultural advisory and government-scheme navigation. All six objectives were met: the dual-index architecture isolates the two domains (Objective 1); hybrid dense-plus-sparse retrieval with MMR improves candidate quality (Objective 2); Cross-Encoder reranking reorders the evidence (Objective 3); an adaptive pipeline serves English, Hindi, Telugu and Tamil (Objective 4); Faster-Whisper and Edge-TTS provide voice input and output (Objective 5); and a semantic evaluation framework with latency instrumentation was established (Objective 6). On a reproducible local benchmark, hybrid retrieval reached 75.4% context precision at 100% recall, and the full pipeline answered with 79.2% faithfulness at about 5.59 s per query, with the Direct-LLM baseline confirming that retrieval is what enables grounded answers.</w:t>
       </w:r>
     </w:p>
     <w:p>
@@ -11395,7 +11738,7 @@
       </w:r>
     </w:p>
     <w:sectPr>
-      <w:footerReference w:type="default" r:id="rId12"/>
+      <w:footerReference w:type="default" r:id="rId13"/>
       <w:pgSz w:w="11909" w:h="16834"/>
       <w:pgMar w:top="1440" w:right="1440" w:bottom="1440" w:left="2160" w:header="720" w:footer="720" w:gutter="0"/>
       <w:cols w:space="720"/>

</xml_diff>

<commit_message>
Make Fig 1.1 flow arrows visible
Widen the vertical gaps between the architecture layer boxes and draw a
full arrow across each gap so the layered diagram reads as a flow chart.
</commit_message>
<xml_diff>
--- a/Plant_Doctor_Mini_Project_Report.docx
+++ b/Plant_Doctor_Mini_Project_Report.docx
@@ -179,7 +179,7 @@
           <w:noProof/>
         </w:rPr>
         <w:drawing>
-          <wp:inline distT="0" distB="0" distL="0" distR="0" wp14:anchorId="24AEE34B" wp14:editId="64526FBD">
+          <wp:inline distT="0" distB="0" distL="0" distR="0" wp14:anchorId="078AB68A" wp14:editId="6F898E97">
             <wp:extent cx="1371600" cy="1484644"/>
             <wp:effectExtent l="0" t="0" r="0" b="0"/>
             <wp:docPr id="1" name="Picture 1"/>
@@ -562,7 +562,7 @@
         </w:rPr>
         <w:lastRenderedPageBreak/>
         <w:drawing>
-          <wp:inline distT="0" distB="0" distL="0" distR="0" wp14:anchorId="4995880A" wp14:editId="0890D46F">
+          <wp:inline distT="0" distB="0" distL="0" distR="0" wp14:anchorId="0B303B7B" wp14:editId="5466A4A4">
             <wp:extent cx="3931920" cy="666580"/>
             <wp:effectExtent l="0" t="0" r="0" b="0"/>
             <wp:docPr id="2" name="Picture 2"/>
@@ -1143,7 +1143,7 @@
           <w:webHidden/>
         </w:rPr>
         <w:tab/>
-        <w:t>4</w:t>
+        <w:t>5</w:t>
       </w:r>
     </w:p>
     <w:p>
@@ -4981,7 +4981,7 @@
           <w:color w:val="auto"/>
         </w:rPr>
       </w:pPr>
-      <w:bookmarkStart w:id="0" w:name="_Toc244271253"/>
+      <w:bookmarkStart w:id="0" w:name="_Toc244271612"/>
       <w:r>
         <w:rPr>
           <w:color w:val="auto"/>
@@ -4997,7 +4997,7 @@
           <w:color w:val="auto"/>
         </w:rPr>
       </w:pPr>
-      <w:bookmarkStart w:id="1" w:name="_Toc244271254"/>
+      <w:bookmarkStart w:id="1" w:name="_Toc244271613"/>
       <w:r>
         <w:rPr>
           <w:color w:val="auto"/>
@@ -5048,8 +5048,8 @@
         </w:rPr>
         <w:lastRenderedPageBreak/>
         <w:drawing>
-          <wp:inline distT="0" distB="0" distL="0" distR="0" wp14:anchorId="37324FE9" wp14:editId="20307038">
-            <wp:extent cx="5120640" cy="3333148"/>
+          <wp:inline distT="0" distB="0" distL="0" distR="0" wp14:anchorId="00C701F2" wp14:editId="6DA256A3">
+            <wp:extent cx="5120640" cy="3714304"/>
             <wp:effectExtent l="0" t="0" r="0" b="0"/>
             <wp:docPr id="3" name="Picture 3"/>
             <wp:cNvGraphicFramePr>
@@ -5071,7 +5071,7 @@
                   <pic:spPr>
                     <a:xfrm>
                       <a:off x="0" y="0"/>
-                      <a:ext cx="5120640" cy="3333148"/>
+                      <a:ext cx="5120640" cy="3714304"/>
                     </a:xfrm>
                     <a:prstGeom prst="rect">
                       <a:avLst/>
@@ -5115,21 +5115,18 @@
         <w:spacing w:after="60"/>
       </w:pPr>
       <w:r>
-        <w:t>Conversational AI is an attractive way to close that gap because it lets a user ask a question in natural language instead of searching documents. The challenge is that a bare language model does not know which document a fact came from, cannot be audited, and will sometimes state something that no source supports. Retrieval-Augmented Generation changes the contract: the model must answer from passages that were actually retrieved from a trusted collection, and those passages can be shown to the user alongs</w:t>
-      </w:r>
-      <w:r>
-        <w:t xml:space="preserve">ide the answer. This project takes that idea and adds the two </w:t>
+        <w:t xml:space="preserve">Conversational AI is an attractive way to close that gap because it lets a user ask a question in natural language instead of searching documents. The challenge is that a bare language model does not know which document a fact came from, cannot be audited, and will sometimes state something that no source supports. Retrieval-Augmented Generation changes the contract: the model must answer from passages </w:t>
       </w:r>
       <w:r>
         <w:lastRenderedPageBreak/>
-        <w:t>things a real farmer-facing deployment needs — separation of unrelated knowledge domains so that answers are not built from the wrong source, and a multilingual voice layer so that the service is usable by someone who prefers to speak Telugu, Hindi or Tamil rather than type English.</w:t>
+        <w:t>that were actually retrieved from a trusted collection, and those passages can be shown to the user alongside the answer. This project takes that idea and adds the two things a real farmer-facing deployment needs — separation of unrelated knowledge domains so that answers are not built from the wrong source, and a multilingual voice layer so that the service is usable by someone who prefers to speak Telugu, Hindi or Tamil rather than type English.</w:t>
       </w:r>
     </w:p>
     <w:p>
       <w:pPr>
         <w:pStyle w:val="Heading2"/>
       </w:pPr>
-      <w:bookmarkStart w:id="2" w:name="_Toc244271255"/>
+      <w:bookmarkStart w:id="2" w:name="_Toc244271614"/>
       <w:r>
         <w:t>1.2  Motivation</w:t>
       </w:r>
@@ -5163,7 +5160,7 @@
       <w:pPr>
         <w:pStyle w:val="Heading2"/>
       </w:pPr>
-      <w:bookmarkStart w:id="3" w:name="_Toc244271256"/>
+      <w:bookmarkStart w:id="3" w:name="_Toc244271615"/>
       <w:r>
         <w:t>1.3  Problem Statement</w:t>
       </w:r>
@@ -5177,11 +5174,11 @@
         <w:t>Existing agricultural question-answering systems built on single-index retrieval-augmented generation retrieve semantically similar passages from across their whole corpus, so a crop-disease query can surface government-scheme passages and the reverse can also happen; they often miss the exact policy terms, scheme names and crop-specific keywords that lexical search handles well; they are usually text-only and English-only; and they tend to answer even when the available evidence is weak. This project there</w:t>
       </w:r>
       <w:r>
-        <w:t xml:space="preserve">fore addresses four connected problems that, taken together, keep such systems from being dependable in the field. (i) Domain contamination arises because a single index mixes two unrelated knowledge sources, so an answer can be built from the wrong domain. (ii) Weak lexical recall occurs because pure dense retrieval misses the exact disease names, fertiliser ratios, scheme names and document identifiers that farmers actually type. (iii) An accessibility barrier remains because most systems are </w:t>
+        <w:t xml:space="preserve">fore addresses four connected problems that, taken together, keep such systems from being dependable in the field. (i) Domain contamination arises because a single index mixes two unrelated knowledge sources, so an answer can be built from the wrong domain. (ii) Weak lexical recall occurs because pure dense retrieval misses </w:t>
       </w:r>
       <w:r>
         <w:lastRenderedPageBreak/>
-        <w:t>text-only an</w:t>
+        <w:t>the exact disease names, fertiliser ratios, scheme names and document identifiers that farmers actually type. (iii) An accessibility barrier remains because most systems are text-only an</w:t>
       </w:r>
       <w:r>
         <w:t>d English-only, which excludes farmers who prefer a regional language or who prefer to speak rather than type. (iv) Ungrounded answers are produced because, without retrieval and citation, a reply may be fluent yet unsupported, which is unsafe for the agricultural and financial decisions a farmer may act on.</w:t>
@@ -5202,7 +5199,7 @@
       <w:pPr>
         <w:pStyle w:val="Heading2"/>
       </w:pPr>
-      <w:bookmarkStart w:id="4" w:name="_Toc244271257"/>
+      <w:bookmarkStart w:id="4" w:name="_Toc244271616"/>
       <w:r>
         <w:t>1.4  Objectives</w:t>
       </w:r>
@@ -5302,8 +5299,9 @@
       <w:pPr>
         <w:pStyle w:val="Heading2"/>
       </w:pPr>
-      <w:bookmarkStart w:id="5" w:name="_Toc244271258"/>
-      <w:r>
+      <w:bookmarkStart w:id="5" w:name="_Toc244271617"/>
+      <w:r>
+        <w:lastRenderedPageBreak/>
         <w:t>1.5  Scope and Limitations</w:t>
       </w:r>
       <w:bookmarkEnd w:id="5"/>
@@ -5313,11 +5311,7 @@
         <w:spacing w:after="60"/>
       </w:pPr>
       <w:r>
-        <w:t xml:space="preserve">Scope. The system covers four languages (English, Hindi, Telugu, Tamil); two knowledge domains (agricultural diagnostics and government schemes); document formats PDF, DOCX, TXT and Markdown; text and voice interaction; and both local </w:t>
-      </w:r>
-      <w:r>
-        <w:lastRenderedPageBreak/>
-        <w:t>(Ollama) and cloud (Groq) inference. It provides grounded answers with citations, a confidence estimate, latency diagnostics and spoken output through a web interface.</w:t>
+        <w:t>Scope. The system covers four languages (English, Hindi, Telugu, Tamil); two knowledge domains (agricultural diagnostics and government schemes); document formats PDF, DOCX, TXT and Markdown; text and voice interaction; and both local (Ollama) and cloud (Groq) inference. It provides grounded answers with citations, a confidence estimate, latency diagnostics and spoken output through a web interface.</w:t>
       </w:r>
     </w:p>
     <w:p>
@@ -5346,7 +5340,7 @@
       <w:pPr>
         <w:pStyle w:val="Heading2"/>
       </w:pPr>
-      <w:bookmarkStart w:id="6" w:name="_Toc244271259"/>
+      <w:bookmarkStart w:id="6" w:name="_Toc244271618"/>
       <w:r>
         <w:t>1.6  Organization of the Report</w:t>
       </w:r>
@@ -5381,7 +5375,7 @@
         <w:pStyle w:val="Heading1"/>
         <w:spacing w:before="0"/>
       </w:pPr>
-      <w:bookmarkStart w:id="7" w:name="_Toc244271260"/>
+      <w:bookmarkStart w:id="7" w:name="_Toc244271619"/>
       <w:r>
         <w:t>Literature Survey</w:t>
       </w:r>
@@ -5391,7 +5385,7 @@
       <w:pPr>
         <w:pStyle w:val="Heading2"/>
       </w:pPr>
-      <w:bookmarkStart w:id="8" w:name="_Toc244271261"/>
+      <w:bookmarkStart w:id="8" w:name="_Toc244271620"/>
       <w:r>
         <w:t>2.1  Review of Related Work</w:t>
       </w:r>
@@ -5409,7 +5403,7 @@
       <w:pPr>
         <w:pStyle w:val="Heading3"/>
       </w:pPr>
-      <w:bookmarkStart w:id="9" w:name="_Toc244271262"/>
+      <w:bookmarkStart w:id="9" w:name="_Toc244271621"/>
       <w:r>
         <w:t>2.1.1  Retrieval-Augmented Generation</w:t>
       </w:r>
@@ -5458,7 +5452,7 @@
       <w:pPr>
         <w:pStyle w:val="Heading3"/>
       </w:pPr>
-      <w:bookmarkStart w:id="10" w:name="_Toc244271263"/>
+      <w:bookmarkStart w:id="10" w:name="_Toc244271622"/>
       <w:r>
         <w:t>2.1.2  Sparse Retrieval and Hybrid Fusion</w:t>
       </w:r>
@@ -5498,7 +5492,7 @@
       <w:pPr>
         <w:pStyle w:val="Heading3"/>
       </w:pPr>
-      <w:bookmarkStart w:id="11" w:name="_Toc244271264"/>
+      <w:bookmarkStart w:id="11" w:name="_Toc244271623"/>
       <w:r>
         <w:lastRenderedPageBreak/>
         <w:t>2.1.3  Reranking and Diversity</w:t>
@@ -5520,7 +5514,7 @@
       <w:pPr>
         <w:pStyle w:val="Heading3"/>
       </w:pPr>
-      <w:bookmarkStart w:id="12" w:name="_Toc244271265"/>
+      <w:bookmarkStart w:id="12" w:name="_Toc244271624"/>
       <w:r>
         <w:t>2.1.4  Multilingual, Voice and Agricultural Assistants</w:t>
       </w:r>
@@ -5567,7 +5561,7 @@
       <w:pPr>
         <w:pStyle w:val="Heading3"/>
       </w:pPr>
-      <w:bookmarkStart w:id="13" w:name="_Toc244271266"/>
+      <w:bookmarkStart w:id="13" w:name="_Toc244271625"/>
       <w:r>
         <w:t>2.1.5  Evaluating Retrieval-Augmented Systems</w:t>
       </w:r>
@@ -5591,7 +5585,7 @@
       <w:pPr>
         <w:pStyle w:val="Heading2"/>
       </w:pPr>
-      <w:bookmarkStart w:id="14" w:name="_Toc244271267"/>
+      <w:bookmarkStart w:id="14" w:name="_Toc244271626"/>
       <w:r>
         <w:t>2.2  Summary Table</w:t>
       </w:r>
@@ -6199,7 +6193,7 @@
       <w:pPr>
         <w:pStyle w:val="Heading2"/>
       </w:pPr>
-      <w:bookmarkStart w:id="15" w:name="_Toc244271268"/>
+      <w:bookmarkStart w:id="15" w:name="_Toc244271627"/>
       <w:r>
         <w:t>2.3  Research Gap Identified</w:t>
       </w:r>
@@ -6248,7 +6242,7 @@
         <w:pStyle w:val="Heading1"/>
         <w:spacing w:before="0"/>
       </w:pPr>
-      <w:bookmarkStart w:id="16" w:name="_Toc244271269"/>
+      <w:bookmarkStart w:id="16" w:name="_Toc244271628"/>
       <w:r>
         <w:t>System Analysis and Requirements</w:t>
       </w:r>
@@ -6258,7 +6252,7 @@
       <w:pPr>
         <w:pStyle w:val="Heading2"/>
       </w:pPr>
-      <w:bookmarkStart w:id="17" w:name="_Toc244271270"/>
+      <w:bookmarkStart w:id="17" w:name="_Toc244271629"/>
       <w:r>
         <w:t>3.1  Existing Approaches and their Drawbacks</w:t>
       </w:r>
@@ -6293,7 +6287,7 @@
       <w:pPr>
         <w:pStyle w:val="Heading2"/>
       </w:pPr>
-      <w:bookmarkStart w:id="18" w:name="_Toc244271271"/>
+      <w:bookmarkStart w:id="18" w:name="_Toc244271630"/>
       <w:r>
         <w:t>3.2  Feasibility Study</w:t>
       </w:r>
@@ -6342,7 +6336,7 @@
       <w:pPr>
         <w:pStyle w:val="Heading2"/>
       </w:pPr>
-      <w:bookmarkStart w:id="19" w:name="_Toc244271272"/>
+      <w:bookmarkStart w:id="19" w:name="_Toc244271631"/>
       <w:r>
         <w:t>3.3  Hardware / Compute Used</w:t>
       </w:r>
@@ -6360,7 +6354,7 @@
       <w:pPr>
         <w:pStyle w:val="Heading2"/>
       </w:pPr>
-      <w:bookmarkStart w:id="20" w:name="_Toc244271273"/>
+      <w:bookmarkStart w:id="20" w:name="_Toc244271632"/>
       <w:r>
         <w:lastRenderedPageBreak/>
         <w:t>3.4  Software Requirements</w:t>
@@ -6974,7 +6968,7 @@
       <w:pPr>
         <w:pStyle w:val="Heading2"/>
       </w:pPr>
-      <w:bookmarkStart w:id="21" w:name="_Toc244271274"/>
+      <w:bookmarkStart w:id="21" w:name="_Toc244271633"/>
       <w:r>
         <w:t>3.5  Functional and Non-Functional Requirements</w:t>
       </w:r>
@@ -7032,7 +7026,7 @@
         <w:pStyle w:val="Heading1"/>
         <w:spacing w:before="0"/>
       </w:pPr>
-      <w:bookmarkStart w:id="22" w:name="_Toc244271275"/>
+      <w:bookmarkStart w:id="22" w:name="_Toc244271634"/>
       <w:r>
         <w:t>Methodology</w:t>
       </w:r>
@@ -7042,7 +7036,7 @@
       <w:pPr>
         <w:pStyle w:val="Heading2"/>
       </w:pPr>
-      <w:bookmarkStart w:id="23" w:name="_Toc244271276"/>
+      <w:bookmarkStart w:id="23" w:name="_Toc244271635"/>
       <w:r>
         <w:t>4.1  Overall Pipeline</w:t>
       </w:r>
@@ -7070,7 +7064,7 @@
           <w:noProof/>
         </w:rPr>
         <w:drawing>
-          <wp:inline distT="0" distB="0" distL="0" distR="0" wp14:anchorId="7D4DCE43" wp14:editId="2CEEC9D7">
+          <wp:inline distT="0" distB="0" distL="0" distR="0" wp14:anchorId="07E28E20" wp14:editId="197317A7">
             <wp:extent cx="5212080" cy="2325853"/>
             <wp:effectExtent l="0" t="0" r="0" b="0"/>
             <wp:docPr id="4" name="Picture 4"/>
@@ -7138,7 +7132,7 @@
         </w:rPr>
         <w:lastRenderedPageBreak/>
         <w:drawing>
-          <wp:inline distT="0" distB="0" distL="0" distR="0" wp14:anchorId="5FC20D5A" wp14:editId="32872424">
+          <wp:inline distT="0" distB="0" distL="0" distR="0" wp14:anchorId="6F5F13B8" wp14:editId="2D846092">
             <wp:extent cx="5212080" cy="2433364"/>
             <wp:effectExtent l="0" t="0" r="0" b="0"/>
             <wp:docPr id="5" name="Picture 5"/>
@@ -7190,7 +7184,7 @@
       <w:pPr>
         <w:pStyle w:val="Heading2"/>
       </w:pPr>
-      <w:bookmarkStart w:id="24" w:name="_Toc244271277"/>
+      <w:bookmarkStart w:id="24" w:name="_Toc244271636"/>
       <w:r>
         <w:t>4.2  Dataset: Knowledge Base</w:t>
       </w:r>
@@ -7690,7 +7684,7 @@
       <w:pPr>
         <w:pStyle w:val="Heading2"/>
       </w:pPr>
-      <w:bookmarkStart w:id="25" w:name="_Toc244271278"/>
+      <w:bookmarkStart w:id="25" w:name="_Toc244271637"/>
       <w:r>
         <w:t>4.3  Pre-processing and Chunking</w:t>
       </w:r>
@@ -7772,7 +7766,7 @@
       <w:pPr>
         <w:pStyle w:val="Heading2"/>
       </w:pPr>
-      <w:bookmarkStart w:id="26" w:name="_Toc244271279"/>
+      <w:bookmarkStart w:id="26" w:name="_Toc244271638"/>
       <w:r>
         <w:t>4.4  Train / Validation / Test Protocol</w:t>
       </w:r>
@@ -7805,7 +7799,7 @@
       <w:pPr>
         <w:pStyle w:val="Heading2"/>
       </w:pPr>
-      <w:bookmarkStart w:id="27" w:name="_Toc244271280"/>
+      <w:bookmarkStart w:id="27" w:name="_Toc244271639"/>
       <w:r>
         <w:t>4.5  System Architecture and Justification</w:t>
       </w:r>
@@ -7844,7 +7838,7 @@
       <w:pPr>
         <w:pStyle w:val="Heading2"/>
       </w:pPr>
-      <w:bookmarkStart w:id="28" w:name="_Toc244271281"/>
+      <w:bookmarkStart w:id="28" w:name="_Toc244271640"/>
       <w:r>
         <w:t>4.6  Retrieval and Ranking Methodology</w:t>
       </w:r>
@@ -7869,7 +7863,7 @@
           <w:noProof/>
         </w:rPr>
         <w:drawing>
-          <wp:inline distT="0" distB="0" distL="0" distR="0" wp14:anchorId="058248E1" wp14:editId="7232A45F">
+          <wp:inline distT="0" distB="0" distL="0" distR="0" wp14:anchorId="4A799C14" wp14:editId="36657958">
             <wp:extent cx="4480560" cy="4063371"/>
             <wp:effectExtent l="0" t="0" r="0" b="0"/>
             <wp:docPr id="6" name="Picture 6"/>
@@ -8340,7 +8334,7 @@
       <w:pPr>
         <w:pStyle w:val="Heading2"/>
       </w:pPr>
-      <w:bookmarkStart w:id="29" w:name="_Toc244271282"/>
+      <w:bookmarkStart w:id="29" w:name="_Toc244271641"/>
       <w:r>
         <w:t>4.7  Objective-to-Methodology Mapping</w:t>
       </w:r>
@@ -8717,7 +8711,7 @@
       <w:pPr>
         <w:pStyle w:val="Heading2"/>
       </w:pPr>
-      <w:bookmarkStart w:id="30" w:name="_Toc244271283"/>
+      <w:bookmarkStart w:id="30" w:name="_Toc244271642"/>
       <w:r>
         <w:t>4.8  Baseline and Comparison Methods</w:t>
       </w:r>
@@ -8752,7 +8746,7 @@
         <w:pStyle w:val="Heading1"/>
         <w:spacing w:before="0"/>
       </w:pPr>
-      <w:bookmarkStart w:id="31" w:name="_Toc244271284"/>
+      <w:bookmarkStart w:id="31" w:name="_Toc244271643"/>
       <w:r>
         <w:t>Implementation</w:t>
       </w:r>
@@ -8762,7 +8756,7 @@
       <w:pPr>
         <w:pStyle w:val="Heading2"/>
       </w:pPr>
-      <w:bookmarkStart w:id="32" w:name="_Toc244271285"/>
+      <w:bookmarkStart w:id="32" w:name="_Toc244271644"/>
       <w:r>
         <w:t>5.1  System / Pipeline Configuration</w:t>
       </w:r>
@@ -9317,7 +9311,7 @@
       <w:pPr>
         <w:pStyle w:val="Heading2"/>
       </w:pPr>
-      <w:bookmarkStart w:id="33" w:name="_Toc244271286"/>
+      <w:bookmarkStart w:id="33" w:name="_Toc244271645"/>
       <w:r>
         <w:t>5.2  Development and Deployment Setup</w:t>
       </w:r>
@@ -9364,7 +9358,7 @@
       <w:pPr>
         <w:pStyle w:val="Heading2"/>
       </w:pPr>
-      <w:bookmarkStart w:id="34" w:name="_Toc244271287"/>
+      <w:bookmarkStart w:id="34" w:name="_Toc244271646"/>
       <w:r>
         <w:t>5.3  Key Code Snippets</w:t>
       </w:r>
@@ -9618,7 +9612,7 @@
       <w:pPr>
         <w:pStyle w:val="Heading2"/>
       </w:pPr>
-      <w:bookmarkStart w:id="35" w:name="_Toc244271288"/>
+      <w:bookmarkStart w:id="35" w:name="_Toc244271647"/>
       <w:r>
         <w:t>5.4  User Interface and Deployment</w:t>
       </w:r>
@@ -9654,7 +9648,7 @@
       <w:pPr>
         <w:pStyle w:val="Heading2"/>
       </w:pPr>
-      <w:bookmarkStart w:id="36" w:name="_Toc244271289"/>
+      <w:bookmarkStart w:id="36" w:name="_Toc244271648"/>
       <w:r>
         <w:t>5.5  Cloud Deployment and Provider Switching</w:t>
       </w:r>
@@ -9675,7 +9669,7 @@
       <w:pPr>
         <w:pStyle w:val="Heading2"/>
       </w:pPr>
-      <w:bookmarkStart w:id="37" w:name="_Toc244271290"/>
+      <w:bookmarkStart w:id="37" w:name="_Toc244271649"/>
       <w:r>
         <w:lastRenderedPageBreak/>
         <w:t>5.6  REST API</w:t>
@@ -10215,7 +10209,7 @@
       <w:pPr>
         <w:pStyle w:val="Heading2"/>
       </w:pPr>
-      <w:bookmarkStart w:id="38" w:name="_Toc244271291"/>
+      <w:bookmarkStart w:id="38" w:name="_Toc244271650"/>
       <w:r>
         <w:t>5.7  Testing and Validation</w:t>
       </w:r>
@@ -10253,7 +10247,7 @@
         <w:pStyle w:val="Heading1"/>
         <w:spacing w:before="0"/>
       </w:pPr>
-      <w:bookmarkStart w:id="39" w:name="_Toc244271292"/>
+      <w:bookmarkStart w:id="39" w:name="_Toc244271651"/>
       <w:r>
         <w:t>Results and Discussion</w:t>
       </w:r>
@@ -10263,7 +10257,7 @@
       <w:pPr>
         <w:pStyle w:val="Heading2"/>
       </w:pPr>
-      <w:bookmarkStart w:id="40" w:name="_Toc244271293"/>
+      <w:bookmarkStart w:id="40" w:name="_Toc244271652"/>
       <w:r>
         <w:t>6.1  Evaluation Metrics</w:t>
       </w:r>
@@ -10532,7 +10526,7 @@
       <w:pPr>
         <w:pStyle w:val="Heading2"/>
       </w:pPr>
-      <w:bookmarkStart w:id="41" w:name="_Toc244271294"/>
+      <w:bookmarkStart w:id="41" w:name="_Toc244271653"/>
       <w:r>
         <w:lastRenderedPageBreak/>
         <w:t>6.2  Retrieval Ablation (Measured)</w:t>
@@ -10863,7 +10857,7 @@
           <w:noProof/>
         </w:rPr>
         <w:drawing>
-          <wp:inline distT="0" distB="0" distL="0" distR="0" wp14:anchorId="1BD8B90A" wp14:editId="643F7718">
+          <wp:inline distT="0" distB="0" distL="0" distR="0" wp14:anchorId="6DECE2C8" wp14:editId="33C50D3D">
             <wp:extent cx="5120640" cy="2733990"/>
             <wp:effectExtent l="0" t="0" r="0" b="0"/>
             <wp:docPr id="7" name="Picture 7"/>
@@ -10915,7 +10909,7 @@
       <w:pPr>
         <w:pStyle w:val="Heading2"/>
       </w:pPr>
-      <w:bookmarkStart w:id="42" w:name="_Toc244271295"/>
+      <w:bookmarkStart w:id="42" w:name="_Toc244271654"/>
       <w:r>
         <w:t>6.3  Generation and Latency (Measured)</w:t>
       </w:r>
@@ -11191,7 +11185,7 @@
           <w:noProof/>
         </w:rPr>
         <w:drawing>
-          <wp:inline distT="0" distB="0" distL="0" distR="0" wp14:anchorId="71C8B1FA" wp14:editId="3B60B0FE">
+          <wp:inline distT="0" distB="0" distL="0" distR="0" wp14:anchorId="2999BD4B" wp14:editId="09FFC1D0">
             <wp:extent cx="4206240" cy="2514544"/>
             <wp:effectExtent l="0" t="0" r="0" b="0"/>
             <wp:docPr id="8" name="Picture 8"/>
@@ -11259,7 +11253,7 @@
         </w:rPr>
         <w:lastRenderedPageBreak/>
         <w:drawing>
-          <wp:inline distT="0" distB="0" distL="0" distR="0" wp14:anchorId="0772CCC7" wp14:editId="5A26B33A">
+          <wp:inline distT="0" distB="0" distL="0" distR="0" wp14:anchorId="33BAFAB1" wp14:editId="27301FA2">
             <wp:extent cx="4572000" cy="2658204"/>
             <wp:effectExtent l="0" t="0" r="0" b="0"/>
             <wp:docPr id="9" name="Picture 9"/>
@@ -11311,7 +11305,7 @@
       <w:pPr>
         <w:pStyle w:val="Heading2"/>
       </w:pPr>
-      <w:bookmarkStart w:id="43" w:name="_Toc244271296"/>
+      <w:bookmarkStart w:id="43" w:name="_Toc244271655"/>
       <w:r>
         <w:t>6.4  Comparison with Baselines and Published Work</w:t>
       </w:r>
@@ -11358,7 +11352,7 @@
       <w:pPr>
         <w:pStyle w:val="Heading2"/>
       </w:pPr>
-      <w:bookmarkStart w:id="44" w:name="_Toc244271297"/>
+      <w:bookmarkStart w:id="44" w:name="_Toc244271656"/>
       <w:r>
         <w:t>6.5  Error Analysis</w:t>
       </w:r>
@@ -11379,7 +11373,7 @@
       <w:pPr>
         <w:pStyle w:val="Heading2"/>
       </w:pPr>
-      <w:bookmarkStart w:id="45" w:name="_Toc244271298"/>
+      <w:bookmarkStart w:id="45" w:name="_Toc244271657"/>
       <w:r>
         <w:t>6.6  Ablation Summary</w:t>
       </w:r>
@@ -11397,7 +11391,7 @@
       <w:pPr>
         <w:pStyle w:val="Heading2"/>
       </w:pPr>
-      <w:bookmarkStart w:id="46" w:name="_Toc244271299"/>
+      <w:bookmarkStart w:id="46" w:name="_Toc244271658"/>
       <w:r>
         <w:t>6.7  Output of the Working System</w:t>
       </w:r>
@@ -11437,7 +11431,7 @@
           <w:noProof/>
         </w:rPr>
         <w:drawing>
-          <wp:inline distT="0" distB="0" distL="0" distR="0" wp14:anchorId="19B6961C" wp14:editId="0CA96214">
+          <wp:inline distT="0" distB="0" distL="0" distR="0" wp14:anchorId="7C3A60B1" wp14:editId="669C5425">
             <wp:extent cx="5577840" cy="3485786"/>
             <wp:effectExtent l="0" t="0" r="0" b="0"/>
             <wp:docPr id="10" name="Picture 10"/>
@@ -11497,7 +11491,7 @@
         </w:rPr>
         <w:lastRenderedPageBreak/>
         <w:drawing>
-          <wp:inline distT="0" distB="0" distL="0" distR="0" wp14:anchorId="59244BB1" wp14:editId="6078A881">
+          <wp:inline distT="0" distB="0" distL="0" distR="0" wp14:anchorId="1654F45F" wp14:editId="542FADB0">
             <wp:extent cx="5577840" cy="2062957"/>
             <wp:effectExtent l="0" t="0" r="0" b="0"/>
             <wp:docPr id="11" name="Picture 11"/>
@@ -11556,7 +11550,7 @@
           <w:noProof/>
         </w:rPr>
         <w:drawing>
-          <wp:inline distT="0" distB="0" distL="0" distR="0" wp14:anchorId="0FE54996" wp14:editId="6A44C878">
+          <wp:inline distT="0" distB="0" distL="0" distR="0" wp14:anchorId="44271639" wp14:editId="2A8C6804">
             <wp:extent cx="5577840" cy="3023149"/>
             <wp:effectExtent l="0" t="0" r="0" b="0"/>
             <wp:docPr id="12" name="Picture 12"/>
@@ -11608,7 +11602,7 @@
       <w:pPr>
         <w:pStyle w:val="Heading2"/>
       </w:pPr>
-      <w:bookmarkStart w:id="47" w:name="_Toc244271300"/>
+      <w:bookmarkStart w:id="47" w:name="_Toc244271659"/>
       <w:r>
         <w:t>6.8  Ethical and Responsible AI Considerations</w:t>
       </w:r>
@@ -11661,7 +11655,7 @@
         <w:pStyle w:val="Heading1"/>
         <w:spacing w:before="0"/>
       </w:pPr>
-      <w:bookmarkStart w:id="48" w:name="_Toc244271301"/>
+      <w:bookmarkStart w:id="48" w:name="_Toc244271660"/>
       <w:r>
         <w:t>Conclusion and Future Scope</w:t>
       </w:r>
@@ -11671,7 +11665,7 @@
       <w:pPr>
         <w:pStyle w:val="Heading2"/>
       </w:pPr>
-      <w:bookmarkStart w:id="49" w:name="_Toc244271302"/>
+      <w:bookmarkStart w:id="49" w:name="_Toc244271661"/>
       <w:r>
         <w:t>7.1  Conclusion</w:t>
       </w:r>
@@ -11703,7 +11697,7 @@
       <w:pPr>
         <w:pStyle w:val="Heading2"/>
       </w:pPr>
-      <w:bookmarkStart w:id="50" w:name="_Toc244271303"/>
+      <w:bookmarkStart w:id="50" w:name="_Toc244271662"/>
       <w:r>
         <w:t>7.2  Limitations</w:t>
       </w:r>
@@ -11725,7 +11719,7 @@
       <w:pPr>
         <w:pStyle w:val="Heading2"/>
       </w:pPr>
-      <w:bookmarkStart w:id="51" w:name="_Toc244271304"/>
+      <w:bookmarkStart w:id="51" w:name="_Toc244271663"/>
       <w:r>
         <w:t>7.3  Future Enhancements</w:t>
       </w:r>
@@ -11750,7 +11744,7 @@
         <w:pStyle w:val="Heading1"/>
         <w:pageBreakBefore/>
       </w:pPr>
-      <w:bookmarkStart w:id="52" w:name="_Toc244271305"/>
+      <w:bookmarkStart w:id="52" w:name="_Toc244271664"/>
       <w:r>
         <w:lastRenderedPageBreak/>
         <w:t>References</w:t>
@@ -11983,7 +11977,7 @@
         <w:pStyle w:val="Heading1"/>
         <w:pageBreakBefore/>
       </w:pPr>
-      <w:bookmarkStart w:id="53" w:name="_Toc244271306"/>
+      <w:bookmarkStart w:id="53" w:name="_Toc244271665"/>
       <w:r>
         <w:lastRenderedPageBreak/>
         <w:t>Appendices</w:t>
@@ -11994,7 +11988,7 @@
       <w:pPr>
         <w:pStyle w:val="Heading2"/>
       </w:pPr>
-      <w:bookmarkStart w:id="54" w:name="_Toc244271307"/>
+      <w:bookmarkStart w:id="54" w:name="_Toc244271666"/>
       <w:r>
         <w:t>Appendix A  GitHub Repository and README</w:t>
       </w:r>
@@ -12028,7 +12022,7 @@
       <w:pPr>
         <w:pStyle w:val="Heading2"/>
       </w:pPr>
-      <w:bookmarkStart w:id="55" w:name="_Toc244271308"/>
+      <w:bookmarkStart w:id="55" w:name="_Toc244271667"/>
       <w:r>
         <w:t>Appendix B  Models and Indices</w:t>
       </w:r>
@@ -12049,7 +12043,7 @@
       <w:pPr>
         <w:pStyle w:val="Heading2"/>
       </w:pPr>
-      <w:bookmarkStart w:id="56" w:name="_Toc244271309"/>
+      <w:bookmarkStart w:id="56" w:name="_Toc244271668"/>
       <w:r>
         <w:t>Appendix C  Key Commands to Reproduce</w:t>
       </w:r>
@@ -12151,7 +12145,7 @@
       <w:pPr>
         <w:pStyle w:val="Heading2"/>
       </w:pPr>
-      <w:bookmarkStart w:id="57" w:name="_Toc244271310"/>
+      <w:bookmarkStart w:id="57" w:name="_Toc244271669"/>
       <w:r>
         <w:lastRenderedPageBreak/>
         <w:t>Appendix D  Plagiarism Report</w:t>
@@ -12170,7 +12164,7 @@
       <w:pPr>
         <w:pStyle w:val="Heading2"/>
       </w:pPr>
-      <w:bookmarkStart w:id="58" w:name="_Toc244271311"/>
+      <w:bookmarkStart w:id="58" w:name="_Toc244271670"/>
       <w:r>
         <w:t>Appendix E  Publications / Associated Work</w:t>
       </w:r>
@@ -12513,31 +12507,31 @@
       </w:rPr>
     </w:lvl>
   </w:abstractNum>
-  <w:num w:numId="1" w16cid:durableId="1013335449">
+  <w:num w:numId="1" w16cid:durableId="1945914174">
     <w:abstractNumId w:val="8"/>
   </w:num>
-  <w:num w:numId="2" w16cid:durableId="1098063010">
+  <w:num w:numId="2" w16cid:durableId="1449542502">
     <w:abstractNumId w:val="6"/>
   </w:num>
-  <w:num w:numId="3" w16cid:durableId="2015453484">
+  <w:num w:numId="3" w16cid:durableId="866677247">
     <w:abstractNumId w:val="5"/>
   </w:num>
-  <w:num w:numId="4" w16cid:durableId="1060254117">
+  <w:num w:numId="4" w16cid:durableId="854879252">
     <w:abstractNumId w:val="4"/>
   </w:num>
-  <w:num w:numId="5" w16cid:durableId="1787697973">
+  <w:num w:numId="5" w16cid:durableId="1394085344">
     <w:abstractNumId w:val="7"/>
   </w:num>
-  <w:num w:numId="6" w16cid:durableId="93091226">
+  <w:num w:numId="6" w16cid:durableId="1889762840">
     <w:abstractNumId w:val="3"/>
   </w:num>
-  <w:num w:numId="7" w16cid:durableId="172187356">
+  <w:num w:numId="7" w16cid:durableId="330642375">
     <w:abstractNumId w:val="2"/>
   </w:num>
-  <w:num w:numId="8" w16cid:durableId="1148205097">
+  <w:num w:numId="8" w16cid:durableId="220988837">
     <w:abstractNumId w:val="1"/>
   </w:num>
-  <w:num w:numId="9" w16cid:durableId="351805072">
+  <w:num w:numId="9" w16cid:durableId="2001151066">
     <w:abstractNumId w:val="0"/>
   </w:num>
 </w:numbering>
@@ -23971,7 +23965,7 @@
     <w:autoRedefine/>
     <w:uiPriority w:val="39"/>
     <w:unhideWhenUsed/>
-    <w:rsid w:val="004F6FCD"/>
+    <w:rsid w:val="007C15AB"/>
     <w:pPr>
       <w:spacing w:after="100"/>
     </w:pPr>
@@ -23983,7 +23977,7 @@
     <w:autoRedefine/>
     <w:uiPriority w:val="39"/>
     <w:unhideWhenUsed/>
-    <w:rsid w:val="004F6FCD"/>
+    <w:rsid w:val="007C15AB"/>
     <w:pPr>
       <w:spacing w:after="100"/>
       <w:ind w:left="240"/>
@@ -23996,7 +23990,7 @@
     <w:autoRedefine/>
     <w:uiPriority w:val="39"/>
     <w:unhideWhenUsed/>
-    <w:rsid w:val="004F6FCD"/>
+    <w:rsid w:val="007C15AB"/>
     <w:pPr>
       <w:spacing w:after="100"/>
       <w:ind w:left="480"/>
@@ -24007,7 +24001,7 @@
     <w:basedOn w:val="DefaultParagraphFont"/>
     <w:uiPriority w:val="99"/>
     <w:unhideWhenUsed/>
-    <w:rsid w:val="004F6FCD"/>
+    <w:rsid w:val="007C15AB"/>
     <w:rPr>
       <w:color w:val="0000FF" w:themeColor="hyperlink"/>
       <w:u w:val="single"/>

</xml_diff>

<commit_message>
Fix clipped top border of Fig 1.1 first box
Raise the axis top limit so the topmost architecture box border is no
longer cut off by the plot bounds.
</commit_message>
<xml_diff>
--- a/Plant_Doctor_Mini_Project_Report.docx
+++ b/Plant_Doctor_Mini_Project_Report.docx
@@ -179,7 +179,7 @@
           <w:noProof/>
         </w:rPr>
         <w:drawing>
-          <wp:inline distT="0" distB="0" distL="0" distR="0" wp14:anchorId="078AB68A" wp14:editId="6F898E97">
+          <wp:inline distT="0" distB="0" distL="0" distR="0" wp14:anchorId="42ECFCD6" wp14:editId="18AC6839">
             <wp:extent cx="1371600" cy="1484644"/>
             <wp:effectExtent l="0" t="0" r="0" b="0"/>
             <wp:docPr id="1" name="Picture 1"/>
@@ -562,7 +562,7 @@
         </w:rPr>
         <w:lastRenderedPageBreak/>
         <w:drawing>
-          <wp:inline distT="0" distB="0" distL="0" distR="0" wp14:anchorId="0B303B7B" wp14:editId="5466A4A4">
+          <wp:inline distT="0" distB="0" distL="0" distR="0" wp14:anchorId="29271B50" wp14:editId="5C4FA646">
             <wp:extent cx="3931920" cy="666580"/>
             <wp:effectExtent l="0" t="0" r="0" b="0"/>
             <wp:docPr id="2" name="Picture 2"/>
@@ -1143,7 +1143,7 @@
           <w:webHidden/>
         </w:rPr>
         <w:tab/>
-        <w:t>5</w:t>
+        <w:t>4</w:t>
       </w:r>
     </w:p>
     <w:p>
@@ -4981,7 +4981,7 @@
           <w:color w:val="auto"/>
         </w:rPr>
       </w:pPr>
-      <w:bookmarkStart w:id="0" w:name="_Toc244271612"/>
+      <w:bookmarkStart w:id="0" w:name="_Toc244271834"/>
       <w:r>
         <w:rPr>
           <w:color w:val="auto"/>
@@ -4997,7 +4997,7 @@
           <w:color w:val="auto"/>
         </w:rPr>
       </w:pPr>
-      <w:bookmarkStart w:id="1" w:name="_Toc244271613"/>
+      <w:bookmarkStart w:id="1" w:name="_Toc244271835"/>
       <w:r>
         <w:rPr>
           <w:color w:val="auto"/>
@@ -5048,8 +5048,8 @@
         </w:rPr>
         <w:lastRenderedPageBreak/>
         <w:drawing>
-          <wp:inline distT="0" distB="0" distL="0" distR="0" wp14:anchorId="00C701F2" wp14:editId="6DA256A3">
-            <wp:extent cx="5120640" cy="3714304"/>
+          <wp:inline distT="0" distB="0" distL="0" distR="0" wp14:anchorId="76AABFF1" wp14:editId="0F926BB4">
+            <wp:extent cx="5120640" cy="3590757"/>
             <wp:effectExtent l="0" t="0" r="0" b="0"/>
             <wp:docPr id="3" name="Picture 3"/>
             <wp:cNvGraphicFramePr>
@@ -5071,7 +5071,7 @@
                   <pic:spPr>
                     <a:xfrm>
                       <a:off x="0" y="0"/>
-                      <a:ext cx="5120640" cy="3714304"/>
+                      <a:ext cx="5120640" cy="3590757"/>
                     </a:xfrm>
                     <a:prstGeom prst="rect">
                       <a:avLst/>
@@ -5115,18 +5115,18 @@
         <w:spacing w:after="60"/>
       </w:pPr>
       <w:r>
-        <w:t xml:space="preserve">Conversational AI is an attractive way to close that gap because it lets a user ask a question in natural language instead of searching documents. The challenge is that a bare language model does not know which document a fact came from, cannot be audited, and will sometimes state something that no source supports. Retrieval-Augmented Generation changes the contract: the model must answer from passages </w:t>
+        <w:t xml:space="preserve">Conversational AI is an attractive way to close that gap because it lets a user ask a question in natural language instead of searching documents. The challenge is that a bare language model does not know which document a fact came from, cannot be audited, and will sometimes state something that no source supports. Retrieval-Augmented Generation changes the contract: the model must answer from passages that were actually retrieved from a trusted collection, and those passages can be </w:t>
       </w:r>
       <w:r>
         <w:lastRenderedPageBreak/>
-        <w:t>that were actually retrieved from a trusted collection, and those passages can be shown to the user alongside the answer. This project takes that idea and adds the two things a real farmer-facing deployment needs — separation of unrelated knowledge domains so that answers are not built from the wrong source, and a multilingual voice layer so that the service is usable by someone who prefers to speak Telugu, Hindi or Tamil rather than type English.</w:t>
+        <w:t>shown to the user alongside the answer. This project takes that idea and adds the two things a real farmer-facing deployment needs — separation of unrelated knowledge domains so that answers are not built from the wrong source, and a multilingual voice layer so that the service is usable by someone who prefers to speak Telugu, Hindi or Tamil rather than type English.</w:t>
       </w:r>
     </w:p>
     <w:p>
       <w:pPr>
         <w:pStyle w:val="Heading2"/>
       </w:pPr>
-      <w:bookmarkStart w:id="2" w:name="_Toc244271614"/>
+      <w:bookmarkStart w:id="2" w:name="_Toc244271836"/>
       <w:r>
         <w:t>1.2  Motivation</w:t>
       </w:r>
@@ -5160,7 +5160,7 @@
       <w:pPr>
         <w:pStyle w:val="Heading2"/>
       </w:pPr>
-      <w:bookmarkStart w:id="3" w:name="_Toc244271615"/>
+      <w:bookmarkStart w:id="3" w:name="_Toc244271837"/>
       <w:r>
         <w:t>1.3  Problem Statement</w:t>
       </w:r>
@@ -5174,11 +5174,11 @@
         <w:t>Existing agricultural question-answering systems built on single-index retrieval-augmented generation retrieve semantically similar passages from across their whole corpus, so a crop-disease query can surface government-scheme passages and the reverse can also happen; they often miss the exact policy terms, scheme names and crop-specific keywords that lexical search handles well; they are usually text-only and English-only; and they tend to answer even when the available evidence is weak. This project there</w:t>
       </w:r>
       <w:r>
-        <w:t xml:space="preserve">fore addresses four connected problems that, taken together, keep such systems from being dependable in the field. (i) Domain contamination arises because a single index mixes two unrelated knowledge sources, so an answer can be built from the wrong domain. (ii) Weak lexical recall occurs because pure dense retrieval misses </w:t>
+        <w:t xml:space="preserve">fore addresses four connected problems that, taken together, keep such systems from being dependable in the field. (i) Domain contamination arises because a single index mixes two unrelated knowledge sources, so an answer can be built from the wrong domain. (ii) Weak lexical recall occurs because pure dense retrieval misses the exact disease names, fertiliser ratios, scheme names and document identifiers that </w:t>
       </w:r>
       <w:r>
         <w:lastRenderedPageBreak/>
-        <w:t>the exact disease names, fertiliser ratios, scheme names and document identifiers that farmers actually type. (iii) An accessibility barrier remains because most systems are text-only an</w:t>
+        <w:t>farmers actually type. (iii) An accessibility barrier remains because most systems are text-only an</w:t>
       </w:r>
       <w:r>
         <w:t>d English-only, which excludes farmers who prefer a regional language or who prefer to speak rather than type. (iv) Ungrounded answers are produced because, without retrieval and citation, a reply may be fluent yet unsupported, which is unsafe for the agricultural and financial decisions a farmer may act on.</w:t>
@@ -5199,7 +5199,7 @@
       <w:pPr>
         <w:pStyle w:val="Heading2"/>
       </w:pPr>
-      <w:bookmarkStart w:id="4" w:name="_Toc244271616"/>
+      <w:bookmarkStart w:id="4" w:name="_Toc244271838"/>
       <w:r>
         <w:t>1.4  Objectives</w:t>
       </w:r>
@@ -5299,19 +5299,33 @@
       <w:pPr>
         <w:pStyle w:val="Heading2"/>
       </w:pPr>
-      <w:bookmarkStart w:id="5" w:name="_Toc244271617"/>
+      <w:bookmarkStart w:id="5" w:name="_Toc244271839"/>
+      <w:r>
+        <w:t>1.5  Scope and Limitations</w:t>
+      </w:r>
+      <w:bookmarkEnd w:id="5"/>
+    </w:p>
+    <w:p>
+      <w:pPr>
+        <w:spacing w:after="60"/>
+      </w:pPr>
+      <w:r>
+        <w:t xml:space="preserve">Scope. The system covers four languages (English, Hindi, Telugu, Tamil); two knowledge domains (agricultural diagnostics and government schemes); document </w:t>
+      </w:r>
       <w:r>
         <w:lastRenderedPageBreak/>
-        <w:t>1.5  Scope and Limitations</w:t>
-      </w:r>
-      <w:bookmarkEnd w:id="5"/>
+        <w:t>formats PDF, DOCX, TXT and Markdown; text and voice interaction; and both local (Ollama) and cloud (Groq) inference. It provides grounded answers with citations, a confidence estimate, latency diagnostics and spoken output through a web interface.</w:t>
+      </w:r>
     </w:p>
     <w:p>
       <w:pPr>
         <w:spacing w:after="60"/>
       </w:pPr>
       <w:r>
-        <w:t>Scope. The system covers four languages (English, Hindi, Telugu, Tamil); two knowledge domains (agricultural diagnostics and government schemes); document formats PDF, DOCX, TXT and Markdown; text and voice interaction; and both local (Ollama) and cloud (Groq) inference. It provides grounded answers with citations, a confidence estimate, latency diagnostics and spoken output through a web interface.</w:t>
+        <w:t xml:space="preserve">Limitations. Answer quality is bounded by the completeness and freshness of the underlying documents. On very small local models (qwen2.5:7b) direct generation in Indian languages can degrade, so the system falls back to generate-in-English-then-translate on such models. The free translation services are rate-limited, for which an LLM translation fallback is provided. Speech recognition quality depends on audio conditions, and government-scheme information changes over time and needs periodic re-ingestion. </w:t>
+      </w:r>
+      <w:r>
+        <w:t>The measured benchmark in this report is small (four questions) and run on a local CPU model; it establishes reproducibility rather than large-scale accuracy.</w:t>
       </w:r>
     </w:p>
     <w:p>
@@ -5319,17 +5333,6 @@
         <w:spacing w:after="60"/>
       </w:pPr>
       <w:r>
-        <w:t xml:space="preserve">Limitations. Answer quality is bounded by the completeness and freshness of the underlying documents. On very small local models (qwen2.5:7b) direct generation in Indian languages can degrade, so the system falls back to generate-in-English-then-translate on such models. The free translation services are rate-limited, for which an LLM translation fallback is provided. Speech recognition quality depends on audio conditions, and government-scheme information changes over time and needs periodic re-ingestion. </w:t>
-      </w:r>
-      <w:r>
-        <w:t>The measured benchmark in this report is small (four questions) and run on a local CPU model; it establishes reproducibility rather than large-scale accuracy.</w:t>
-      </w:r>
-    </w:p>
-    <w:p>
-      <w:pPr>
-        <w:spacing w:after="60"/>
-      </w:pPr>
-      <w:r>
         <w:t>The system is positioned as a decision-support tool for farmers and agricultural extension workers, not as a replacement for a qualified agronomist or an official scheme authority. It answers from the documents it has been given and shows its sources, so the user remains in control of the final decision. Pesticide, fertiliser and financial actions in particular should be confirmed against current local recommendations, and this is made explicit to the user. Within these bounds, the contribution is a working</w:t>
       </w:r>
       <w:r>
@@ -5340,7 +5343,7 @@
       <w:pPr>
         <w:pStyle w:val="Heading2"/>
       </w:pPr>
-      <w:bookmarkStart w:id="6" w:name="_Toc244271618"/>
+      <w:bookmarkStart w:id="6" w:name="_Toc244271840"/>
       <w:r>
         <w:t>1.6  Organization of the Report</w:t>
       </w:r>
@@ -5375,7 +5378,7 @@
         <w:pStyle w:val="Heading1"/>
         <w:spacing w:before="0"/>
       </w:pPr>
-      <w:bookmarkStart w:id="7" w:name="_Toc244271619"/>
+      <w:bookmarkStart w:id="7" w:name="_Toc244271841"/>
       <w:r>
         <w:t>Literature Survey</w:t>
       </w:r>
@@ -5385,7 +5388,7 @@
       <w:pPr>
         <w:pStyle w:val="Heading2"/>
       </w:pPr>
-      <w:bookmarkStart w:id="8" w:name="_Toc244271620"/>
+      <w:bookmarkStart w:id="8" w:name="_Toc244271842"/>
       <w:r>
         <w:t>2.1  Review of Related Work</w:t>
       </w:r>
@@ -5403,7 +5406,7 @@
       <w:pPr>
         <w:pStyle w:val="Heading3"/>
       </w:pPr>
-      <w:bookmarkStart w:id="9" w:name="_Toc244271621"/>
+      <w:bookmarkStart w:id="9" w:name="_Toc244271843"/>
       <w:r>
         <w:t>2.1.1  Retrieval-Augmented Generation</w:t>
       </w:r>
@@ -5452,7 +5455,7 @@
       <w:pPr>
         <w:pStyle w:val="Heading3"/>
       </w:pPr>
-      <w:bookmarkStart w:id="10" w:name="_Toc244271622"/>
+      <w:bookmarkStart w:id="10" w:name="_Toc244271844"/>
       <w:r>
         <w:t>2.1.2  Sparse Retrieval and Hybrid Fusion</w:t>
       </w:r>
@@ -5492,7 +5495,7 @@
       <w:pPr>
         <w:pStyle w:val="Heading3"/>
       </w:pPr>
-      <w:bookmarkStart w:id="11" w:name="_Toc244271623"/>
+      <w:bookmarkStart w:id="11" w:name="_Toc244271845"/>
       <w:r>
         <w:lastRenderedPageBreak/>
         <w:t>2.1.3  Reranking and Diversity</w:t>
@@ -5514,7 +5517,7 @@
       <w:pPr>
         <w:pStyle w:val="Heading3"/>
       </w:pPr>
-      <w:bookmarkStart w:id="12" w:name="_Toc244271624"/>
+      <w:bookmarkStart w:id="12" w:name="_Toc244271846"/>
       <w:r>
         <w:t>2.1.4  Multilingual, Voice and Agricultural Assistants</w:t>
       </w:r>
@@ -5561,7 +5564,7 @@
       <w:pPr>
         <w:pStyle w:val="Heading3"/>
       </w:pPr>
-      <w:bookmarkStart w:id="13" w:name="_Toc244271625"/>
+      <w:bookmarkStart w:id="13" w:name="_Toc244271847"/>
       <w:r>
         <w:t>2.1.5  Evaluating Retrieval-Augmented Systems</w:t>
       </w:r>
@@ -5585,7 +5588,7 @@
       <w:pPr>
         <w:pStyle w:val="Heading2"/>
       </w:pPr>
-      <w:bookmarkStart w:id="14" w:name="_Toc244271626"/>
+      <w:bookmarkStart w:id="14" w:name="_Toc244271848"/>
       <w:r>
         <w:t>2.2  Summary Table</w:t>
       </w:r>
@@ -6193,7 +6196,7 @@
       <w:pPr>
         <w:pStyle w:val="Heading2"/>
       </w:pPr>
-      <w:bookmarkStart w:id="15" w:name="_Toc244271627"/>
+      <w:bookmarkStart w:id="15" w:name="_Toc244271849"/>
       <w:r>
         <w:t>2.3  Research Gap Identified</w:t>
       </w:r>
@@ -6242,7 +6245,7 @@
         <w:pStyle w:val="Heading1"/>
         <w:spacing w:before="0"/>
       </w:pPr>
-      <w:bookmarkStart w:id="16" w:name="_Toc244271628"/>
+      <w:bookmarkStart w:id="16" w:name="_Toc244271850"/>
       <w:r>
         <w:t>System Analysis and Requirements</w:t>
       </w:r>
@@ -6252,7 +6255,7 @@
       <w:pPr>
         <w:pStyle w:val="Heading2"/>
       </w:pPr>
-      <w:bookmarkStart w:id="17" w:name="_Toc244271629"/>
+      <w:bookmarkStart w:id="17" w:name="_Toc244271851"/>
       <w:r>
         <w:t>3.1  Existing Approaches and their Drawbacks</w:t>
       </w:r>
@@ -6287,7 +6290,7 @@
       <w:pPr>
         <w:pStyle w:val="Heading2"/>
       </w:pPr>
-      <w:bookmarkStart w:id="18" w:name="_Toc244271630"/>
+      <w:bookmarkStart w:id="18" w:name="_Toc244271852"/>
       <w:r>
         <w:t>3.2  Feasibility Study</w:t>
       </w:r>
@@ -6336,7 +6339,7 @@
       <w:pPr>
         <w:pStyle w:val="Heading2"/>
       </w:pPr>
-      <w:bookmarkStart w:id="19" w:name="_Toc244271631"/>
+      <w:bookmarkStart w:id="19" w:name="_Toc244271853"/>
       <w:r>
         <w:t>3.3  Hardware / Compute Used</w:t>
       </w:r>
@@ -6354,7 +6357,7 @@
       <w:pPr>
         <w:pStyle w:val="Heading2"/>
       </w:pPr>
-      <w:bookmarkStart w:id="20" w:name="_Toc244271632"/>
+      <w:bookmarkStart w:id="20" w:name="_Toc244271854"/>
       <w:r>
         <w:lastRenderedPageBreak/>
         <w:t>3.4  Software Requirements</w:t>
@@ -6968,7 +6971,7 @@
       <w:pPr>
         <w:pStyle w:val="Heading2"/>
       </w:pPr>
-      <w:bookmarkStart w:id="21" w:name="_Toc244271633"/>
+      <w:bookmarkStart w:id="21" w:name="_Toc244271855"/>
       <w:r>
         <w:t>3.5  Functional and Non-Functional Requirements</w:t>
       </w:r>
@@ -7026,7 +7029,7 @@
         <w:pStyle w:val="Heading1"/>
         <w:spacing w:before="0"/>
       </w:pPr>
-      <w:bookmarkStart w:id="22" w:name="_Toc244271634"/>
+      <w:bookmarkStart w:id="22" w:name="_Toc244271856"/>
       <w:r>
         <w:t>Methodology</w:t>
       </w:r>
@@ -7036,7 +7039,7 @@
       <w:pPr>
         <w:pStyle w:val="Heading2"/>
       </w:pPr>
-      <w:bookmarkStart w:id="23" w:name="_Toc244271635"/>
+      <w:bookmarkStart w:id="23" w:name="_Toc244271857"/>
       <w:r>
         <w:t>4.1  Overall Pipeline</w:t>
       </w:r>
@@ -7064,7 +7067,7 @@
           <w:noProof/>
         </w:rPr>
         <w:drawing>
-          <wp:inline distT="0" distB="0" distL="0" distR="0" wp14:anchorId="07E28E20" wp14:editId="197317A7">
+          <wp:inline distT="0" distB="0" distL="0" distR="0" wp14:anchorId="7F3A8246" wp14:editId="02A4A5E1">
             <wp:extent cx="5212080" cy="2325853"/>
             <wp:effectExtent l="0" t="0" r="0" b="0"/>
             <wp:docPr id="4" name="Picture 4"/>
@@ -7132,7 +7135,7 @@
         </w:rPr>
         <w:lastRenderedPageBreak/>
         <w:drawing>
-          <wp:inline distT="0" distB="0" distL="0" distR="0" wp14:anchorId="6F5F13B8" wp14:editId="2D846092">
+          <wp:inline distT="0" distB="0" distL="0" distR="0" wp14:anchorId="017C5254" wp14:editId="196F0CBA">
             <wp:extent cx="5212080" cy="2433364"/>
             <wp:effectExtent l="0" t="0" r="0" b="0"/>
             <wp:docPr id="5" name="Picture 5"/>
@@ -7184,7 +7187,7 @@
       <w:pPr>
         <w:pStyle w:val="Heading2"/>
       </w:pPr>
-      <w:bookmarkStart w:id="24" w:name="_Toc244271636"/>
+      <w:bookmarkStart w:id="24" w:name="_Toc244271858"/>
       <w:r>
         <w:t>4.2  Dataset: Knowledge Base</w:t>
       </w:r>
@@ -7684,7 +7687,7 @@
       <w:pPr>
         <w:pStyle w:val="Heading2"/>
       </w:pPr>
-      <w:bookmarkStart w:id="25" w:name="_Toc244271637"/>
+      <w:bookmarkStart w:id="25" w:name="_Toc244271859"/>
       <w:r>
         <w:t>4.3  Pre-processing and Chunking</w:t>
       </w:r>
@@ -7766,7 +7769,7 @@
       <w:pPr>
         <w:pStyle w:val="Heading2"/>
       </w:pPr>
-      <w:bookmarkStart w:id="26" w:name="_Toc244271638"/>
+      <w:bookmarkStart w:id="26" w:name="_Toc244271860"/>
       <w:r>
         <w:t>4.4  Train / Validation / Test Protocol</w:t>
       </w:r>
@@ -7799,7 +7802,7 @@
       <w:pPr>
         <w:pStyle w:val="Heading2"/>
       </w:pPr>
-      <w:bookmarkStart w:id="27" w:name="_Toc244271639"/>
+      <w:bookmarkStart w:id="27" w:name="_Toc244271861"/>
       <w:r>
         <w:t>4.5  System Architecture and Justification</w:t>
       </w:r>
@@ -7838,7 +7841,7 @@
       <w:pPr>
         <w:pStyle w:val="Heading2"/>
       </w:pPr>
-      <w:bookmarkStart w:id="28" w:name="_Toc244271640"/>
+      <w:bookmarkStart w:id="28" w:name="_Toc244271862"/>
       <w:r>
         <w:t>4.6  Retrieval and Ranking Methodology</w:t>
       </w:r>
@@ -7863,7 +7866,7 @@
           <w:noProof/>
         </w:rPr>
         <w:drawing>
-          <wp:inline distT="0" distB="0" distL="0" distR="0" wp14:anchorId="4A799C14" wp14:editId="36657958">
+          <wp:inline distT="0" distB="0" distL="0" distR="0" wp14:anchorId="54480C7C" wp14:editId="6B13E4B7">
             <wp:extent cx="4480560" cy="4063371"/>
             <wp:effectExtent l="0" t="0" r="0" b="0"/>
             <wp:docPr id="6" name="Picture 6"/>
@@ -8334,7 +8337,7 @@
       <w:pPr>
         <w:pStyle w:val="Heading2"/>
       </w:pPr>
-      <w:bookmarkStart w:id="29" w:name="_Toc244271641"/>
+      <w:bookmarkStart w:id="29" w:name="_Toc244271863"/>
       <w:r>
         <w:t>4.7  Objective-to-Methodology Mapping</w:t>
       </w:r>
@@ -8711,7 +8714,7 @@
       <w:pPr>
         <w:pStyle w:val="Heading2"/>
       </w:pPr>
-      <w:bookmarkStart w:id="30" w:name="_Toc244271642"/>
+      <w:bookmarkStart w:id="30" w:name="_Toc244271864"/>
       <w:r>
         <w:t>4.8  Baseline and Comparison Methods</w:t>
       </w:r>
@@ -8746,7 +8749,7 @@
         <w:pStyle w:val="Heading1"/>
         <w:spacing w:before="0"/>
       </w:pPr>
-      <w:bookmarkStart w:id="31" w:name="_Toc244271643"/>
+      <w:bookmarkStart w:id="31" w:name="_Toc244271865"/>
       <w:r>
         <w:t>Implementation</w:t>
       </w:r>
@@ -8756,7 +8759,7 @@
       <w:pPr>
         <w:pStyle w:val="Heading2"/>
       </w:pPr>
-      <w:bookmarkStart w:id="32" w:name="_Toc244271644"/>
+      <w:bookmarkStart w:id="32" w:name="_Toc244271866"/>
       <w:r>
         <w:t>5.1  System / Pipeline Configuration</w:t>
       </w:r>
@@ -9311,7 +9314,7 @@
       <w:pPr>
         <w:pStyle w:val="Heading2"/>
       </w:pPr>
-      <w:bookmarkStart w:id="33" w:name="_Toc244271645"/>
+      <w:bookmarkStart w:id="33" w:name="_Toc244271867"/>
       <w:r>
         <w:t>5.2  Development and Deployment Setup</w:t>
       </w:r>
@@ -9358,7 +9361,7 @@
       <w:pPr>
         <w:pStyle w:val="Heading2"/>
       </w:pPr>
-      <w:bookmarkStart w:id="34" w:name="_Toc244271646"/>
+      <w:bookmarkStart w:id="34" w:name="_Toc244271868"/>
       <w:r>
         <w:t>5.3  Key Code Snippets</w:t>
       </w:r>
@@ -9612,7 +9615,7 @@
       <w:pPr>
         <w:pStyle w:val="Heading2"/>
       </w:pPr>
-      <w:bookmarkStart w:id="35" w:name="_Toc244271647"/>
+      <w:bookmarkStart w:id="35" w:name="_Toc244271869"/>
       <w:r>
         <w:t>5.4  User Interface and Deployment</w:t>
       </w:r>
@@ -9648,7 +9651,7 @@
       <w:pPr>
         <w:pStyle w:val="Heading2"/>
       </w:pPr>
-      <w:bookmarkStart w:id="36" w:name="_Toc244271648"/>
+      <w:bookmarkStart w:id="36" w:name="_Toc244271870"/>
       <w:r>
         <w:t>5.5  Cloud Deployment and Provider Switching</w:t>
       </w:r>
@@ -9669,7 +9672,7 @@
       <w:pPr>
         <w:pStyle w:val="Heading2"/>
       </w:pPr>
-      <w:bookmarkStart w:id="37" w:name="_Toc244271649"/>
+      <w:bookmarkStart w:id="37" w:name="_Toc244271871"/>
       <w:r>
         <w:lastRenderedPageBreak/>
         <w:t>5.6  REST API</w:t>
@@ -10209,7 +10212,7 @@
       <w:pPr>
         <w:pStyle w:val="Heading2"/>
       </w:pPr>
-      <w:bookmarkStart w:id="38" w:name="_Toc244271650"/>
+      <w:bookmarkStart w:id="38" w:name="_Toc244271872"/>
       <w:r>
         <w:t>5.7  Testing and Validation</w:t>
       </w:r>
@@ -10247,7 +10250,7 @@
         <w:pStyle w:val="Heading1"/>
         <w:spacing w:before="0"/>
       </w:pPr>
-      <w:bookmarkStart w:id="39" w:name="_Toc244271651"/>
+      <w:bookmarkStart w:id="39" w:name="_Toc244271873"/>
       <w:r>
         <w:t>Results and Discussion</w:t>
       </w:r>
@@ -10257,7 +10260,7 @@
       <w:pPr>
         <w:pStyle w:val="Heading2"/>
       </w:pPr>
-      <w:bookmarkStart w:id="40" w:name="_Toc244271652"/>
+      <w:bookmarkStart w:id="40" w:name="_Toc244271874"/>
       <w:r>
         <w:t>6.1  Evaluation Metrics</w:t>
       </w:r>
@@ -10526,7 +10529,7 @@
       <w:pPr>
         <w:pStyle w:val="Heading2"/>
       </w:pPr>
-      <w:bookmarkStart w:id="41" w:name="_Toc244271653"/>
+      <w:bookmarkStart w:id="41" w:name="_Toc244271875"/>
       <w:r>
         <w:lastRenderedPageBreak/>
         <w:t>6.2  Retrieval Ablation (Measured)</w:t>
@@ -10857,7 +10860,7 @@
           <w:noProof/>
         </w:rPr>
         <w:drawing>
-          <wp:inline distT="0" distB="0" distL="0" distR="0" wp14:anchorId="6DECE2C8" wp14:editId="33C50D3D">
+          <wp:inline distT="0" distB="0" distL="0" distR="0" wp14:anchorId="753A3391" wp14:editId="54D941E1">
             <wp:extent cx="5120640" cy="2733990"/>
             <wp:effectExtent l="0" t="0" r="0" b="0"/>
             <wp:docPr id="7" name="Picture 7"/>
@@ -10909,7 +10912,7 @@
       <w:pPr>
         <w:pStyle w:val="Heading2"/>
       </w:pPr>
-      <w:bookmarkStart w:id="42" w:name="_Toc244271654"/>
+      <w:bookmarkStart w:id="42" w:name="_Toc244271876"/>
       <w:r>
         <w:t>6.3  Generation and Latency (Measured)</w:t>
       </w:r>
@@ -11185,7 +11188,7 @@
           <w:noProof/>
         </w:rPr>
         <w:drawing>
-          <wp:inline distT="0" distB="0" distL="0" distR="0" wp14:anchorId="2999BD4B" wp14:editId="09FFC1D0">
+          <wp:inline distT="0" distB="0" distL="0" distR="0" wp14:anchorId="2DC1267D" wp14:editId="65EE4367">
             <wp:extent cx="4206240" cy="2514544"/>
             <wp:effectExtent l="0" t="0" r="0" b="0"/>
             <wp:docPr id="8" name="Picture 8"/>
@@ -11253,7 +11256,7 @@
         </w:rPr>
         <w:lastRenderedPageBreak/>
         <w:drawing>
-          <wp:inline distT="0" distB="0" distL="0" distR="0" wp14:anchorId="33BAFAB1" wp14:editId="27301FA2">
+          <wp:inline distT="0" distB="0" distL="0" distR="0" wp14:anchorId="009CB6E4" wp14:editId="1720EE98">
             <wp:extent cx="4572000" cy="2658204"/>
             <wp:effectExtent l="0" t="0" r="0" b="0"/>
             <wp:docPr id="9" name="Picture 9"/>
@@ -11305,7 +11308,7 @@
       <w:pPr>
         <w:pStyle w:val="Heading2"/>
       </w:pPr>
-      <w:bookmarkStart w:id="43" w:name="_Toc244271655"/>
+      <w:bookmarkStart w:id="43" w:name="_Toc244271877"/>
       <w:r>
         <w:t>6.4  Comparison with Baselines and Published Work</w:t>
       </w:r>
@@ -11352,7 +11355,7 @@
       <w:pPr>
         <w:pStyle w:val="Heading2"/>
       </w:pPr>
-      <w:bookmarkStart w:id="44" w:name="_Toc244271656"/>
+      <w:bookmarkStart w:id="44" w:name="_Toc244271878"/>
       <w:r>
         <w:t>6.5  Error Analysis</w:t>
       </w:r>
@@ -11373,7 +11376,7 @@
       <w:pPr>
         <w:pStyle w:val="Heading2"/>
       </w:pPr>
-      <w:bookmarkStart w:id="45" w:name="_Toc244271657"/>
+      <w:bookmarkStart w:id="45" w:name="_Toc244271879"/>
       <w:r>
         <w:t>6.6  Ablation Summary</w:t>
       </w:r>
@@ -11391,7 +11394,7 @@
       <w:pPr>
         <w:pStyle w:val="Heading2"/>
       </w:pPr>
-      <w:bookmarkStart w:id="46" w:name="_Toc244271658"/>
+      <w:bookmarkStart w:id="46" w:name="_Toc244271880"/>
       <w:r>
         <w:t>6.7  Output of the Working System</w:t>
       </w:r>
@@ -11431,7 +11434,7 @@
           <w:noProof/>
         </w:rPr>
         <w:drawing>
-          <wp:inline distT="0" distB="0" distL="0" distR="0" wp14:anchorId="7C3A60B1" wp14:editId="669C5425">
+          <wp:inline distT="0" distB="0" distL="0" distR="0" wp14:anchorId="656E05AC" wp14:editId="48DC95A0">
             <wp:extent cx="5577840" cy="3485786"/>
             <wp:effectExtent l="0" t="0" r="0" b="0"/>
             <wp:docPr id="10" name="Picture 10"/>
@@ -11491,7 +11494,7 @@
         </w:rPr>
         <w:lastRenderedPageBreak/>
         <w:drawing>
-          <wp:inline distT="0" distB="0" distL="0" distR="0" wp14:anchorId="1654F45F" wp14:editId="542FADB0">
+          <wp:inline distT="0" distB="0" distL="0" distR="0" wp14:anchorId="51650021" wp14:editId="2AC2C622">
             <wp:extent cx="5577840" cy="2062957"/>
             <wp:effectExtent l="0" t="0" r="0" b="0"/>
             <wp:docPr id="11" name="Picture 11"/>
@@ -11550,7 +11553,7 @@
           <w:noProof/>
         </w:rPr>
         <w:drawing>
-          <wp:inline distT="0" distB="0" distL="0" distR="0" wp14:anchorId="44271639" wp14:editId="2A8C6804">
+          <wp:inline distT="0" distB="0" distL="0" distR="0" wp14:anchorId="0D37DF85" wp14:editId="3386AAA3">
             <wp:extent cx="5577840" cy="3023149"/>
             <wp:effectExtent l="0" t="0" r="0" b="0"/>
             <wp:docPr id="12" name="Picture 12"/>
@@ -11602,7 +11605,7 @@
       <w:pPr>
         <w:pStyle w:val="Heading2"/>
       </w:pPr>
-      <w:bookmarkStart w:id="47" w:name="_Toc244271659"/>
+      <w:bookmarkStart w:id="47" w:name="_Toc244271881"/>
       <w:r>
         <w:t>6.8  Ethical and Responsible AI Considerations</w:t>
       </w:r>
@@ -11655,7 +11658,7 @@
         <w:pStyle w:val="Heading1"/>
         <w:spacing w:before="0"/>
       </w:pPr>
-      <w:bookmarkStart w:id="48" w:name="_Toc244271660"/>
+      <w:bookmarkStart w:id="48" w:name="_Toc244271882"/>
       <w:r>
         <w:t>Conclusion and Future Scope</w:t>
       </w:r>
@@ -11665,7 +11668,7 @@
       <w:pPr>
         <w:pStyle w:val="Heading2"/>
       </w:pPr>
-      <w:bookmarkStart w:id="49" w:name="_Toc244271661"/>
+      <w:bookmarkStart w:id="49" w:name="_Toc244271883"/>
       <w:r>
         <w:t>7.1  Conclusion</w:t>
       </w:r>
@@ -11697,7 +11700,7 @@
       <w:pPr>
         <w:pStyle w:val="Heading2"/>
       </w:pPr>
-      <w:bookmarkStart w:id="50" w:name="_Toc244271662"/>
+      <w:bookmarkStart w:id="50" w:name="_Toc244271884"/>
       <w:r>
         <w:t>7.2  Limitations</w:t>
       </w:r>
@@ -11719,7 +11722,7 @@
       <w:pPr>
         <w:pStyle w:val="Heading2"/>
       </w:pPr>
-      <w:bookmarkStart w:id="51" w:name="_Toc244271663"/>
+      <w:bookmarkStart w:id="51" w:name="_Toc244271885"/>
       <w:r>
         <w:t>7.3  Future Enhancements</w:t>
       </w:r>
@@ -11744,7 +11747,7 @@
         <w:pStyle w:val="Heading1"/>
         <w:pageBreakBefore/>
       </w:pPr>
-      <w:bookmarkStart w:id="52" w:name="_Toc244271664"/>
+      <w:bookmarkStart w:id="52" w:name="_Toc244271886"/>
       <w:r>
         <w:lastRenderedPageBreak/>
         <w:t>References</w:t>
@@ -11977,7 +11980,7 @@
         <w:pStyle w:val="Heading1"/>
         <w:pageBreakBefore/>
       </w:pPr>
-      <w:bookmarkStart w:id="53" w:name="_Toc244271665"/>
+      <w:bookmarkStart w:id="53" w:name="_Toc244271887"/>
       <w:r>
         <w:lastRenderedPageBreak/>
         <w:t>Appendices</w:t>
@@ -11988,7 +11991,7 @@
       <w:pPr>
         <w:pStyle w:val="Heading2"/>
       </w:pPr>
-      <w:bookmarkStart w:id="54" w:name="_Toc244271666"/>
+      <w:bookmarkStart w:id="54" w:name="_Toc244271888"/>
       <w:r>
         <w:t>Appendix A  GitHub Repository and README</w:t>
       </w:r>
@@ -12022,7 +12025,7 @@
       <w:pPr>
         <w:pStyle w:val="Heading2"/>
       </w:pPr>
-      <w:bookmarkStart w:id="55" w:name="_Toc244271667"/>
+      <w:bookmarkStart w:id="55" w:name="_Toc244271889"/>
       <w:r>
         <w:t>Appendix B  Models and Indices</w:t>
       </w:r>
@@ -12043,7 +12046,7 @@
       <w:pPr>
         <w:pStyle w:val="Heading2"/>
       </w:pPr>
-      <w:bookmarkStart w:id="56" w:name="_Toc244271668"/>
+      <w:bookmarkStart w:id="56" w:name="_Toc244271890"/>
       <w:r>
         <w:t>Appendix C  Key Commands to Reproduce</w:t>
       </w:r>
@@ -12145,7 +12148,7 @@
       <w:pPr>
         <w:pStyle w:val="Heading2"/>
       </w:pPr>
-      <w:bookmarkStart w:id="57" w:name="_Toc244271669"/>
+      <w:bookmarkStart w:id="57" w:name="_Toc244271891"/>
       <w:r>
         <w:lastRenderedPageBreak/>
         <w:t>Appendix D  Plagiarism Report</w:t>
@@ -12164,7 +12167,7 @@
       <w:pPr>
         <w:pStyle w:val="Heading2"/>
       </w:pPr>
-      <w:bookmarkStart w:id="58" w:name="_Toc244271670"/>
+      <w:bookmarkStart w:id="58" w:name="_Toc244271892"/>
       <w:r>
         <w:t>Appendix E  Publications / Associated Work</w:t>
       </w:r>
@@ -12507,31 +12510,31 @@
       </w:rPr>
     </w:lvl>
   </w:abstractNum>
-  <w:num w:numId="1" w16cid:durableId="1945914174">
+  <w:num w:numId="1" w16cid:durableId="891621655">
     <w:abstractNumId w:val="8"/>
   </w:num>
-  <w:num w:numId="2" w16cid:durableId="1449542502">
+  <w:num w:numId="2" w16cid:durableId="805395902">
     <w:abstractNumId w:val="6"/>
   </w:num>
-  <w:num w:numId="3" w16cid:durableId="866677247">
+  <w:num w:numId="3" w16cid:durableId="1745032451">
     <w:abstractNumId w:val="5"/>
   </w:num>
-  <w:num w:numId="4" w16cid:durableId="854879252">
+  <w:num w:numId="4" w16cid:durableId="848645432">
     <w:abstractNumId w:val="4"/>
   </w:num>
-  <w:num w:numId="5" w16cid:durableId="1394085344">
+  <w:num w:numId="5" w16cid:durableId="1111704651">
     <w:abstractNumId w:val="7"/>
   </w:num>
-  <w:num w:numId="6" w16cid:durableId="1889762840">
+  <w:num w:numId="6" w16cid:durableId="577136436">
     <w:abstractNumId w:val="3"/>
   </w:num>
-  <w:num w:numId="7" w16cid:durableId="330642375">
+  <w:num w:numId="7" w16cid:durableId="2028478097">
     <w:abstractNumId w:val="2"/>
   </w:num>
-  <w:num w:numId="8" w16cid:durableId="220988837">
+  <w:num w:numId="8" w16cid:durableId="1083643302">
     <w:abstractNumId w:val="1"/>
   </w:num>
-  <w:num w:numId="9" w16cid:durableId="2001151066">
+  <w:num w:numId="9" w16cid:durableId="1095831787">
     <w:abstractNumId w:val="0"/>
   </w:num>
 </w:numbering>
@@ -23965,7 +23968,7 @@
     <w:autoRedefine/>
     <w:uiPriority w:val="39"/>
     <w:unhideWhenUsed/>
-    <w:rsid w:val="007C15AB"/>
+    <w:rsid w:val="000124BD"/>
     <w:pPr>
       <w:spacing w:after="100"/>
     </w:pPr>
@@ -23977,7 +23980,7 @@
     <w:autoRedefine/>
     <w:uiPriority w:val="39"/>
     <w:unhideWhenUsed/>
-    <w:rsid w:val="007C15AB"/>
+    <w:rsid w:val="000124BD"/>
     <w:pPr>
       <w:spacing w:after="100"/>
       <w:ind w:left="240"/>
@@ -23990,7 +23993,7 @@
     <w:autoRedefine/>
     <w:uiPriority w:val="39"/>
     <w:unhideWhenUsed/>
-    <w:rsid w:val="007C15AB"/>
+    <w:rsid w:val="000124BD"/>
     <w:pPr>
       <w:spacing w:after="100"/>
       <w:ind w:left="480"/>
@@ -24001,7 +24004,7 @@
     <w:basedOn w:val="DefaultParagraphFont"/>
     <w:uiPriority w:val="99"/>
     <w:unhideWhenUsed/>
-    <w:rsid w:val="007C15AB"/>
+    <w:rsid w:val="000124BD"/>
     <w:rPr>
       <w:color w:val="0000FF" w:themeColor="hyperlink"/>
       <w:u w:val="single"/>

</xml_diff>